<commit_message>
feat: add flexible answer scales (per-question options) and integrate Y-BOCS
</commit_message>
<xml_diff>
--- a/SESSION.md.docx
+++ b/SESSION.md.docx
@@ -244,7 +244,7 @@
           <w14:ligatures w14:val="none"/>
         </w:rPr>
         <w:pict w14:anchorId="65E49F3C">
-          <v:rect id="_x0000_i1059" style="width:0;height:1.5pt" o:hralign="center" o:hrstd="t" o:hr="t" fillcolor="#a0a0a0" stroked="f"/>
+          <v:rect id="_x0000_i1025" style="width:0;height:1.5pt" o:hralign="center" o:hrstd="t" o:hr="t" fillcolor="#a0a0a0" stroked="f"/>
         </w:pict>
       </w:r>
     </w:p>
@@ -650,7 +650,7 @@
           <w14:ligatures w14:val="none"/>
         </w:rPr>
         <w:pict w14:anchorId="0EBDB9E2">
-          <v:rect id="_x0000_i1060" style="width:0;height:1.5pt" o:hralign="center" o:hrstd="t" o:hr="t" fillcolor="#a0a0a0" stroked="f"/>
+          <v:rect id="_x0000_i1026" style="width:0;height:1.5pt" o:hralign="center" o:hrstd="t" o:hr="t" fillcolor="#a0a0a0" stroked="f"/>
         </w:pict>
       </w:r>
     </w:p>
@@ -1060,7 +1060,7 @@
         </w:rPr>
         <w:lastRenderedPageBreak/>
         <w:pict w14:anchorId="1F90DAF6">
-          <v:rect id="_x0000_i1061" style="width:0;height:1.5pt" o:hralign="center" o:hrstd="t" o:hr="t" fillcolor="#a0a0a0" stroked="f"/>
+          <v:rect id="_x0000_i1027" style="width:0;height:1.5pt" o:hralign="center" o:hrstd="t" o:hr="t" fillcolor="#a0a0a0" stroked="f"/>
         </w:pict>
       </w:r>
     </w:p>
@@ -1555,7 +1555,7 @@
           <w14:ligatures w14:val="none"/>
         </w:rPr>
         <w:pict w14:anchorId="132CCA44">
-          <v:rect id="_x0000_i1062" style="width:0;height:1.5pt" o:hralign="center" o:hrstd="t" o:hr="t" fillcolor="#a0a0a0" stroked="f"/>
+          <v:rect id="_x0000_i1028" style="width:0;height:1.5pt" o:hralign="center" o:hrstd="t" o:hr="t" fillcolor="#a0a0a0" stroked="f"/>
         </w:pict>
       </w:r>
     </w:p>
@@ -2073,7 +2073,7 @@
         </w:rPr>
         <w:lastRenderedPageBreak/>
         <w:pict w14:anchorId="38583D57">
-          <v:rect id="_x0000_i1063" style="width:0;height:1.5pt" o:hralign="center" o:hrstd="t" o:hr="t" fillcolor="#a0a0a0" stroked="f"/>
+          <v:rect id="_x0000_i1029" style="width:0;height:1.5pt" o:hralign="center" o:hrstd="t" o:hr="t" fillcolor="#a0a0a0" stroked="f"/>
         </w:pict>
       </w:r>
     </w:p>
@@ -2365,7 +2365,7 @@
           <w14:ligatures w14:val="none"/>
         </w:rPr>
         <w:pict w14:anchorId="2C35F3A5">
-          <v:rect id="_x0000_i1064" style="width:0;height:1.5pt" o:hralign="center" o:hrstd="t" o:hr="t" fillcolor="#a0a0a0" stroked="f"/>
+          <v:rect id="_x0000_i1030" style="width:0;height:1.5pt" o:hralign="center" o:hrstd="t" o:hr="t" fillcolor="#a0a0a0" stroked="f"/>
         </w:pict>
       </w:r>
     </w:p>
@@ -2636,7 +2636,7 @@
           <w14:ligatures w14:val="none"/>
         </w:rPr>
         <w:pict w14:anchorId="2CD0CDE5">
-          <v:rect id="_x0000_i1065" style="width:0;height:1.5pt" o:hralign="center" o:hrstd="t" o:hr="t" fillcolor="#a0a0a0" stroked="f"/>
+          <v:rect id="_x0000_i1031" style="width:0;height:1.5pt" o:hralign="center" o:hrstd="t" o:hr="t" fillcolor="#a0a0a0" stroked="f"/>
         </w:pict>
       </w:r>
     </w:p>
@@ -2832,7 +2832,7 @@
           <w14:ligatures w14:val="none"/>
         </w:rPr>
         <w:pict w14:anchorId="61779292">
-          <v:rect id="_x0000_i1066" style="width:0;height:1.5pt" o:hralign="center" o:hrstd="t" o:hr="t" fillcolor="#a0a0a0" stroked="f"/>
+          <v:rect id="_x0000_i1032" style="width:0;height:1.5pt" o:hralign="center" o:hrstd="t" o:hr="t" fillcolor="#a0a0a0" stroked="f"/>
         </w:pict>
       </w:r>
     </w:p>
@@ -3116,7 +3116,7 @@
           <w14:ligatures w14:val="none"/>
         </w:rPr>
         <w:pict w14:anchorId="433ED6B6">
-          <v:rect id="_x0000_i1067" style="width:0;height:1.5pt" o:hralign="center" o:hrstd="t" o:hr="t" fillcolor="#a0a0a0" stroked="f"/>
+          <v:rect id="_x0000_i1033" style="width:0;height:1.5pt" o:hralign="center" o:hrstd="t" o:hr="t" fillcolor="#a0a0a0" stroked="f"/>
         </w:pict>
       </w:r>
     </w:p>
@@ -3353,7 +3353,7 @@
           <w14:ligatures w14:val="none"/>
         </w:rPr>
         <w:pict w14:anchorId="5CBFDEA1">
-          <v:rect id="_x0000_i1068" style="width:0;height:1.5pt" o:hralign="center" o:hrstd="t" o:hr="t" fillcolor="#a0a0a0" stroked="f"/>
+          <v:rect id="_x0000_i1034" style="width:0;height:1.5pt" o:hralign="center" o:hrstd="t" o:hr="t" fillcolor="#a0a0a0" stroked="f"/>
         </w:pict>
       </w:r>
     </w:p>
@@ -3698,7 +3698,7 @@
           <w14:ligatures w14:val="none"/>
         </w:rPr>
         <w:pict w14:anchorId="47CCB083">
-          <v:rect id="_x0000_i1069" style="width:0;height:1.5pt" o:hralign="center" o:hrstd="t" o:hr="t" fillcolor="#a0a0a0" stroked="f"/>
+          <v:rect id="_x0000_i1035" style="width:0;height:1.5pt" o:hralign="center" o:hrstd="t" o:hr="t" fillcolor="#a0a0a0" stroked="f"/>
         </w:pict>
       </w:r>
     </w:p>
@@ -3934,7 +3934,7 @@
           <w14:ligatures w14:val="none"/>
         </w:rPr>
         <w:pict w14:anchorId="129C6C42">
-          <v:rect id="_x0000_i1070" style="width:0;height:1.5pt" o:hralign="center" o:hrstd="t" o:hr="t" fillcolor="#a0a0a0" stroked="f"/>
+          <v:rect id="_x0000_i1036" style="width:0;height:1.5pt" o:hralign="center" o:hrstd="t" o:hr="t" fillcolor="#a0a0a0" stroked="f"/>
         </w:pict>
       </w:r>
     </w:p>
@@ -4405,7 +4405,7 @@
           <w14:ligatures w14:val="none"/>
         </w:rPr>
         <w:pict w14:anchorId="15F1CB37">
-          <v:rect id="_x0000_i1071" style="width:0;height:1.5pt" o:hralign="center" o:hrstd="t" o:hr="t" fillcolor="#a0a0a0" stroked="f"/>
+          <v:rect id="_x0000_i1037" style="width:0;height:1.5pt" o:hralign="center" o:hrstd="t" o:hr="t" fillcolor="#a0a0a0" stroked="f"/>
         </w:pict>
       </w:r>
     </w:p>
@@ -4554,10 +4554,1727 @@
     </w:p>
     <w:p>
       <w:pPr>
+        <w:spacing w:before="100" w:beforeAutospacing="1" w:after="100" w:afterAutospacing="1" w:line="240" w:lineRule="auto"/>
+        <w:rPr>
+          <w:rFonts w:ascii="Times New Roman" w:eastAsia="Times New Roman" w:hAnsi="Times New Roman" w:cs="Times New Roman"/>
+          <w:kern w:val="0"/>
+          <w:sz w:val="24"/>
+          <w:szCs w:val="24"/>
+          <w:lang w:val="en-GB" w:eastAsia="en-GB"/>
+          <w14:ligatures w14:val="none"/>
+        </w:rPr>
+      </w:pPr>
+    </w:p>
+    <w:p>
+      <w:pPr>
+        <w:spacing w:before="100" w:beforeAutospacing="1" w:after="100" w:afterAutospacing="1" w:line="240" w:lineRule="auto"/>
+        <w:rPr>
+          <w:rFonts w:ascii="Times New Roman" w:eastAsia="Times New Roman" w:hAnsi="Times New Roman" w:cs="Times New Roman"/>
+          <w:b/>
+          <w:bCs/>
+          <w:kern w:val="0"/>
+          <w:sz w:val="24"/>
+          <w:szCs w:val="24"/>
+          <w:lang w:val="en-GB" w:eastAsia="en-GB"/>
+          <w14:ligatures w14:val="none"/>
+        </w:rPr>
+      </w:pPr>
+      <w:r>
+        <w:rPr>
+          <w:rFonts w:ascii="Segoe UI Emoji" w:eastAsia="Times New Roman" w:hAnsi="Segoe UI Emoji" w:cs="Segoe UI Emoji"/>
+          <w:b/>
+          <w:bCs/>
+          <w:kern w:val="0"/>
+          <w:sz w:val="24"/>
+          <w:szCs w:val="24"/>
+          <w:lang w:val="en-GB" w:eastAsia="en-GB"/>
+          <w14:ligatures w14:val="none"/>
+        </w:rPr>
+        <w:t>🧠</w:t>
+      </w:r>
+      <w:r>
+        <w:rPr>
+          <w:rFonts w:ascii="Times New Roman" w:eastAsia="Times New Roman" w:hAnsi="Times New Roman" w:cs="Times New Roman"/>
+          <w:b/>
+          <w:bCs/>
+          <w:kern w:val="0"/>
+          <w:sz w:val="24"/>
+          <w:szCs w:val="24"/>
+          <w:lang w:val="en-GB" w:eastAsia="en-GB"/>
+          <w14:ligatures w14:val="none"/>
+        </w:rPr>
+        <w:t xml:space="preserve"> feat: add support for mean aggregation and custom result descriptions</w:t>
+      </w:r>
+    </w:p>
+    <w:p>
+      <w:pPr>
+        <w:numPr>
+          <w:ilvl w:val="0"/>
+          <w:numId w:val="36"/>
+        </w:numPr>
+        <w:spacing w:before="100" w:beforeAutospacing="1" w:after="100" w:afterAutospacing="1" w:line="240" w:lineRule="auto"/>
+        <w:rPr>
+          <w:rFonts w:ascii="Times New Roman" w:eastAsia="Times New Roman" w:hAnsi="Times New Roman" w:cs="Times New Roman"/>
+          <w:kern w:val="0"/>
+          <w:sz w:val="24"/>
+          <w:szCs w:val="24"/>
+          <w:lang w:val="en-GB" w:eastAsia="en-GB"/>
+          <w14:ligatures w14:val="none"/>
+        </w:rPr>
+      </w:pPr>
+      <w:r>
+        <w:rPr>
+          <w:rFonts w:ascii="Times New Roman" w:eastAsia="Times New Roman" w:hAnsi="Times New Roman" w:cs="Times New Roman"/>
+          <w:kern w:val="0"/>
+          <w:sz w:val="24"/>
+          <w:szCs w:val="24"/>
+          <w:lang w:val="en-GB" w:eastAsia="en-GB"/>
+          <w14:ligatures w14:val="none"/>
+        </w:rPr>
+        <w:t xml:space="preserve">add support for </w:t>
+      </w:r>
+      <w:r>
+        <w:rPr>
+          <w:rFonts w:ascii="Times New Roman" w:eastAsia="Times New Roman" w:hAnsi="Times New Roman" w:cs="Times New Roman"/>
+          <w:b/>
+          <w:bCs/>
+          <w:kern w:val="0"/>
+          <w:sz w:val="24"/>
+          <w:szCs w:val="24"/>
+          <w:lang w:val="en-GB" w:eastAsia="en-GB"/>
+          <w14:ligatures w14:val="none"/>
+        </w:rPr>
+        <w:t>aggregation: "mean"</w:t>
+      </w:r>
+      <w:r>
+        <w:rPr>
+          <w:rFonts w:ascii="Times New Roman" w:eastAsia="Times New Roman" w:hAnsi="Times New Roman" w:cs="Times New Roman"/>
+          <w:kern w:val="0"/>
+          <w:sz w:val="24"/>
+          <w:szCs w:val="24"/>
+          <w:lang w:val="en-GB" w:eastAsia="en-GB"/>
+          <w14:ligatures w14:val="none"/>
+        </w:rPr>
+        <w:t xml:space="preserve"> in subscales (UGDS-GS compatible) </w:t>
+      </w:r>
+    </w:p>
+    <w:p>
+      <w:pPr>
+        <w:numPr>
+          <w:ilvl w:val="0"/>
+          <w:numId w:val="36"/>
+        </w:numPr>
+        <w:spacing w:before="100" w:beforeAutospacing="1" w:after="100" w:afterAutospacing="1" w:line="240" w:lineRule="auto"/>
+        <w:rPr>
+          <w:rFonts w:ascii="Times New Roman" w:eastAsia="Times New Roman" w:hAnsi="Times New Roman" w:cs="Times New Roman"/>
+          <w:kern w:val="0"/>
+          <w:sz w:val="24"/>
+          <w:szCs w:val="24"/>
+          <w:lang w:val="en-GB" w:eastAsia="en-GB"/>
+          <w14:ligatures w14:val="none"/>
+        </w:rPr>
+      </w:pPr>
+      <w:r>
+        <w:rPr>
+          <w:rFonts w:ascii="Times New Roman" w:eastAsia="Times New Roman" w:hAnsi="Times New Roman" w:cs="Times New Roman"/>
+          <w:kern w:val="0"/>
+          <w:sz w:val="24"/>
+          <w:szCs w:val="24"/>
+          <w:lang w:val="en-GB" w:eastAsia="en-GB"/>
+          <w14:ligatures w14:val="none"/>
+        </w:rPr>
+        <w:t xml:space="preserve">update scoring logic to handle both </w:t>
+      </w:r>
+      <w:r>
+        <w:rPr>
+          <w:rFonts w:ascii="Times New Roman" w:eastAsia="Times New Roman" w:hAnsi="Times New Roman" w:cs="Times New Roman"/>
+          <w:b/>
+          <w:bCs/>
+          <w:kern w:val="0"/>
+          <w:sz w:val="24"/>
+          <w:szCs w:val="24"/>
+          <w:lang w:val="en-GB" w:eastAsia="en-GB"/>
+          <w14:ligatures w14:val="none"/>
+        </w:rPr>
+        <w:t>sum and mean aggregation</w:t>
+      </w:r>
+      <w:r>
+        <w:rPr>
+          <w:rFonts w:ascii="Times New Roman" w:eastAsia="Times New Roman" w:hAnsi="Times New Roman" w:cs="Times New Roman"/>
+          <w:kern w:val="0"/>
+          <w:sz w:val="24"/>
+          <w:szCs w:val="24"/>
+          <w:lang w:val="en-GB" w:eastAsia="en-GB"/>
+          <w14:ligatures w14:val="none"/>
+        </w:rPr>
+        <w:t xml:space="preserve"> </w:t>
+      </w:r>
+    </w:p>
+    <w:p>
+      <w:pPr>
+        <w:numPr>
+          <w:ilvl w:val="0"/>
+          <w:numId w:val="36"/>
+        </w:numPr>
+        <w:spacing w:before="100" w:beforeAutospacing="1" w:after="100" w:afterAutospacing="1" w:line="240" w:lineRule="auto"/>
+        <w:rPr>
+          <w:rFonts w:ascii="Times New Roman" w:eastAsia="Times New Roman" w:hAnsi="Times New Roman" w:cs="Times New Roman"/>
+          <w:kern w:val="0"/>
+          <w:sz w:val="24"/>
+          <w:szCs w:val="24"/>
+          <w:lang w:val="en-GB" w:eastAsia="en-GB"/>
+          <w14:ligatures w14:val="none"/>
+        </w:rPr>
+      </w:pPr>
+      <w:r>
+        <w:rPr>
+          <w:rFonts w:ascii="Times New Roman" w:eastAsia="Times New Roman" w:hAnsi="Times New Roman" w:cs="Times New Roman"/>
+          <w:kern w:val="0"/>
+          <w:sz w:val="24"/>
+          <w:szCs w:val="24"/>
+          <w:lang w:val="en-GB" w:eastAsia="en-GB"/>
+          <w14:ligatures w14:val="none"/>
+        </w:rPr>
+        <w:t xml:space="preserve">normalize percent calculation for mean-based subscales </w:t>
+      </w:r>
+    </w:p>
+    <w:p>
+      <w:pPr>
+        <w:spacing w:before="100" w:beforeAutospacing="1" w:after="100" w:afterAutospacing="1" w:line="240" w:lineRule="auto"/>
+        <w:rPr>
+          <w:rFonts w:ascii="Times New Roman" w:eastAsia="Times New Roman" w:hAnsi="Times New Roman" w:cs="Times New Roman"/>
+          <w:kern w:val="0"/>
+          <w:sz w:val="24"/>
+          <w:szCs w:val="24"/>
+          <w:lang w:val="en-GB" w:eastAsia="en-GB"/>
+          <w14:ligatures w14:val="none"/>
+        </w:rPr>
+      </w:pPr>
+      <w:r>
+        <w:rPr>
+          <w:rFonts w:ascii="Times New Roman" w:eastAsia="Times New Roman" w:hAnsi="Times New Roman" w:cs="Times New Roman"/>
+          <w:kern w:val="0"/>
+          <w:sz w:val="24"/>
+          <w:szCs w:val="24"/>
+          <w:lang w:val="en-GB" w:eastAsia="en-GB"/>
+          <w14:ligatures w14:val="none"/>
+        </w:rPr>
+        <w:pict w14:anchorId="3D314066">
+          <v:rect id="_x0000_i1038" style="width:0;height:1.5pt" o:hralign="center" o:hrstd="t" o:hr="t" fillcolor="#a0a0a0" stroked="f"/>
+        </w:pict>
+      </w:r>
+    </w:p>
+    <w:p>
+      <w:pPr>
+        <w:spacing w:before="100" w:beforeAutospacing="1" w:after="100" w:afterAutospacing="1" w:line="240" w:lineRule="auto"/>
+        <w:rPr>
+          <w:rFonts w:ascii="Times New Roman" w:eastAsia="Times New Roman" w:hAnsi="Times New Roman" w:cs="Times New Roman"/>
+          <w:b/>
+          <w:bCs/>
+          <w:kern w:val="0"/>
+          <w:sz w:val="24"/>
+          <w:szCs w:val="24"/>
+          <w:lang w:val="en-GB" w:eastAsia="en-GB"/>
+          <w14:ligatures w14:val="none"/>
+        </w:rPr>
+      </w:pPr>
+      <w:r>
+        <w:rPr>
+          <w:rFonts w:ascii="Segoe UI Emoji" w:eastAsia="Times New Roman" w:hAnsi="Segoe UI Emoji" w:cs="Segoe UI Emoji"/>
+          <w:b/>
+          <w:bCs/>
+          <w:kern w:val="0"/>
+          <w:sz w:val="24"/>
+          <w:szCs w:val="24"/>
+          <w:lang w:val="en-GB" w:eastAsia="en-GB"/>
+          <w14:ligatures w14:val="none"/>
+        </w:rPr>
+        <w:t>📊</w:t>
+      </w:r>
+      <w:r>
+        <w:rPr>
+          <w:rFonts w:ascii="Times New Roman" w:eastAsia="Times New Roman" w:hAnsi="Times New Roman" w:cs="Times New Roman"/>
+          <w:b/>
+          <w:bCs/>
+          <w:kern w:val="0"/>
+          <w:sz w:val="24"/>
+          <w:szCs w:val="24"/>
+          <w:lang w:val="en-GB" w:eastAsia="en-GB"/>
+          <w14:ligatures w14:val="none"/>
+        </w:rPr>
+        <w:t xml:space="preserve"> results &amp; interpretation</w:t>
+      </w:r>
+    </w:p>
+    <w:p>
+      <w:pPr>
+        <w:numPr>
+          <w:ilvl w:val="0"/>
+          <w:numId w:val="37"/>
+        </w:numPr>
+        <w:spacing w:before="100" w:beforeAutospacing="1" w:after="100" w:afterAutospacing="1" w:line="240" w:lineRule="auto"/>
+        <w:rPr>
+          <w:rFonts w:ascii="Times New Roman" w:eastAsia="Times New Roman" w:hAnsi="Times New Roman" w:cs="Times New Roman"/>
+          <w:kern w:val="0"/>
+          <w:sz w:val="24"/>
+          <w:szCs w:val="24"/>
+          <w:lang w:val="en-GB" w:eastAsia="en-GB"/>
+          <w14:ligatures w14:val="none"/>
+        </w:rPr>
+      </w:pPr>
+      <w:r>
+        <w:rPr>
+          <w:rFonts w:ascii="Times New Roman" w:eastAsia="Times New Roman" w:hAnsi="Times New Roman" w:cs="Times New Roman"/>
+          <w:kern w:val="0"/>
+          <w:sz w:val="24"/>
+          <w:szCs w:val="24"/>
+          <w:lang w:val="en-GB" w:eastAsia="en-GB"/>
+          <w14:ligatures w14:val="none"/>
+        </w:rPr>
+        <w:t xml:space="preserve">introduce </w:t>
+      </w:r>
+      <w:proofErr w:type="spellStart"/>
+      <w:r>
+        <w:rPr>
+          <w:rFonts w:ascii="Times New Roman" w:eastAsia="Times New Roman" w:hAnsi="Times New Roman" w:cs="Times New Roman"/>
+          <w:kern w:val="0"/>
+          <w:sz w:val="24"/>
+          <w:szCs w:val="24"/>
+          <w:lang w:val="en-GB" w:eastAsia="en-GB"/>
+          <w14:ligatures w14:val="none"/>
+        </w:rPr>
+        <w:t>resultDescription</w:t>
+      </w:r>
+      <w:proofErr w:type="spellEnd"/>
+      <w:r>
+        <w:rPr>
+          <w:rFonts w:ascii="Times New Roman" w:eastAsia="Times New Roman" w:hAnsi="Times New Roman" w:cs="Times New Roman"/>
+          <w:kern w:val="0"/>
+          <w:sz w:val="24"/>
+          <w:szCs w:val="24"/>
+          <w:lang w:val="en-GB" w:eastAsia="en-GB"/>
+          <w14:ligatures w14:val="none"/>
+        </w:rPr>
+        <w:t xml:space="preserve"> field in questionnaire schema </w:t>
+      </w:r>
+    </w:p>
+    <w:p>
+      <w:pPr>
+        <w:numPr>
+          <w:ilvl w:val="0"/>
+          <w:numId w:val="37"/>
+        </w:numPr>
+        <w:spacing w:before="100" w:beforeAutospacing="1" w:after="100" w:afterAutospacing="1" w:line="240" w:lineRule="auto"/>
+        <w:rPr>
+          <w:rFonts w:ascii="Times New Roman" w:eastAsia="Times New Roman" w:hAnsi="Times New Roman" w:cs="Times New Roman"/>
+          <w:kern w:val="0"/>
+          <w:sz w:val="24"/>
+          <w:szCs w:val="24"/>
+          <w:lang w:val="en-GB" w:eastAsia="en-GB"/>
+          <w14:ligatures w14:val="none"/>
+        </w:rPr>
+      </w:pPr>
+      <w:r>
+        <w:rPr>
+          <w:rFonts w:ascii="Times New Roman" w:eastAsia="Times New Roman" w:hAnsi="Times New Roman" w:cs="Times New Roman"/>
+          <w:kern w:val="0"/>
+          <w:sz w:val="24"/>
+          <w:szCs w:val="24"/>
+          <w:lang w:val="en-GB" w:eastAsia="en-GB"/>
+          <w14:ligatures w14:val="none"/>
+        </w:rPr>
+        <w:t xml:space="preserve">display custom interpretation text when no bands/percentiles are defined </w:t>
+      </w:r>
+    </w:p>
+    <w:p>
+      <w:pPr>
+        <w:numPr>
+          <w:ilvl w:val="0"/>
+          <w:numId w:val="37"/>
+        </w:numPr>
+        <w:spacing w:before="100" w:beforeAutospacing="1" w:after="100" w:afterAutospacing="1" w:line="240" w:lineRule="auto"/>
+        <w:rPr>
+          <w:rFonts w:ascii="Times New Roman" w:eastAsia="Times New Roman" w:hAnsi="Times New Roman" w:cs="Times New Roman"/>
+          <w:kern w:val="0"/>
+          <w:sz w:val="24"/>
+          <w:szCs w:val="24"/>
+          <w:lang w:val="en-GB" w:eastAsia="en-GB"/>
+          <w14:ligatures w14:val="none"/>
+        </w:rPr>
+      </w:pPr>
+      <w:r>
+        <w:rPr>
+          <w:rFonts w:ascii="Times New Roman" w:eastAsia="Times New Roman" w:hAnsi="Times New Roman" w:cs="Times New Roman"/>
+          <w:kern w:val="0"/>
+          <w:sz w:val="24"/>
+          <w:szCs w:val="24"/>
+          <w:lang w:val="en-GB" w:eastAsia="en-GB"/>
+          <w14:ligatures w14:val="none"/>
+        </w:rPr>
+        <w:t xml:space="preserve">improve handling of tests with </w:t>
+      </w:r>
+      <w:r>
+        <w:rPr>
+          <w:rFonts w:ascii="Times New Roman" w:eastAsia="Times New Roman" w:hAnsi="Times New Roman" w:cs="Times New Roman"/>
+          <w:b/>
+          <w:bCs/>
+          <w:kern w:val="0"/>
+          <w:sz w:val="24"/>
+          <w:szCs w:val="24"/>
+          <w:lang w:val="en-GB" w:eastAsia="en-GB"/>
+          <w14:ligatures w14:val="none"/>
+        </w:rPr>
+        <w:t>profile-based interpretation</w:t>
+      </w:r>
+      <w:r>
+        <w:rPr>
+          <w:rFonts w:ascii="Times New Roman" w:eastAsia="Times New Roman" w:hAnsi="Times New Roman" w:cs="Times New Roman"/>
+          <w:kern w:val="0"/>
+          <w:sz w:val="24"/>
+          <w:szCs w:val="24"/>
+          <w:lang w:val="en-GB" w:eastAsia="en-GB"/>
+          <w14:ligatures w14:val="none"/>
+        </w:rPr>
+        <w:t xml:space="preserve"> (e.g. UGDS-GS) </w:t>
+      </w:r>
+    </w:p>
+    <w:p>
+      <w:pPr>
+        <w:spacing w:before="100" w:beforeAutospacing="1" w:after="100" w:afterAutospacing="1" w:line="240" w:lineRule="auto"/>
+        <w:rPr>
+          <w:rFonts w:ascii="Times New Roman" w:eastAsia="Times New Roman" w:hAnsi="Times New Roman" w:cs="Times New Roman"/>
+          <w:kern w:val="0"/>
+          <w:sz w:val="24"/>
+          <w:szCs w:val="24"/>
+          <w:lang w:val="en-GB" w:eastAsia="en-GB"/>
+          <w14:ligatures w14:val="none"/>
+        </w:rPr>
+      </w:pPr>
+      <w:r>
+        <w:rPr>
+          <w:rFonts w:ascii="Times New Roman" w:eastAsia="Times New Roman" w:hAnsi="Times New Roman" w:cs="Times New Roman"/>
+          <w:kern w:val="0"/>
+          <w:sz w:val="24"/>
+          <w:szCs w:val="24"/>
+          <w:lang w:val="en-GB" w:eastAsia="en-GB"/>
+          <w14:ligatures w14:val="none"/>
+        </w:rPr>
+        <w:pict w14:anchorId="25805316">
+          <v:rect id="_x0000_i1039" style="width:0;height:1.5pt" o:hralign="center" o:hrstd="t" o:hr="t" fillcolor="#a0a0a0" stroked="f"/>
+        </w:pict>
+      </w:r>
+    </w:p>
+    <w:p>
+      <w:pPr>
+        <w:spacing w:before="100" w:beforeAutospacing="1" w:after="100" w:afterAutospacing="1" w:line="240" w:lineRule="auto"/>
+        <w:rPr>
+          <w:rFonts w:ascii="Times New Roman" w:eastAsia="Times New Roman" w:hAnsi="Times New Roman" w:cs="Times New Roman"/>
+          <w:b/>
+          <w:bCs/>
+          <w:kern w:val="0"/>
+          <w:sz w:val="24"/>
+          <w:szCs w:val="24"/>
+          <w:lang w:val="en-GB" w:eastAsia="en-GB"/>
+          <w14:ligatures w14:val="none"/>
+        </w:rPr>
+      </w:pPr>
+      <w:r>
+        <w:rPr>
+          <w:rFonts w:ascii="Segoe UI Emoji" w:eastAsia="Times New Roman" w:hAnsi="Segoe UI Emoji" w:cs="Segoe UI Emoji"/>
+          <w:b/>
+          <w:bCs/>
+          <w:kern w:val="0"/>
+          <w:sz w:val="24"/>
+          <w:szCs w:val="24"/>
+          <w:lang w:val="en-GB" w:eastAsia="en-GB"/>
+          <w14:ligatures w14:val="none"/>
+        </w:rPr>
+        <w:t>⚙️</w:t>
+      </w:r>
+      <w:r>
+        <w:rPr>
+          <w:rFonts w:ascii="Times New Roman" w:eastAsia="Times New Roman" w:hAnsi="Times New Roman" w:cs="Times New Roman"/>
+          <w:b/>
+          <w:bCs/>
+          <w:kern w:val="0"/>
+          <w:sz w:val="24"/>
+          <w:szCs w:val="24"/>
+          <w:lang w:val="en-GB" w:eastAsia="en-GB"/>
+          <w14:ligatures w14:val="none"/>
+        </w:rPr>
+        <w:t xml:space="preserve"> schema &amp; validation</w:t>
+      </w:r>
+    </w:p>
+    <w:p>
+      <w:pPr>
+        <w:numPr>
+          <w:ilvl w:val="0"/>
+          <w:numId w:val="38"/>
+        </w:numPr>
+        <w:spacing w:before="100" w:beforeAutospacing="1" w:after="100" w:afterAutospacing="1" w:line="240" w:lineRule="auto"/>
+        <w:rPr>
+          <w:rFonts w:ascii="Times New Roman" w:eastAsia="Times New Roman" w:hAnsi="Times New Roman" w:cs="Times New Roman"/>
+          <w:kern w:val="0"/>
+          <w:sz w:val="24"/>
+          <w:szCs w:val="24"/>
+          <w:lang w:val="en-GB" w:eastAsia="en-GB"/>
+          <w14:ligatures w14:val="none"/>
+        </w:rPr>
+      </w:pPr>
+      <w:r>
+        <w:rPr>
+          <w:rFonts w:ascii="Times New Roman" w:eastAsia="Times New Roman" w:hAnsi="Times New Roman" w:cs="Times New Roman"/>
+          <w:kern w:val="0"/>
+          <w:sz w:val="24"/>
+          <w:szCs w:val="24"/>
+          <w:lang w:val="en-GB" w:eastAsia="en-GB"/>
+          <w14:ligatures w14:val="none"/>
+        </w:rPr>
+        <w:t xml:space="preserve">extend Questionnaire type with optional </w:t>
+      </w:r>
+      <w:proofErr w:type="spellStart"/>
+      <w:r>
+        <w:rPr>
+          <w:rFonts w:ascii="Times New Roman" w:eastAsia="Times New Roman" w:hAnsi="Times New Roman" w:cs="Times New Roman"/>
+          <w:kern w:val="0"/>
+          <w:sz w:val="24"/>
+          <w:szCs w:val="24"/>
+          <w:lang w:val="en-GB" w:eastAsia="en-GB"/>
+          <w14:ligatures w14:val="none"/>
+        </w:rPr>
+        <w:t>resultDescription</w:t>
+      </w:r>
+      <w:proofErr w:type="spellEnd"/>
+      <w:r>
+        <w:rPr>
+          <w:rFonts w:ascii="Times New Roman" w:eastAsia="Times New Roman" w:hAnsi="Times New Roman" w:cs="Times New Roman"/>
+          <w:kern w:val="0"/>
+          <w:sz w:val="24"/>
+          <w:szCs w:val="24"/>
+          <w:lang w:val="en-GB" w:eastAsia="en-GB"/>
+          <w14:ligatures w14:val="none"/>
+        </w:rPr>
+        <w:t xml:space="preserve"> </w:t>
+      </w:r>
+    </w:p>
+    <w:p>
+      <w:pPr>
+        <w:numPr>
+          <w:ilvl w:val="0"/>
+          <w:numId w:val="38"/>
+        </w:numPr>
+        <w:spacing w:before="100" w:beforeAutospacing="1" w:after="100" w:afterAutospacing="1" w:line="240" w:lineRule="auto"/>
+        <w:rPr>
+          <w:rFonts w:ascii="Times New Roman" w:eastAsia="Times New Roman" w:hAnsi="Times New Roman" w:cs="Times New Roman"/>
+          <w:kern w:val="0"/>
+          <w:sz w:val="24"/>
+          <w:szCs w:val="24"/>
+          <w:lang w:val="en-GB" w:eastAsia="en-GB"/>
+          <w14:ligatures w14:val="none"/>
+        </w:rPr>
+      </w:pPr>
+      <w:r>
+        <w:rPr>
+          <w:rFonts w:ascii="Times New Roman" w:eastAsia="Times New Roman" w:hAnsi="Times New Roman" w:cs="Times New Roman"/>
+          <w:kern w:val="0"/>
+          <w:sz w:val="24"/>
+          <w:szCs w:val="24"/>
+          <w:lang w:val="en-GB" w:eastAsia="en-GB"/>
+          <w14:ligatures w14:val="none"/>
+        </w:rPr>
+        <w:t xml:space="preserve">add validation for </w:t>
+      </w:r>
+      <w:proofErr w:type="spellStart"/>
+      <w:r>
+        <w:rPr>
+          <w:rFonts w:ascii="Times New Roman" w:eastAsia="Times New Roman" w:hAnsi="Times New Roman" w:cs="Times New Roman"/>
+          <w:kern w:val="0"/>
+          <w:sz w:val="24"/>
+          <w:szCs w:val="24"/>
+          <w:lang w:val="en-GB" w:eastAsia="en-GB"/>
+          <w14:ligatures w14:val="none"/>
+        </w:rPr>
+        <w:t>resultDescription</w:t>
+      </w:r>
+      <w:proofErr w:type="spellEnd"/>
+      <w:r>
+        <w:rPr>
+          <w:rFonts w:ascii="Times New Roman" w:eastAsia="Times New Roman" w:hAnsi="Times New Roman" w:cs="Times New Roman"/>
+          <w:kern w:val="0"/>
+          <w:sz w:val="24"/>
+          <w:szCs w:val="24"/>
+          <w:lang w:val="en-GB" w:eastAsia="en-GB"/>
+          <w14:ligatures w14:val="none"/>
+        </w:rPr>
+        <w:t xml:space="preserve"> field </w:t>
+      </w:r>
+    </w:p>
+    <w:p>
+      <w:pPr>
+        <w:numPr>
+          <w:ilvl w:val="0"/>
+          <w:numId w:val="38"/>
+        </w:numPr>
+        <w:spacing w:before="100" w:beforeAutospacing="1" w:after="100" w:afterAutospacing="1" w:line="240" w:lineRule="auto"/>
+        <w:rPr>
+          <w:rFonts w:ascii="Times New Roman" w:eastAsia="Times New Roman" w:hAnsi="Times New Roman" w:cs="Times New Roman"/>
+          <w:kern w:val="0"/>
+          <w:sz w:val="24"/>
+          <w:szCs w:val="24"/>
+          <w:lang w:val="en-GB" w:eastAsia="en-GB"/>
+          <w14:ligatures w14:val="none"/>
+        </w:rPr>
+      </w:pPr>
+      <w:r>
+        <w:rPr>
+          <w:rFonts w:ascii="Times New Roman" w:eastAsia="Times New Roman" w:hAnsi="Times New Roman" w:cs="Times New Roman"/>
+          <w:kern w:val="0"/>
+          <w:sz w:val="24"/>
+          <w:szCs w:val="24"/>
+          <w:lang w:val="en-GB" w:eastAsia="en-GB"/>
+          <w14:ligatures w14:val="none"/>
+        </w:rPr>
+        <w:t xml:space="preserve">update template to reflect new data structure </w:t>
+      </w:r>
+    </w:p>
+    <w:p>
+      <w:pPr>
+        <w:spacing w:before="100" w:beforeAutospacing="1" w:after="100" w:afterAutospacing="1" w:line="240" w:lineRule="auto"/>
+        <w:rPr>
+          <w:rFonts w:ascii="Times New Roman" w:eastAsia="Times New Roman" w:hAnsi="Times New Roman" w:cs="Times New Roman"/>
+          <w:kern w:val="0"/>
+          <w:sz w:val="24"/>
+          <w:szCs w:val="24"/>
+          <w:lang w:val="en-GB" w:eastAsia="en-GB"/>
+          <w14:ligatures w14:val="none"/>
+        </w:rPr>
+      </w:pPr>
+      <w:r>
+        <w:rPr>
+          <w:rFonts w:ascii="Times New Roman" w:eastAsia="Times New Roman" w:hAnsi="Times New Roman" w:cs="Times New Roman"/>
+          <w:kern w:val="0"/>
+          <w:sz w:val="24"/>
+          <w:szCs w:val="24"/>
+          <w:lang w:val="en-GB" w:eastAsia="en-GB"/>
+          <w14:ligatures w14:val="none"/>
+        </w:rPr>
+        <w:pict w14:anchorId="47003827">
+          <v:rect id="_x0000_i1040" style="width:0;height:1.5pt" o:hralign="center" o:hrstd="t" o:hr="t" fillcolor="#a0a0a0" stroked="f"/>
+        </w:pict>
+      </w:r>
+    </w:p>
+    <w:p>
+      <w:pPr>
+        <w:spacing w:before="100" w:beforeAutospacing="1" w:after="100" w:afterAutospacing="1" w:line="240" w:lineRule="auto"/>
+        <w:rPr>
+          <w:rFonts w:ascii="Times New Roman" w:eastAsia="Times New Roman" w:hAnsi="Times New Roman" w:cs="Times New Roman"/>
+          <w:b/>
+          <w:bCs/>
+          <w:kern w:val="0"/>
+          <w:sz w:val="24"/>
+          <w:szCs w:val="24"/>
+          <w:lang w:val="en-GB" w:eastAsia="en-GB"/>
+          <w14:ligatures w14:val="none"/>
+        </w:rPr>
+      </w:pPr>
+      <w:r>
+        <w:rPr>
+          <w:rFonts w:ascii="Segoe UI Emoji" w:eastAsia="Times New Roman" w:hAnsi="Segoe UI Emoji" w:cs="Segoe UI Emoji"/>
+          <w:b/>
+          <w:bCs/>
+          <w:kern w:val="0"/>
+          <w:sz w:val="24"/>
+          <w:szCs w:val="24"/>
+          <w:lang w:val="en-GB" w:eastAsia="en-GB"/>
+          <w14:ligatures w14:val="none"/>
+        </w:rPr>
+        <w:lastRenderedPageBreak/>
+        <w:t>🎨</w:t>
+      </w:r>
+      <w:r>
+        <w:rPr>
+          <w:rFonts w:ascii="Times New Roman" w:eastAsia="Times New Roman" w:hAnsi="Times New Roman" w:cs="Times New Roman"/>
+          <w:b/>
+          <w:bCs/>
+          <w:kern w:val="0"/>
+          <w:sz w:val="24"/>
+          <w:szCs w:val="24"/>
+          <w:lang w:val="en-GB" w:eastAsia="en-GB"/>
+          <w14:ligatures w14:val="none"/>
+        </w:rPr>
+        <w:t xml:space="preserve"> UI improvements</w:t>
+      </w:r>
+    </w:p>
+    <w:p>
+      <w:pPr>
+        <w:numPr>
+          <w:ilvl w:val="0"/>
+          <w:numId w:val="39"/>
+        </w:numPr>
+        <w:spacing w:before="100" w:beforeAutospacing="1" w:after="100" w:afterAutospacing="1" w:line="240" w:lineRule="auto"/>
+        <w:rPr>
+          <w:rFonts w:ascii="Times New Roman" w:eastAsia="Times New Roman" w:hAnsi="Times New Roman" w:cs="Times New Roman"/>
+          <w:kern w:val="0"/>
+          <w:sz w:val="24"/>
+          <w:szCs w:val="24"/>
+          <w:lang w:val="en-GB" w:eastAsia="en-GB"/>
+          <w14:ligatures w14:val="none"/>
+        </w:rPr>
+      </w:pPr>
+      <w:r>
+        <w:rPr>
+          <w:rFonts w:ascii="Times New Roman" w:eastAsia="Times New Roman" w:hAnsi="Times New Roman" w:cs="Times New Roman"/>
+          <w:kern w:val="0"/>
+          <w:sz w:val="24"/>
+          <w:szCs w:val="24"/>
+          <w:lang w:val="en-GB" w:eastAsia="en-GB"/>
+          <w14:ligatures w14:val="none"/>
+        </w:rPr>
+        <w:t xml:space="preserve">improve display of mean values (value / max instead of value </w:t>
+      </w:r>
+      <w:proofErr w:type="spellStart"/>
+      <w:r>
+        <w:rPr>
+          <w:rFonts w:ascii="Times New Roman" w:eastAsia="Times New Roman" w:hAnsi="Times New Roman" w:cs="Times New Roman"/>
+          <w:kern w:val="0"/>
+          <w:sz w:val="24"/>
+          <w:szCs w:val="24"/>
+          <w:lang w:val="en-GB" w:eastAsia="en-GB"/>
+          <w14:ligatures w14:val="none"/>
+        </w:rPr>
+        <w:t>из</w:t>
+      </w:r>
+      <w:proofErr w:type="spellEnd"/>
+      <w:r>
+        <w:rPr>
+          <w:rFonts w:ascii="Times New Roman" w:eastAsia="Times New Roman" w:hAnsi="Times New Roman" w:cs="Times New Roman"/>
+          <w:kern w:val="0"/>
+          <w:sz w:val="24"/>
+          <w:szCs w:val="24"/>
+          <w:lang w:val="en-GB" w:eastAsia="en-GB"/>
+          <w14:ligatures w14:val="none"/>
+        </w:rPr>
+        <w:t xml:space="preserve"> max) </w:t>
+      </w:r>
+    </w:p>
+    <w:p>
+      <w:pPr>
+        <w:numPr>
+          <w:ilvl w:val="0"/>
+          <w:numId w:val="39"/>
+        </w:numPr>
+        <w:spacing w:before="100" w:beforeAutospacing="1" w:after="100" w:afterAutospacing="1" w:line="240" w:lineRule="auto"/>
+        <w:rPr>
+          <w:rFonts w:ascii="Times New Roman" w:eastAsia="Times New Roman" w:hAnsi="Times New Roman" w:cs="Times New Roman"/>
+          <w:kern w:val="0"/>
+          <w:sz w:val="24"/>
+          <w:szCs w:val="24"/>
+          <w:lang w:val="en-GB" w:eastAsia="en-GB"/>
+          <w14:ligatures w14:val="none"/>
+        </w:rPr>
+      </w:pPr>
+      <w:r>
+        <w:rPr>
+          <w:rFonts w:ascii="Times New Roman" w:eastAsia="Times New Roman" w:hAnsi="Times New Roman" w:cs="Times New Roman"/>
+          <w:kern w:val="0"/>
+          <w:sz w:val="24"/>
+          <w:szCs w:val="24"/>
+          <w:lang w:val="en-GB" w:eastAsia="en-GB"/>
+          <w14:ligatures w14:val="none"/>
+        </w:rPr>
+        <w:t xml:space="preserve">ensure consistent rendering across sum and mean-based tests </w:t>
+      </w:r>
+    </w:p>
+    <w:p>
+      <w:pPr>
+        <w:spacing w:before="100" w:beforeAutospacing="1" w:after="100" w:afterAutospacing="1" w:line="240" w:lineRule="auto"/>
+        <w:rPr>
+          <w:rFonts w:ascii="Times New Roman" w:eastAsia="Times New Roman" w:hAnsi="Times New Roman" w:cs="Times New Roman"/>
+          <w:kern w:val="0"/>
+          <w:sz w:val="24"/>
+          <w:szCs w:val="24"/>
+          <w:lang w:val="en-GB" w:eastAsia="en-GB"/>
+          <w14:ligatures w14:val="none"/>
+        </w:rPr>
+      </w:pPr>
+      <w:r>
+        <w:rPr>
+          <w:rFonts w:ascii="Times New Roman" w:eastAsia="Times New Roman" w:hAnsi="Times New Roman" w:cs="Times New Roman"/>
+          <w:kern w:val="0"/>
+          <w:sz w:val="24"/>
+          <w:szCs w:val="24"/>
+          <w:lang w:val="en-GB" w:eastAsia="en-GB"/>
+          <w14:ligatures w14:val="none"/>
+        </w:rPr>
+        <w:pict w14:anchorId="216674FC">
+          <v:rect id="_x0000_i1065" style="width:0;height:1.5pt" o:hralign="center" o:hrstd="t" o:hr="t" fillcolor="#a0a0a0" stroked="f"/>
+        </w:pict>
+      </w:r>
+    </w:p>
+    <w:p>
+      <w:pPr>
+        <w:spacing w:before="100" w:beforeAutospacing="1" w:after="100" w:afterAutospacing="1" w:line="240" w:lineRule="auto"/>
+        <w:rPr>
+          <w:rFonts w:ascii="Times New Roman" w:eastAsia="Times New Roman" w:hAnsi="Times New Roman" w:cs="Times New Roman"/>
+          <w:b/>
+          <w:bCs/>
+          <w:kern w:val="0"/>
+          <w:sz w:val="24"/>
+          <w:szCs w:val="24"/>
+          <w:lang w:val="en-GB" w:eastAsia="en-GB"/>
+          <w14:ligatures w14:val="none"/>
+        </w:rPr>
+      </w:pPr>
+      <w:r>
+        <w:rPr>
+          <w:rFonts w:ascii="Segoe UI Emoji" w:eastAsia="Times New Roman" w:hAnsi="Segoe UI Emoji" w:cs="Segoe UI Emoji"/>
+          <w:b/>
+          <w:bCs/>
+          <w:kern w:val="0"/>
+          <w:sz w:val="24"/>
+          <w:szCs w:val="24"/>
+          <w:lang w:val="en-GB" w:eastAsia="en-GB"/>
+          <w14:ligatures w14:val="none"/>
+        </w:rPr>
+        <w:t>🧠</w:t>
+      </w:r>
+      <w:r>
+        <w:rPr>
+          <w:rFonts w:ascii="Times New Roman" w:eastAsia="Times New Roman" w:hAnsi="Times New Roman" w:cs="Times New Roman"/>
+          <w:b/>
+          <w:bCs/>
+          <w:kern w:val="0"/>
+          <w:sz w:val="24"/>
+          <w:szCs w:val="24"/>
+          <w:lang w:val="en-GB" w:eastAsia="en-GB"/>
+          <w14:ligatures w14:val="none"/>
+        </w:rPr>
+        <w:t xml:space="preserve"> feat: add support for per-question answer options and integrate Y-BOCS test</w:t>
+      </w:r>
+    </w:p>
+    <w:p>
+      <w:pPr>
+        <w:numPr>
+          <w:ilvl w:val="0"/>
+          <w:numId w:val="40"/>
+        </w:numPr>
+        <w:spacing w:before="100" w:beforeAutospacing="1" w:after="100" w:afterAutospacing="1" w:line="240" w:lineRule="auto"/>
+        <w:rPr>
+          <w:rFonts w:ascii="Times New Roman" w:eastAsia="Times New Roman" w:hAnsi="Times New Roman" w:cs="Times New Roman"/>
+          <w:kern w:val="0"/>
+          <w:sz w:val="24"/>
+          <w:szCs w:val="24"/>
+          <w:lang w:val="en-GB" w:eastAsia="en-GB"/>
+          <w14:ligatures w14:val="none"/>
+        </w:rPr>
+      </w:pPr>
+      <w:r>
+        <w:rPr>
+          <w:rFonts w:ascii="Times New Roman" w:eastAsia="Times New Roman" w:hAnsi="Times New Roman" w:cs="Times New Roman"/>
+          <w:kern w:val="0"/>
+          <w:sz w:val="24"/>
+          <w:szCs w:val="24"/>
+          <w:lang w:val="en-GB" w:eastAsia="en-GB"/>
+          <w14:ligatures w14:val="none"/>
+        </w:rPr>
+        <w:t xml:space="preserve">add support for </w:t>
+      </w:r>
+      <w:r>
+        <w:rPr>
+          <w:rFonts w:ascii="Times New Roman" w:eastAsia="Times New Roman" w:hAnsi="Times New Roman" w:cs="Times New Roman"/>
+          <w:b/>
+          <w:bCs/>
+          <w:kern w:val="0"/>
+          <w:sz w:val="24"/>
+          <w:szCs w:val="24"/>
+          <w:lang w:val="en-GB" w:eastAsia="en-GB"/>
+          <w14:ligatures w14:val="none"/>
+        </w:rPr>
+        <w:t>question-level answer options (</w:t>
+      </w:r>
+      <w:proofErr w:type="spellStart"/>
+      <w:proofErr w:type="gramStart"/>
+      <w:r>
+        <w:rPr>
+          <w:rFonts w:ascii="Times New Roman" w:eastAsia="Times New Roman" w:hAnsi="Times New Roman" w:cs="Times New Roman"/>
+          <w:b/>
+          <w:bCs/>
+          <w:kern w:val="0"/>
+          <w:sz w:val="24"/>
+          <w:szCs w:val="24"/>
+          <w:lang w:val="en-GB" w:eastAsia="en-GB"/>
+          <w14:ligatures w14:val="none"/>
+        </w:rPr>
+        <w:t>question.options</w:t>
+      </w:r>
+      <w:proofErr w:type="spellEnd"/>
+      <w:proofErr w:type="gramEnd"/>
+      <w:r>
+        <w:rPr>
+          <w:rFonts w:ascii="Times New Roman" w:eastAsia="Times New Roman" w:hAnsi="Times New Roman" w:cs="Times New Roman"/>
+          <w:b/>
+          <w:bCs/>
+          <w:kern w:val="0"/>
+          <w:sz w:val="24"/>
+          <w:szCs w:val="24"/>
+          <w:lang w:val="en-GB" w:eastAsia="en-GB"/>
+          <w14:ligatures w14:val="none"/>
+        </w:rPr>
+        <w:t>)</w:t>
+      </w:r>
+      <w:r>
+        <w:rPr>
+          <w:rFonts w:ascii="Times New Roman" w:eastAsia="Times New Roman" w:hAnsi="Times New Roman" w:cs="Times New Roman"/>
+          <w:kern w:val="0"/>
+          <w:sz w:val="24"/>
+          <w:szCs w:val="24"/>
+          <w:lang w:val="en-GB" w:eastAsia="en-GB"/>
+          <w14:ligatures w14:val="none"/>
+        </w:rPr>
+        <w:t xml:space="preserve"> </w:t>
+      </w:r>
+    </w:p>
+    <w:p>
+      <w:pPr>
+        <w:numPr>
+          <w:ilvl w:val="0"/>
+          <w:numId w:val="40"/>
+        </w:numPr>
+        <w:spacing w:before="100" w:beforeAutospacing="1" w:after="100" w:afterAutospacing="1" w:line="240" w:lineRule="auto"/>
+        <w:rPr>
+          <w:rFonts w:ascii="Times New Roman" w:eastAsia="Times New Roman" w:hAnsi="Times New Roman" w:cs="Times New Roman"/>
+          <w:kern w:val="0"/>
+          <w:sz w:val="24"/>
+          <w:szCs w:val="24"/>
+          <w:lang w:val="en-GB" w:eastAsia="en-GB"/>
+          <w14:ligatures w14:val="none"/>
+        </w:rPr>
+      </w:pPr>
+      <w:r>
+        <w:rPr>
+          <w:rFonts w:ascii="Times New Roman" w:eastAsia="Times New Roman" w:hAnsi="Times New Roman" w:cs="Times New Roman"/>
+          <w:kern w:val="0"/>
+          <w:sz w:val="24"/>
+          <w:szCs w:val="24"/>
+          <w:lang w:val="en-GB" w:eastAsia="en-GB"/>
+          <w14:ligatures w14:val="none"/>
+        </w:rPr>
+        <w:t xml:space="preserve">update rendering logic to use: </w:t>
+      </w:r>
+    </w:p>
+    <w:p>
+      <w:pPr>
+        <w:numPr>
+          <w:ilvl w:val="1"/>
+          <w:numId w:val="40"/>
+        </w:numPr>
+        <w:spacing w:before="100" w:beforeAutospacing="1" w:after="100" w:afterAutospacing="1" w:line="240" w:lineRule="auto"/>
+        <w:rPr>
+          <w:rFonts w:ascii="Times New Roman" w:eastAsia="Times New Roman" w:hAnsi="Times New Roman" w:cs="Times New Roman"/>
+          <w:kern w:val="0"/>
+          <w:sz w:val="24"/>
+          <w:szCs w:val="24"/>
+          <w:lang w:val="en-GB" w:eastAsia="en-GB"/>
+          <w14:ligatures w14:val="none"/>
+        </w:rPr>
+      </w:pPr>
+      <w:proofErr w:type="spellStart"/>
+      <w:proofErr w:type="gramStart"/>
+      <w:r>
+        <w:rPr>
+          <w:rFonts w:ascii="Times New Roman" w:eastAsia="Times New Roman" w:hAnsi="Times New Roman" w:cs="Times New Roman"/>
+          <w:kern w:val="0"/>
+          <w:sz w:val="24"/>
+          <w:szCs w:val="24"/>
+          <w:lang w:val="en-GB" w:eastAsia="en-GB"/>
+          <w14:ligatures w14:val="none"/>
+        </w:rPr>
+        <w:t>question.options</w:t>
+      </w:r>
+      <w:proofErr w:type="spellEnd"/>
+      <w:proofErr w:type="gramEnd"/>
+      <w:r>
+        <w:rPr>
+          <w:rFonts w:ascii="Times New Roman" w:eastAsia="Times New Roman" w:hAnsi="Times New Roman" w:cs="Times New Roman"/>
+          <w:kern w:val="0"/>
+          <w:sz w:val="24"/>
+          <w:szCs w:val="24"/>
+          <w:lang w:val="en-GB" w:eastAsia="en-GB"/>
+          <w14:ligatures w14:val="none"/>
+        </w:rPr>
+        <w:t xml:space="preserve"> when defined </w:t>
+      </w:r>
+    </w:p>
+    <w:p>
+      <w:pPr>
+        <w:numPr>
+          <w:ilvl w:val="1"/>
+          <w:numId w:val="40"/>
+        </w:numPr>
+        <w:spacing w:before="100" w:beforeAutospacing="1" w:after="100" w:afterAutospacing="1" w:line="240" w:lineRule="auto"/>
+        <w:rPr>
+          <w:rFonts w:ascii="Times New Roman" w:eastAsia="Times New Roman" w:hAnsi="Times New Roman" w:cs="Times New Roman"/>
+          <w:kern w:val="0"/>
+          <w:sz w:val="24"/>
+          <w:szCs w:val="24"/>
+          <w:lang w:val="en-GB" w:eastAsia="en-GB"/>
+          <w14:ligatures w14:val="none"/>
+        </w:rPr>
+      </w:pPr>
+      <w:r>
+        <w:rPr>
+          <w:rFonts w:ascii="Times New Roman" w:eastAsia="Times New Roman" w:hAnsi="Times New Roman" w:cs="Times New Roman"/>
+          <w:kern w:val="0"/>
+          <w:sz w:val="24"/>
+          <w:szCs w:val="24"/>
+          <w:lang w:val="en-GB" w:eastAsia="en-GB"/>
+          <w14:ligatures w14:val="none"/>
+        </w:rPr>
+        <w:t xml:space="preserve">fallback to </w:t>
+      </w:r>
+      <w:proofErr w:type="spellStart"/>
+      <w:proofErr w:type="gramStart"/>
+      <w:r>
+        <w:rPr>
+          <w:rFonts w:ascii="Times New Roman" w:eastAsia="Times New Roman" w:hAnsi="Times New Roman" w:cs="Times New Roman"/>
+          <w:kern w:val="0"/>
+          <w:sz w:val="24"/>
+          <w:szCs w:val="24"/>
+          <w:lang w:val="en-GB" w:eastAsia="en-GB"/>
+          <w14:ligatures w14:val="none"/>
+        </w:rPr>
+        <w:t>scale.options</w:t>
+      </w:r>
+      <w:proofErr w:type="spellEnd"/>
+      <w:proofErr w:type="gramEnd"/>
+      <w:r>
+        <w:rPr>
+          <w:rFonts w:ascii="Times New Roman" w:eastAsia="Times New Roman" w:hAnsi="Times New Roman" w:cs="Times New Roman"/>
+          <w:kern w:val="0"/>
+          <w:sz w:val="24"/>
+          <w:szCs w:val="24"/>
+          <w:lang w:val="en-GB" w:eastAsia="en-GB"/>
+          <w14:ligatures w14:val="none"/>
+        </w:rPr>
+        <w:t xml:space="preserve"> otherwise </w:t>
+      </w:r>
+    </w:p>
+    <w:p>
+      <w:pPr>
+        <w:spacing w:before="100" w:beforeAutospacing="1" w:after="100" w:afterAutospacing="1" w:line="240" w:lineRule="auto"/>
+        <w:rPr>
+          <w:rFonts w:ascii="Times New Roman" w:eastAsia="Times New Roman" w:hAnsi="Times New Roman" w:cs="Times New Roman"/>
+          <w:kern w:val="0"/>
+          <w:sz w:val="24"/>
+          <w:szCs w:val="24"/>
+          <w:lang w:val="en-GB" w:eastAsia="en-GB"/>
+          <w14:ligatures w14:val="none"/>
+        </w:rPr>
+      </w:pPr>
+      <w:r>
+        <w:rPr>
+          <w:rFonts w:ascii="Times New Roman" w:eastAsia="Times New Roman" w:hAnsi="Times New Roman" w:cs="Times New Roman"/>
+          <w:kern w:val="0"/>
+          <w:sz w:val="24"/>
+          <w:szCs w:val="24"/>
+          <w:lang w:val="en-GB" w:eastAsia="en-GB"/>
+          <w14:ligatures w14:val="none"/>
+        </w:rPr>
+        <w:pict w14:anchorId="4BE48D4D">
+          <v:rect id="_x0000_i1059" style="width:0;height:1.5pt" o:hralign="center" o:hrstd="t" o:hr="t" fillcolor="#a0a0a0" stroked="f"/>
+        </w:pict>
+      </w:r>
+    </w:p>
+    <w:p>
+      <w:pPr>
+        <w:spacing w:before="100" w:beforeAutospacing="1" w:after="100" w:afterAutospacing="1" w:line="240" w:lineRule="auto"/>
+        <w:rPr>
+          <w:rFonts w:ascii="Times New Roman" w:eastAsia="Times New Roman" w:hAnsi="Times New Roman" w:cs="Times New Roman"/>
+          <w:b/>
+          <w:bCs/>
+          <w:kern w:val="0"/>
+          <w:sz w:val="24"/>
+          <w:szCs w:val="24"/>
+          <w:lang w:val="en-GB" w:eastAsia="en-GB"/>
+          <w14:ligatures w14:val="none"/>
+        </w:rPr>
+      </w:pPr>
+      <w:r>
+        <w:rPr>
+          <w:rFonts w:ascii="Segoe UI Emoji" w:eastAsia="Times New Roman" w:hAnsi="Segoe UI Emoji" w:cs="Segoe UI Emoji"/>
+          <w:b/>
+          <w:bCs/>
+          <w:kern w:val="0"/>
+          <w:sz w:val="24"/>
+          <w:szCs w:val="24"/>
+          <w:lang w:val="en-GB" w:eastAsia="en-GB"/>
+          <w14:ligatures w14:val="none"/>
+        </w:rPr>
+        <w:t>📊</w:t>
+      </w:r>
+      <w:r>
+        <w:rPr>
+          <w:rFonts w:ascii="Times New Roman" w:eastAsia="Times New Roman" w:hAnsi="Times New Roman" w:cs="Times New Roman"/>
+          <w:b/>
+          <w:bCs/>
+          <w:kern w:val="0"/>
+          <w:sz w:val="24"/>
+          <w:szCs w:val="24"/>
+          <w:lang w:val="en-GB" w:eastAsia="en-GB"/>
+          <w14:ligatures w14:val="none"/>
+        </w:rPr>
+        <w:t xml:space="preserve"> questionnaire support</w:t>
+      </w:r>
+    </w:p>
+    <w:p>
+      <w:pPr>
+        <w:numPr>
+          <w:ilvl w:val="0"/>
+          <w:numId w:val="41"/>
+        </w:numPr>
+        <w:spacing w:before="100" w:beforeAutospacing="1" w:after="100" w:afterAutospacing="1" w:line="240" w:lineRule="auto"/>
+        <w:rPr>
+          <w:rFonts w:ascii="Times New Roman" w:eastAsia="Times New Roman" w:hAnsi="Times New Roman" w:cs="Times New Roman"/>
+          <w:kern w:val="0"/>
+          <w:sz w:val="24"/>
+          <w:szCs w:val="24"/>
+          <w:lang w:val="en-GB" w:eastAsia="en-GB"/>
+          <w14:ligatures w14:val="none"/>
+        </w:rPr>
+      </w:pPr>
+      <w:r>
+        <w:rPr>
+          <w:rFonts w:ascii="Times New Roman" w:eastAsia="Times New Roman" w:hAnsi="Times New Roman" w:cs="Times New Roman"/>
+          <w:kern w:val="0"/>
+          <w:sz w:val="24"/>
+          <w:szCs w:val="24"/>
+          <w:lang w:val="en-GB" w:eastAsia="en-GB"/>
+          <w14:ligatures w14:val="none"/>
+        </w:rPr>
+        <w:t xml:space="preserve">integrate </w:t>
+      </w:r>
+      <w:r>
+        <w:rPr>
+          <w:rFonts w:ascii="Times New Roman" w:eastAsia="Times New Roman" w:hAnsi="Times New Roman" w:cs="Times New Roman"/>
+          <w:b/>
+          <w:bCs/>
+          <w:kern w:val="0"/>
+          <w:sz w:val="24"/>
+          <w:szCs w:val="24"/>
+          <w:lang w:val="en-GB" w:eastAsia="en-GB"/>
+          <w14:ligatures w14:val="none"/>
+        </w:rPr>
+        <w:t>Y-BOCS (Yale-Brown Obsessive Compulsive Scale)</w:t>
+      </w:r>
+      <w:r>
+        <w:rPr>
+          <w:rFonts w:ascii="Times New Roman" w:eastAsia="Times New Roman" w:hAnsi="Times New Roman" w:cs="Times New Roman"/>
+          <w:kern w:val="0"/>
+          <w:sz w:val="24"/>
+          <w:szCs w:val="24"/>
+          <w:lang w:val="en-GB" w:eastAsia="en-GB"/>
+          <w14:ligatures w14:val="none"/>
+        </w:rPr>
+        <w:t xml:space="preserve"> </w:t>
+      </w:r>
+    </w:p>
+    <w:p>
+      <w:pPr>
+        <w:numPr>
+          <w:ilvl w:val="1"/>
+          <w:numId w:val="41"/>
+        </w:numPr>
+        <w:spacing w:before="100" w:beforeAutospacing="1" w:after="100" w:afterAutospacing="1" w:line="240" w:lineRule="auto"/>
+        <w:rPr>
+          <w:rFonts w:ascii="Times New Roman" w:eastAsia="Times New Roman" w:hAnsi="Times New Roman" w:cs="Times New Roman"/>
+          <w:kern w:val="0"/>
+          <w:sz w:val="24"/>
+          <w:szCs w:val="24"/>
+          <w:lang w:val="en-GB" w:eastAsia="en-GB"/>
+          <w14:ligatures w14:val="none"/>
+        </w:rPr>
+      </w:pPr>
+      <w:r>
+        <w:rPr>
+          <w:rFonts w:ascii="Times New Roman" w:eastAsia="Times New Roman" w:hAnsi="Times New Roman" w:cs="Times New Roman"/>
+          <w:kern w:val="0"/>
+          <w:sz w:val="24"/>
+          <w:szCs w:val="24"/>
+          <w:lang w:val="en-GB" w:eastAsia="en-GB"/>
+          <w14:ligatures w14:val="none"/>
+        </w:rPr>
+        <w:t xml:space="preserve">10 items (obsessions + compulsions) </w:t>
+      </w:r>
+    </w:p>
+    <w:p>
+      <w:pPr>
+        <w:numPr>
+          <w:ilvl w:val="1"/>
+          <w:numId w:val="41"/>
+        </w:numPr>
+        <w:spacing w:before="100" w:beforeAutospacing="1" w:after="100" w:afterAutospacing="1" w:line="240" w:lineRule="auto"/>
+        <w:rPr>
+          <w:rFonts w:ascii="Times New Roman" w:eastAsia="Times New Roman" w:hAnsi="Times New Roman" w:cs="Times New Roman"/>
+          <w:kern w:val="0"/>
+          <w:sz w:val="24"/>
+          <w:szCs w:val="24"/>
+          <w:lang w:val="en-GB" w:eastAsia="en-GB"/>
+          <w14:ligatures w14:val="none"/>
+        </w:rPr>
+      </w:pPr>
+      <w:r>
+        <w:rPr>
+          <w:rFonts w:ascii="Times New Roman" w:eastAsia="Times New Roman" w:hAnsi="Times New Roman" w:cs="Times New Roman"/>
+          <w:kern w:val="0"/>
+          <w:sz w:val="24"/>
+          <w:szCs w:val="24"/>
+          <w:lang w:val="en-GB" w:eastAsia="en-GB"/>
+          <w14:ligatures w14:val="none"/>
+        </w:rPr>
+        <w:t xml:space="preserve">per-question answer scales </w:t>
+      </w:r>
+    </w:p>
+    <w:p>
+      <w:pPr>
+        <w:numPr>
+          <w:ilvl w:val="1"/>
+          <w:numId w:val="41"/>
+        </w:numPr>
+        <w:spacing w:before="100" w:beforeAutospacing="1" w:after="100" w:afterAutospacing="1" w:line="240" w:lineRule="auto"/>
+        <w:rPr>
+          <w:rFonts w:ascii="Times New Roman" w:eastAsia="Times New Roman" w:hAnsi="Times New Roman" w:cs="Times New Roman"/>
+          <w:kern w:val="0"/>
+          <w:sz w:val="24"/>
+          <w:szCs w:val="24"/>
+          <w:lang w:val="en-GB" w:eastAsia="en-GB"/>
+          <w14:ligatures w14:val="none"/>
+        </w:rPr>
+      </w:pPr>
+      <w:r>
+        <w:rPr>
+          <w:rFonts w:ascii="Times New Roman" w:eastAsia="Times New Roman" w:hAnsi="Times New Roman" w:cs="Times New Roman"/>
+          <w:kern w:val="0"/>
+          <w:sz w:val="24"/>
+          <w:szCs w:val="24"/>
+          <w:lang w:val="en-GB" w:eastAsia="en-GB"/>
+          <w14:ligatures w14:val="none"/>
+        </w:rPr>
+        <w:t xml:space="preserve">total score (0–40) </w:t>
+      </w:r>
+    </w:p>
+    <w:p>
+      <w:pPr>
+        <w:numPr>
+          <w:ilvl w:val="1"/>
+          <w:numId w:val="41"/>
+        </w:numPr>
+        <w:spacing w:before="100" w:beforeAutospacing="1" w:after="100" w:afterAutospacing="1" w:line="240" w:lineRule="auto"/>
+        <w:rPr>
+          <w:rFonts w:ascii="Times New Roman" w:eastAsia="Times New Roman" w:hAnsi="Times New Roman" w:cs="Times New Roman"/>
+          <w:kern w:val="0"/>
+          <w:sz w:val="24"/>
+          <w:szCs w:val="24"/>
+          <w:lang w:val="en-GB" w:eastAsia="en-GB"/>
+          <w14:ligatures w14:val="none"/>
+        </w:rPr>
+      </w:pPr>
+      <w:r>
+        <w:rPr>
+          <w:rFonts w:ascii="Times New Roman" w:eastAsia="Times New Roman" w:hAnsi="Times New Roman" w:cs="Times New Roman"/>
+          <w:kern w:val="0"/>
+          <w:sz w:val="24"/>
+          <w:szCs w:val="24"/>
+          <w:lang w:val="en-GB" w:eastAsia="en-GB"/>
+          <w14:ligatures w14:val="none"/>
+        </w:rPr>
+        <w:t xml:space="preserve">subscales: </w:t>
+      </w:r>
+    </w:p>
+    <w:p>
+      <w:pPr>
+        <w:numPr>
+          <w:ilvl w:val="2"/>
+          <w:numId w:val="41"/>
+        </w:numPr>
+        <w:spacing w:before="100" w:beforeAutospacing="1" w:after="100" w:afterAutospacing="1" w:line="240" w:lineRule="auto"/>
+        <w:rPr>
+          <w:rFonts w:ascii="Times New Roman" w:eastAsia="Times New Roman" w:hAnsi="Times New Roman" w:cs="Times New Roman"/>
+          <w:kern w:val="0"/>
+          <w:sz w:val="24"/>
+          <w:szCs w:val="24"/>
+          <w:lang w:val="en-GB" w:eastAsia="en-GB"/>
+          <w14:ligatures w14:val="none"/>
+        </w:rPr>
+      </w:pPr>
+      <w:r>
+        <w:rPr>
+          <w:rFonts w:ascii="Times New Roman" w:eastAsia="Times New Roman" w:hAnsi="Times New Roman" w:cs="Times New Roman"/>
+          <w:kern w:val="0"/>
+          <w:sz w:val="24"/>
+          <w:szCs w:val="24"/>
+          <w:lang w:val="en-GB" w:eastAsia="en-GB"/>
+          <w14:ligatures w14:val="none"/>
+        </w:rPr>
+        <w:t xml:space="preserve">obsessions (1–5) </w:t>
+      </w:r>
+    </w:p>
+    <w:p>
+      <w:pPr>
+        <w:numPr>
+          <w:ilvl w:val="2"/>
+          <w:numId w:val="41"/>
+        </w:numPr>
+        <w:spacing w:before="100" w:beforeAutospacing="1" w:after="100" w:afterAutospacing="1" w:line="240" w:lineRule="auto"/>
+        <w:rPr>
+          <w:rFonts w:ascii="Times New Roman" w:eastAsia="Times New Roman" w:hAnsi="Times New Roman" w:cs="Times New Roman"/>
+          <w:kern w:val="0"/>
+          <w:sz w:val="24"/>
+          <w:szCs w:val="24"/>
+          <w:lang w:val="en-GB" w:eastAsia="en-GB"/>
+          <w14:ligatures w14:val="none"/>
+        </w:rPr>
+      </w:pPr>
+      <w:r>
+        <w:rPr>
+          <w:rFonts w:ascii="Times New Roman" w:eastAsia="Times New Roman" w:hAnsi="Times New Roman" w:cs="Times New Roman"/>
+          <w:kern w:val="0"/>
+          <w:sz w:val="24"/>
+          <w:szCs w:val="24"/>
+          <w:lang w:val="en-GB" w:eastAsia="en-GB"/>
+          <w14:ligatures w14:val="none"/>
+        </w:rPr>
+        <w:t xml:space="preserve">compulsions (6–10) </w:t>
+      </w:r>
+    </w:p>
+    <w:p>
+      <w:pPr>
+        <w:numPr>
+          <w:ilvl w:val="1"/>
+          <w:numId w:val="41"/>
+        </w:numPr>
+        <w:spacing w:before="100" w:beforeAutospacing="1" w:after="100" w:afterAutospacing="1" w:line="240" w:lineRule="auto"/>
+        <w:rPr>
+          <w:rFonts w:ascii="Times New Roman" w:eastAsia="Times New Roman" w:hAnsi="Times New Roman" w:cs="Times New Roman"/>
+          <w:kern w:val="0"/>
+          <w:sz w:val="24"/>
+          <w:szCs w:val="24"/>
+          <w:lang w:val="en-GB" w:eastAsia="en-GB"/>
+          <w14:ligatures w14:val="none"/>
+        </w:rPr>
+      </w:pPr>
+      <w:r>
+        <w:rPr>
+          <w:rFonts w:ascii="Times New Roman" w:eastAsia="Times New Roman" w:hAnsi="Times New Roman" w:cs="Times New Roman"/>
+          <w:kern w:val="0"/>
+          <w:sz w:val="24"/>
+          <w:szCs w:val="24"/>
+          <w:lang w:val="en-GB" w:eastAsia="en-GB"/>
+          <w14:ligatures w14:val="none"/>
+        </w:rPr>
+        <w:t xml:space="preserve">clinical interpretation bands </w:t>
+      </w:r>
+    </w:p>
+    <w:p>
+      <w:pPr>
+        <w:spacing w:before="100" w:beforeAutospacing="1" w:after="100" w:afterAutospacing="1" w:line="240" w:lineRule="auto"/>
+        <w:rPr>
+          <w:rFonts w:ascii="Times New Roman" w:eastAsia="Times New Roman" w:hAnsi="Times New Roman" w:cs="Times New Roman"/>
+          <w:kern w:val="0"/>
+          <w:sz w:val="24"/>
+          <w:szCs w:val="24"/>
+          <w:lang w:val="en-GB" w:eastAsia="en-GB"/>
+          <w14:ligatures w14:val="none"/>
+        </w:rPr>
+      </w:pPr>
+      <w:r>
+        <w:rPr>
+          <w:rFonts w:ascii="Times New Roman" w:eastAsia="Times New Roman" w:hAnsi="Times New Roman" w:cs="Times New Roman"/>
+          <w:kern w:val="0"/>
+          <w:sz w:val="24"/>
+          <w:szCs w:val="24"/>
+          <w:lang w:val="en-GB" w:eastAsia="en-GB"/>
+          <w14:ligatures w14:val="none"/>
+        </w:rPr>
+        <w:pict w14:anchorId="1A0D8E5A">
+          <v:rect id="_x0000_i1060" style="width:0;height:1.5pt" o:hralign="center" o:hrstd="t" o:hr="t" fillcolor="#a0a0a0" stroked="f"/>
+        </w:pict>
+      </w:r>
+    </w:p>
+    <w:p>
+      <w:pPr>
+        <w:spacing w:before="100" w:beforeAutospacing="1" w:after="100" w:afterAutospacing="1" w:line="240" w:lineRule="auto"/>
+        <w:rPr>
+          <w:rFonts w:ascii="Times New Roman" w:eastAsia="Times New Roman" w:hAnsi="Times New Roman" w:cs="Times New Roman"/>
+          <w:b/>
+          <w:bCs/>
+          <w:kern w:val="0"/>
+          <w:sz w:val="24"/>
+          <w:szCs w:val="24"/>
+          <w:lang w:val="en-GB" w:eastAsia="en-GB"/>
+          <w14:ligatures w14:val="none"/>
+        </w:rPr>
+      </w:pPr>
+      <w:r>
+        <w:rPr>
+          <w:rFonts w:ascii="Segoe UI Emoji" w:eastAsia="Times New Roman" w:hAnsi="Segoe UI Emoji" w:cs="Segoe UI Emoji"/>
+          <w:b/>
+          <w:bCs/>
+          <w:kern w:val="0"/>
+          <w:sz w:val="24"/>
+          <w:szCs w:val="24"/>
+          <w:lang w:val="en-GB" w:eastAsia="en-GB"/>
+          <w14:ligatures w14:val="none"/>
+        </w:rPr>
+        <w:t>🎨</w:t>
+      </w:r>
+      <w:r>
+        <w:rPr>
+          <w:rFonts w:ascii="Times New Roman" w:eastAsia="Times New Roman" w:hAnsi="Times New Roman" w:cs="Times New Roman"/>
+          <w:b/>
+          <w:bCs/>
+          <w:kern w:val="0"/>
+          <w:sz w:val="24"/>
+          <w:szCs w:val="24"/>
+          <w:lang w:val="en-GB" w:eastAsia="en-GB"/>
+          <w14:ligatures w14:val="none"/>
+        </w:rPr>
+        <w:t xml:space="preserve"> UI updates</w:t>
+      </w:r>
+    </w:p>
+    <w:p>
+      <w:pPr>
+        <w:numPr>
+          <w:ilvl w:val="0"/>
+          <w:numId w:val="42"/>
+        </w:numPr>
+        <w:spacing w:before="100" w:beforeAutospacing="1" w:after="100" w:afterAutospacing="1" w:line="240" w:lineRule="auto"/>
+        <w:rPr>
+          <w:rFonts w:ascii="Times New Roman" w:eastAsia="Times New Roman" w:hAnsi="Times New Roman" w:cs="Times New Roman"/>
+          <w:kern w:val="0"/>
+          <w:sz w:val="24"/>
+          <w:szCs w:val="24"/>
+          <w:lang w:val="en-GB" w:eastAsia="en-GB"/>
+          <w14:ligatures w14:val="none"/>
+        </w:rPr>
+      </w:pPr>
+      <w:r>
+        <w:rPr>
+          <w:rFonts w:ascii="Times New Roman" w:eastAsia="Times New Roman" w:hAnsi="Times New Roman" w:cs="Times New Roman"/>
+          <w:kern w:val="0"/>
+          <w:sz w:val="24"/>
+          <w:szCs w:val="24"/>
+          <w:lang w:val="en-GB" w:eastAsia="en-GB"/>
+          <w14:ligatures w14:val="none"/>
+        </w:rPr>
+        <w:t xml:space="preserve">synchronize answer buttons with per-question options </w:t>
+      </w:r>
+    </w:p>
+    <w:p>
+      <w:pPr>
+        <w:numPr>
+          <w:ilvl w:val="0"/>
+          <w:numId w:val="42"/>
+        </w:numPr>
+        <w:spacing w:before="100" w:beforeAutospacing="1" w:after="100" w:afterAutospacing="1" w:line="240" w:lineRule="auto"/>
+        <w:rPr>
+          <w:rFonts w:ascii="Times New Roman" w:eastAsia="Times New Roman" w:hAnsi="Times New Roman" w:cs="Times New Roman"/>
+          <w:kern w:val="0"/>
+          <w:sz w:val="24"/>
+          <w:szCs w:val="24"/>
+          <w:lang w:val="en-GB" w:eastAsia="en-GB"/>
+          <w14:ligatures w14:val="none"/>
+        </w:rPr>
+      </w:pPr>
+      <w:r>
+        <w:rPr>
+          <w:rFonts w:ascii="Times New Roman" w:eastAsia="Times New Roman" w:hAnsi="Times New Roman" w:cs="Times New Roman"/>
+          <w:kern w:val="0"/>
+          <w:sz w:val="24"/>
+          <w:szCs w:val="24"/>
+          <w:lang w:val="en-GB" w:eastAsia="en-GB"/>
+          <w14:ligatures w14:val="none"/>
+        </w:rPr>
+        <w:t xml:space="preserve">update scale display to reflect </w:t>
+      </w:r>
+      <w:r>
+        <w:rPr>
+          <w:rFonts w:ascii="Times New Roman" w:eastAsia="Times New Roman" w:hAnsi="Times New Roman" w:cs="Times New Roman"/>
+          <w:b/>
+          <w:bCs/>
+          <w:kern w:val="0"/>
+          <w:sz w:val="24"/>
+          <w:szCs w:val="24"/>
+          <w:lang w:val="en-GB" w:eastAsia="en-GB"/>
+          <w14:ligatures w14:val="none"/>
+        </w:rPr>
+        <w:t>current question options</w:t>
+      </w:r>
+      <w:r>
+        <w:rPr>
+          <w:rFonts w:ascii="Times New Roman" w:eastAsia="Times New Roman" w:hAnsi="Times New Roman" w:cs="Times New Roman"/>
+          <w:kern w:val="0"/>
+          <w:sz w:val="24"/>
+          <w:szCs w:val="24"/>
+          <w:lang w:val="en-GB" w:eastAsia="en-GB"/>
+          <w14:ligatures w14:val="none"/>
+        </w:rPr>
+        <w:t xml:space="preserve"> </w:t>
+      </w:r>
+    </w:p>
+    <w:p>
+      <w:pPr>
+        <w:numPr>
+          <w:ilvl w:val="0"/>
+          <w:numId w:val="42"/>
+        </w:numPr>
+        <w:spacing w:before="100" w:beforeAutospacing="1" w:after="100" w:afterAutospacing="1" w:line="240" w:lineRule="auto"/>
+        <w:rPr>
+          <w:rFonts w:ascii="Times New Roman" w:eastAsia="Times New Roman" w:hAnsi="Times New Roman" w:cs="Times New Roman"/>
+          <w:kern w:val="0"/>
+          <w:sz w:val="24"/>
+          <w:szCs w:val="24"/>
+          <w:lang w:val="en-GB" w:eastAsia="en-GB"/>
+          <w14:ligatures w14:val="none"/>
+        </w:rPr>
+      </w:pPr>
+      <w:r>
+        <w:rPr>
+          <w:rFonts w:ascii="Times New Roman" w:eastAsia="Times New Roman" w:hAnsi="Times New Roman" w:cs="Times New Roman"/>
+          <w:kern w:val="0"/>
+          <w:sz w:val="24"/>
+          <w:szCs w:val="24"/>
+          <w:lang w:val="en-GB" w:eastAsia="en-GB"/>
+          <w14:ligatures w14:val="none"/>
+        </w:rPr>
+        <w:t xml:space="preserve">separate: </w:t>
+      </w:r>
+    </w:p>
+    <w:p>
+      <w:pPr>
+        <w:numPr>
+          <w:ilvl w:val="1"/>
+          <w:numId w:val="42"/>
+        </w:numPr>
+        <w:spacing w:before="100" w:beforeAutospacing="1" w:after="100" w:afterAutospacing="1" w:line="240" w:lineRule="auto"/>
+        <w:rPr>
+          <w:rFonts w:ascii="Times New Roman" w:eastAsia="Times New Roman" w:hAnsi="Times New Roman" w:cs="Times New Roman"/>
+          <w:kern w:val="0"/>
+          <w:sz w:val="24"/>
+          <w:szCs w:val="24"/>
+          <w:lang w:val="en-GB" w:eastAsia="en-GB"/>
+          <w14:ligatures w14:val="none"/>
+        </w:rPr>
+      </w:pPr>
+      <w:r>
+        <w:rPr>
+          <w:rFonts w:ascii="Times New Roman" w:eastAsia="Times New Roman" w:hAnsi="Times New Roman" w:cs="Times New Roman"/>
+          <w:kern w:val="0"/>
+          <w:sz w:val="24"/>
+          <w:szCs w:val="24"/>
+          <w:lang w:val="en-GB" w:eastAsia="en-GB"/>
+          <w14:ligatures w14:val="none"/>
+        </w:rPr>
+        <w:t xml:space="preserve">global instructions </w:t>
+      </w:r>
+    </w:p>
+    <w:p>
+      <w:pPr>
+        <w:numPr>
+          <w:ilvl w:val="1"/>
+          <w:numId w:val="42"/>
+        </w:numPr>
+        <w:spacing w:before="100" w:beforeAutospacing="1" w:after="100" w:afterAutospacing="1" w:line="240" w:lineRule="auto"/>
+        <w:rPr>
+          <w:rFonts w:ascii="Times New Roman" w:eastAsia="Times New Roman" w:hAnsi="Times New Roman" w:cs="Times New Roman"/>
+          <w:kern w:val="0"/>
+          <w:sz w:val="24"/>
+          <w:szCs w:val="24"/>
+          <w:lang w:val="en-GB" w:eastAsia="en-GB"/>
+          <w14:ligatures w14:val="none"/>
+        </w:rPr>
+      </w:pPr>
+      <w:r>
+        <w:rPr>
+          <w:rFonts w:ascii="Times New Roman" w:eastAsia="Times New Roman" w:hAnsi="Times New Roman" w:cs="Times New Roman"/>
+          <w:kern w:val="0"/>
+          <w:sz w:val="24"/>
+          <w:szCs w:val="24"/>
+          <w:lang w:val="en-GB" w:eastAsia="en-GB"/>
+          <w14:ligatures w14:val="none"/>
+        </w:rPr>
+        <w:t xml:space="preserve">per-question answer legend </w:t>
+      </w:r>
+    </w:p>
+    <w:p>
+      <w:pPr>
+        <w:spacing w:before="100" w:beforeAutospacing="1" w:after="100" w:afterAutospacing="1" w:line="240" w:lineRule="auto"/>
+        <w:rPr>
+          <w:rFonts w:ascii="Times New Roman" w:eastAsia="Times New Roman" w:hAnsi="Times New Roman" w:cs="Times New Roman"/>
+          <w:kern w:val="0"/>
+          <w:sz w:val="24"/>
+          <w:szCs w:val="24"/>
+          <w:lang w:val="en-GB" w:eastAsia="en-GB"/>
+          <w14:ligatures w14:val="none"/>
+        </w:rPr>
+      </w:pPr>
+      <w:r>
+        <w:rPr>
+          <w:rFonts w:ascii="Times New Roman" w:eastAsia="Times New Roman" w:hAnsi="Times New Roman" w:cs="Times New Roman"/>
+          <w:kern w:val="0"/>
+          <w:sz w:val="24"/>
+          <w:szCs w:val="24"/>
+          <w:lang w:val="en-GB" w:eastAsia="en-GB"/>
+          <w14:ligatures w14:val="none"/>
+        </w:rPr>
+        <w:pict w14:anchorId="151AE232">
+          <v:rect id="_x0000_i1061" style="width:0;height:1.5pt" o:hralign="center" o:hrstd="t" o:hr="t" fillcolor="#a0a0a0" stroked="f"/>
+        </w:pict>
+      </w:r>
+    </w:p>
+    <w:p>
+      <w:pPr>
+        <w:spacing w:before="100" w:beforeAutospacing="1" w:after="100" w:afterAutospacing="1" w:line="240" w:lineRule="auto"/>
+        <w:rPr>
+          <w:rFonts w:ascii="Times New Roman" w:eastAsia="Times New Roman" w:hAnsi="Times New Roman" w:cs="Times New Roman"/>
+          <w:b/>
+          <w:bCs/>
+          <w:kern w:val="0"/>
+          <w:sz w:val="24"/>
+          <w:szCs w:val="24"/>
+          <w:lang w:val="en-GB" w:eastAsia="en-GB"/>
+          <w14:ligatures w14:val="none"/>
+        </w:rPr>
+      </w:pPr>
+      <w:r>
+        <w:rPr>
+          <w:rFonts w:ascii="Segoe UI Emoji" w:eastAsia="Times New Roman" w:hAnsi="Segoe UI Emoji" w:cs="Segoe UI Emoji"/>
+          <w:b/>
+          <w:bCs/>
+          <w:kern w:val="0"/>
+          <w:sz w:val="24"/>
+          <w:szCs w:val="24"/>
+          <w:lang w:val="en-GB" w:eastAsia="en-GB"/>
+          <w14:ligatures w14:val="none"/>
+        </w:rPr>
+        <w:t>⚙️</w:t>
+      </w:r>
+      <w:r>
+        <w:rPr>
+          <w:rFonts w:ascii="Times New Roman" w:eastAsia="Times New Roman" w:hAnsi="Times New Roman" w:cs="Times New Roman"/>
+          <w:b/>
+          <w:bCs/>
+          <w:kern w:val="0"/>
+          <w:sz w:val="24"/>
+          <w:szCs w:val="24"/>
+          <w:lang w:val="en-GB" w:eastAsia="en-GB"/>
+          <w14:ligatures w14:val="none"/>
+        </w:rPr>
+        <w:t xml:space="preserve"> schema &amp; validation</w:t>
+      </w:r>
+    </w:p>
+    <w:p>
+      <w:pPr>
+        <w:numPr>
+          <w:ilvl w:val="0"/>
+          <w:numId w:val="43"/>
+        </w:numPr>
+        <w:spacing w:before="100" w:beforeAutospacing="1" w:after="100" w:afterAutospacing="1" w:line="240" w:lineRule="auto"/>
+        <w:rPr>
+          <w:rFonts w:ascii="Times New Roman" w:eastAsia="Times New Roman" w:hAnsi="Times New Roman" w:cs="Times New Roman"/>
+          <w:kern w:val="0"/>
+          <w:sz w:val="24"/>
+          <w:szCs w:val="24"/>
+          <w:lang w:val="en-GB" w:eastAsia="en-GB"/>
+          <w14:ligatures w14:val="none"/>
+        </w:rPr>
+      </w:pPr>
+      <w:r>
+        <w:rPr>
+          <w:rFonts w:ascii="Times New Roman" w:eastAsia="Times New Roman" w:hAnsi="Times New Roman" w:cs="Times New Roman"/>
+          <w:kern w:val="0"/>
+          <w:sz w:val="24"/>
+          <w:szCs w:val="24"/>
+          <w:lang w:val="en-GB" w:eastAsia="en-GB"/>
+          <w14:ligatures w14:val="none"/>
+        </w:rPr>
+        <w:t xml:space="preserve">extend Question type with optional options </w:t>
+      </w:r>
+    </w:p>
+    <w:p>
+      <w:pPr>
+        <w:numPr>
+          <w:ilvl w:val="0"/>
+          <w:numId w:val="43"/>
+        </w:numPr>
+        <w:spacing w:before="100" w:beforeAutospacing="1" w:after="100" w:afterAutospacing="1" w:line="240" w:lineRule="auto"/>
+        <w:rPr>
+          <w:rFonts w:ascii="Times New Roman" w:eastAsia="Times New Roman" w:hAnsi="Times New Roman" w:cs="Times New Roman"/>
+          <w:kern w:val="0"/>
+          <w:sz w:val="24"/>
+          <w:szCs w:val="24"/>
+          <w:lang w:val="en-GB" w:eastAsia="en-GB"/>
+          <w14:ligatures w14:val="none"/>
+        </w:rPr>
+      </w:pPr>
+      <w:r>
+        <w:rPr>
+          <w:rFonts w:ascii="Times New Roman" w:eastAsia="Times New Roman" w:hAnsi="Times New Roman" w:cs="Times New Roman"/>
+          <w:kern w:val="0"/>
+          <w:sz w:val="24"/>
+          <w:szCs w:val="24"/>
+          <w:lang w:val="en-GB" w:eastAsia="en-GB"/>
+          <w14:ligatures w14:val="none"/>
+        </w:rPr>
+        <w:t xml:space="preserve">add validation for </w:t>
+      </w:r>
+      <w:proofErr w:type="spellStart"/>
+      <w:proofErr w:type="gramStart"/>
+      <w:r>
+        <w:rPr>
+          <w:rFonts w:ascii="Times New Roman" w:eastAsia="Times New Roman" w:hAnsi="Times New Roman" w:cs="Times New Roman"/>
+          <w:kern w:val="0"/>
+          <w:sz w:val="24"/>
+          <w:szCs w:val="24"/>
+          <w:lang w:val="en-GB" w:eastAsia="en-GB"/>
+          <w14:ligatures w14:val="none"/>
+        </w:rPr>
+        <w:t>question.options</w:t>
+      </w:r>
+      <w:proofErr w:type="spellEnd"/>
+      <w:proofErr w:type="gramEnd"/>
+      <w:r>
+        <w:rPr>
+          <w:rFonts w:ascii="Times New Roman" w:eastAsia="Times New Roman" w:hAnsi="Times New Roman" w:cs="Times New Roman"/>
+          <w:kern w:val="0"/>
+          <w:sz w:val="24"/>
+          <w:szCs w:val="24"/>
+          <w:lang w:val="en-GB" w:eastAsia="en-GB"/>
+          <w14:ligatures w14:val="none"/>
+        </w:rPr>
+        <w:t xml:space="preserve"> </w:t>
+      </w:r>
+    </w:p>
+    <w:p>
+      <w:pPr>
+        <w:numPr>
+          <w:ilvl w:val="0"/>
+          <w:numId w:val="43"/>
+        </w:numPr>
+        <w:spacing w:before="100" w:beforeAutospacing="1" w:after="100" w:afterAutospacing="1" w:line="240" w:lineRule="auto"/>
         <w:rPr>
           <w:lang w:val="en-GB"/>
         </w:rPr>
       </w:pPr>
+      <w:r>
+        <w:rPr>
+          <w:rFonts w:ascii="Times New Roman" w:eastAsia="Times New Roman" w:hAnsi="Times New Roman" w:cs="Times New Roman"/>
+          <w:kern w:val="0"/>
+          <w:sz w:val="24"/>
+          <w:szCs w:val="24"/>
+          <w:lang w:val="en-GB" w:eastAsia="en-GB"/>
+          <w14:ligatures w14:val="none"/>
+        </w:rPr>
+        <w:t xml:space="preserve">ensure backward compatibility with existing tests </w:t>
+      </w:r>
     </w:p>
     <w:sectPr>
       <w:pgSz w:w="12240" w:h="15840"/>
@@ -5019,6 +6736,304 @@
     </w:lvl>
   </w:abstractNum>
   <w:abstractNum w:abstractNumId="3" w15:restartNumberingAfterBreak="0">
+    <w:nsid w:val="061C1F7A"/>
+    <w:multiLevelType w:val="multilevel"/>
+    <w:tmpl w:val="AA10A4F2"/>
+    <w:lvl w:ilvl="0">
+      <w:start w:val="1"/>
+      <w:numFmt w:val="bullet"/>
+      <w:lvlText w:val=""/>
+      <w:lvlJc w:val="left"/>
+      <w:pPr>
+        <w:tabs>
+          <w:tab w:val="num" w:pos="720"/>
+        </w:tabs>
+        <w:ind w:left="720" w:hanging="360"/>
+      </w:pPr>
+      <w:rPr>
+        <w:rFonts w:ascii="Symbol" w:hAnsi="Symbol" w:hint="default"/>
+        <w:sz w:val="20"/>
+      </w:rPr>
+    </w:lvl>
+    <w:lvl w:ilvl="1" w:tentative="1">
+      <w:start w:val="1"/>
+      <w:numFmt w:val="bullet"/>
+      <w:lvlText w:val="o"/>
+      <w:lvlJc w:val="left"/>
+      <w:pPr>
+        <w:tabs>
+          <w:tab w:val="num" w:pos="1440"/>
+        </w:tabs>
+        <w:ind w:left="1440" w:hanging="360"/>
+      </w:pPr>
+      <w:rPr>
+        <w:rFonts w:ascii="Courier New" w:hAnsi="Courier New" w:hint="default"/>
+        <w:sz w:val="20"/>
+      </w:rPr>
+    </w:lvl>
+    <w:lvl w:ilvl="2" w:tentative="1">
+      <w:start w:val="1"/>
+      <w:numFmt w:val="bullet"/>
+      <w:lvlText w:val=""/>
+      <w:lvlJc w:val="left"/>
+      <w:pPr>
+        <w:tabs>
+          <w:tab w:val="num" w:pos="2160"/>
+        </w:tabs>
+        <w:ind w:left="2160" w:hanging="360"/>
+      </w:pPr>
+      <w:rPr>
+        <w:rFonts w:ascii="Wingdings" w:hAnsi="Wingdings" w:hint="default"/>
+        <w:sz w:val="20"/>
+      </w:rPr>
+    </w:lvl>
+    <w:lvl w:ilvl="3" w:tentative="1">
+      <w:start w:val="1"/>
+      <w:numFmt w:val="bullet"/>
+      <w:lvlText w:val=""/>
+      <w:lvlJc w:val="left"/>
+      <w:pPr>
+        <w:tabs>
+          <w:tab w:val="num" w:pos="2880"/>
+        </w:tabs>
+        <w:ind w:left="2880" w:hanging="360"/>
+      </w:pPr>
+      <w:rPr>
+        <w:rFonts w:ascii="Wingdings" w:hAnsi="Wingdings" w:hint="default"/>
+        <w:sz w:val="20"/>
+      </w:rPr>
+    </w:lvl>
+    <w:lvl w:ilvl="4" w:tentative="1">
+      <w:start w:val="1"/>
+      <w:numFmt w:val="bullet"/>
+      <w:lvlText w:val=""/>
+      <w:lvlJc w:val="left"/>
+      <w:pPr>
+        <w:tabs>
+          <w:tab w:val="num" w:pos="3600"/>
+        </w:tabs>
+        <w:ind w:left="3600" w:hanging="360"/>
+      </w:pPr>
+      <w:rPr>
+        <w:rFonts w:ascii="Wingdings" w:hAnsi="Wingdings" w:hint="default"/>
+        <w:sz w:val="20"/>
+      </w:rPr>
+    </w:lvl>
+    <w:lvl w:ilvl="5" w:tentative="1">
+      <w:start w:val="1"/>
+      <w:numFmt w:val="bullet"/>
+      <w:lvlText w:val=""/>
+      <w:lvlJc w:val="left"/>
+      <w:pPr>
+        <w:tabs>
+          <w:tab w:val="num" w:pos="4320"/>
+        </w:tabs>
+        <w:ind w:left="4320" w:hanging="360"/>
+      </w:pPr>
+      <w:rPr>
+        <w:rFonts w:ascii="Wingdings" w:hAnsi="Wingdings" w:hint="default"/>
+        <w:sz w:val="20"/>
+      </w:rPr>
+    </w:lvl>
+    <w:lvl w:ilvl="6" w:tentative="1">
+      <w:start w:val="1"/>
+      <w:numFmt w:val="bullet"/>
+      <w:lvlText w:val=""/>
+      <w:lvlJc w:val="left"/>
+      <w:pPr>
+        <w:tabs>
+          <w:tab w:val="num" w:pos="5040"/>
+        </w:tabs>
+        <w:ind w:left="5040" w:hanging="360"/>
+      </w:pPr>
+      <w:rPr>
+        <w:rFonts w:ascii="Wingdings" w:hAnsi="Wingdings" w:hint="default"/>
+        <w:sz w:val="20"/>
+      </w:rPr>
+    </w:lvl>
+    <w:lvl w:ilvl="7" w:tentative="1">
+      <w:start w:val="1"/>
+      <w:numFmt w:val="bullet"/>
+      <w:lvlText w:val=""/>
+      <w:lvlJc w:val="left"/>
+      <w:pPr>
+        <w:tabs>
+          <w:tab w:val="num" w:pos="5760"/>
+        </w:tabs>
+        <w:ind w:left="5760" w:hanging="360"/>
+      </w:pPr>
+      <w:rPr>
+        <w:rFonts w:ascii="Wingdings" w:hAnsi="Wingdings" w:hint="default"/>
+        <w:sz w:val="20"/>
+      </w:rPr>
+    </w:lvl>
+    <w:lvl w:ilvl="8" w:tentative="1">
+      <w:start w:val="1"/>
+      <w:numFmt w:val="bullet"/>
+      <w:lvlText w:val=""/>
+      <w:lvlJc w:val="left"/>
+      <w:pPr>
+        <w:tabs>
+          <w:tab w:val="num" w:pos="6480"/>
+        </w:tabs>
+        <w:ind w:left="6480" w:hanging="360"/>
+      </w:pPr>
+      <w:rPr>
+        <w:rFonts w:ascii="Wingdings" w:hAnsi="Wingdings" w:hint="default"/>
+        <w:sz w:val="20"/>
+      </w:rPr>
+    </w:lvl>
+  </w:abstractNum>
+  <w:abstractNum w:abstractNumId="4" w15:restartNumberingAfterBreak="0">
+    <w:nsid w:val="14802EF4"/>
+    <w:multiLevelType w:val="multilevel"/>
+    <w:tmpl w:val="25BE497E"/>
+    <w:lvl w:ilvl="0">
+      <w:start w:val="1"/>
+      <w:numFmt w:val="bullet"/>
+      <w:lvlText w:val=""/>
+      <w:lvlJc w:val="left"/>
+      <w:pPr>
+        <w:tabs>
+          <w:tab w:val="num" w:pos="720"/>
+        </w:tabs>
+        <w:ind w:left="720" w:hanging="360"/>
+      </w:pPr>
+      <w:rPr>
+        <w:rFonts w:ascii="Symbol" w:hAnsi="Symbol" w:hint="default"/>
+        <w:sz w:val="20"/>
+      </w:rPr>
+    </w:lvl>
+    <w:lvl w:ilvl="1">
+      <w:start w:val="1"/>
+      <w:numFmt w:val="bullet"/>
+      <w:lvlText w:val="o"/>
+      <w:lvlJc w:val="left"/>
+      <w:pPr>
+        <w:tabs>
+          <w:tab w:val="num" w:pos="1440"/>
+        </w:tabs>
+        <w:ind w:left="1440" w:hanging="360"/>
+      </w:pPr>
+      <w:rPr>
+        <w:rFonts w:ascii="Courier New" w:hAnsi="Courier New" w:hint="default"/>
+        <w:sz w:val="20"/>
+      </w:rPr>
+    </w:lvl>
+    <w:lvl w:ilvl="2" w:tentative="1">
+      <w:start w:val="1"/>
+      <w:numFmt w:val="bullet"/>
+      <w:lvlText w:val=""/>
+      <w:lvlJc w:val="left"/>
+      <w:pPr>
+        <w:tabs>
+          <w:tab w:val="num" w:pos="2160"/>
+        </w:tabs>
+        <w:ind w:left="2160" w:hanging="360"/>
+      </w:pPr>
+      <w:rPr>
+        <w:rFonts w:ascii="Wingdings" w:hAnsi="Wingdings" w:hint="default"/>
+        <w:sz w:val="20"/>
+      </w:rPr>
+    </w:lvl>
+    <w:lvl w:ilvl="3" w:tentative="1">
+      <w:start w:val="1"/>
+      <w:numFmt w:val="bullet"/>
+      <w:lvlText w:val=""/>
+      <w:lvlJc w:val="left"/>
+      <w:pPr>
+        <w:tabs>
+          <w:tab w:val="num" w:pos="2880"/>
+        </w:tabs>
+        <w:ind w:left="2880" w:hanging="360"/>
+      </w:pPr>
+      <w:rPr>
+        <w:rFonts w:ascii="Wingdings" w:hAnsi="Wingdings" w:hint="default"/>
+        <w:sz w:val="20"/>
+      </w:rPr>
+    </w:lvl>
+    <w:lvl w:ilvl="4" w:tentative="1">
+      <w:start w:val="1"/>
+      <w:numFmt w:val="bullet"/>
+      <w:lvlText w:val=""/>
+      <w:lvlJc w:val="left"/>
+      <w:pPr>
+        <w:tabs>
+          <w:tab w:val="num" w:pos="3600"/>
+        </w:tabs>
+        <w:ind w:left="3600" w:hanging="360"/>
+      </w:pPr>
+      <w:rPr>
+        <w:rFonts w:ascii="Wingdings" w:hAnsi="Wingdings" w:hint="default"/>
+        <w:sz w:val="20"/>
+      </w:rPr>
+    </w:lvl>
+    <w:lvl w:ilvl="5" w:tentative="1">
+      <w:start w:val="1"/>
+      <w:numFmt w:val="bullet"/>
+      <w:lvlText w:val=""/>
+      <w:lvlJc w:val="left"/>
+      <w:pPr>
+        <w:tabs>
+          <w:tab w:val="num" w:pos="4320"/>
+        </w:tabs>
+        <w:ind w:left="4320" w:hanging="360"/>
+      </w:pPr>
+      <w:rPr>
+        <w:rFonts w:ascii="Wingdings" w:hAnsi="Wingdings" w:hint="default"/>
+        <w:sz w:val="20"/>
+      </w:rPr>
+    </w:lvl>
+    <w:lvl w:ilvl="6" w:tentative="1">
+      <w:start w:val="1"/>
+      <w:numFmt w:val="bullet"/>
+      <w:lvlText w:val=""/>
+      <w:lvlJc w:val="left"/>
+      <w:pPr>
+        <w:tabs>
+          <w:tab w:val="num" w:pos="5040"/>
+        </w:tabs>
+        <w:ind w:left="5040" w:hanging="360"/>
+      </w:pPr>
+      <w:rPr>
+        <w:rFonts w:ascii="Wingdings" w:hAnsi="Wingdings" w:hint="default"/>
+        <w:sz w:val="20"/>
+      </w:rPr>
+    </w:lvl>
+    <w:lvl w:ilvl="7" w:tentative="1">
+      <w:start w:val="1"/>
+      <w:numFmt w:val="bullet"/>
+      <w:lvlText w:val=""/>
+      <w:lvlJc w:val="left"/>
+      <w:pPr>
+        <w:tabs>
+          <w:tab w:val="num" w:pos="5760"/>
+        </w:tabs>
+        <w:ind w:left="5760" w:hanging="360"/>
+      </w:pPr>
+      <w:rPr>
+        <w:rFonts w:ascii="Wingdings" w:hAnsi="Wingdings" w:hint="default"/>
+        <w:sz w:val="20"/>
+      </w:rPr>
+    </w:lvl>
+    <w:lvl w:ilvl="8" w:tentative="1">
+      <w:start w:val="1"/>
+      <w:numFmt w:val="bullet"/>
+      <w:lvlText w:val=""/>
+      <w:lvlJc w:val="left"/>
+      <w:pPr>
+        <w:tabs>
+          <w:tab w:val="num" w:pos="6480"/>
+        </w:tabs>
+        <w:ind w:left="6480" w:hanging="360"/>
+      </w:pPr>
+      <w:rPr>
+        <w:rFonts w:ascii="Wingdings" w:hAnsi="Wingdings" w:hint="default"/>
+        <w:sz w:val="20"/>
+      </w:rPr>
+    </w:lvl>
+  </w:abstractNum>
+  <w:abstractNum w:abstractNumId="5" w15:restartNumberingAfterBreak="0">
     <w:nsid w:val="14B774A9"/>
     <w:multiLevelType w:val="multilevel"/>
     <w:tmpl w:val="A468B562"/>
@@ -5167,7 +7182,7 @@
       </w:rPr>
     </w:lvl>
   </w:abstractNum>
-  <w:abstractNum w:abstractNumId="4" w15:restartNumberingAfterBreak="0">
+  <w:abstractNum w:abstractNumId="6" w15:restartNumberingAfterBreak="0">
     <w:nsid w:val="14E0040C"/>
     <w:multiLevelType w:val="multilevel"/>
     <w:tmpl w:val="FE06C8D0"/>
@@ -5316,7 +7331,7 @@
       </w:rPr>
     </w:lvl>
   </w:abstractNum>
-  <w:abstractNum w:abstractNumId="5" w15:restartNumberingAfterBreak="0">
+  <w:abstractNum w:abstractNumId="7" w15:restartNumberingAfterBreak="0">
     <w:nsid w:val="179A1941"/>
     <w:multiLevelType w:val="multilevel"/>
     <w:tmpl w:val="17D00A7E"/>
@@ -5465,7 +7480,7 @@
       </w:rPr>
     </w:lvl>
   </w:abstractNum>
-  <w:abstractNum w:abstractNumId="6" w15:restartNumberingAfterBreak="0">
+  <w:abstractNum w:abstractNumId="8" w15:restartNumberingAfterBreak="0">
     <w:nsid w:val="1A0207E2"/>
     <w:multiLevelType w:val="multilevel"/>
     <w:tmpl w:val="56D8362C"/>
@@ -5578,7 +7593,7 @@
       </w:pPr>
     </w:lvl>
   </w:abstractNum>
-  <w:abstractNum w:abstractNumId="7" w15:restartNumberingAfterBreak="0">
+  <w:abstractNum w:abstractNumId="9" w15:restartNumberingAfterBreak="0">
     <w:nsid w:val="1DBF5F20"/>
     <w:multiLevelType w:val="multilevel"/>
     <w:tmpl w:val="1A12A100"/>
@@ -5727,7 +7742,7 @@
       </w:rPr>
     </w:lvl>
   </w:abstractNum>
-  <w:abstractNum w:abstractNumId="8" w15:restartNumberingAfterBreak="0">
+  <w:abstractNum w:abstractNumId="10" w15:restartNumberingAfterBreak="0">
     <w:nsid w:val="1E3E57E3"/>
     <w:multiLevelType w:val="multilevel"/>
     <w:tmpl w:val="F2B24F14"/>
@@ -5876,7 +7891,7 @@
       </w:rPr>
     </w:lvl>
   </w:abstractNum>
-  <w:abstractNum w:abstractNumId="9" w15:restartNumberingAfterBreak="0">
+  <w:abstractNum w:abstractNumId="11" w15:restartNumberingAfterBreak="0">
     <w:nsid w:val="1FCD3590"/>
     <w:multiLevelType w:val="multilevel"/>
     <w:tmpl w:val="33D25A94"/>
@@ -6025,7 +8040,7 @@
       </w:rPr>
     </w:lvl>
   </w:abstractNum>
-  <w:abstractNum w:abstractNumId="10" w15:restartNumberingAfterBreak="0">
+  <w:abstractNum w:abstractNumId="12" w15:restartNumberingAfterBreak="0">
     <w:nsid w:val="1FD852BF"/>
     <w:multiLevelType w:val="multilevel"/>
     <w:tmpl w:val="78EC6982"/>
@@ -6174,7 +8189,156 @@
       </w:rPr>
     </w:lvl>
   </w:abstractNum>
-  <w:abstractNum w:abstractNumId="11" w15:restartNumberingAfterBreak="0">
+  <w:abstractNum w:abstractNumId="13" w15:restartNumberingAfterBreak="0">
+    <w:nsid w:val="214F1896"/>
+    <w:multiLevelType w:val="multilevel"/>
+    <w:tmpl w:val="D3F60152"/>
+    <w:lvl w:ilvl="0">
+      <w:start w:val="1"/>
+      <w:numFmt w:val="bullet"/>
+      <w:lvlText w:val=""/>
+      <w:lvlJc w:val="left"/>
+      <w:pPr>
+        <w:tabs>
+          <w:tab w:val="num" w:pos="720"/>
+        </w:tabs>
+        <w:ind w:left="720" w:hanging="360"/>
+      </w:pPr>
+      <w:rPr>
+        <w:rFonts w:ascii="Symbol" w:hAnsi="Symbol" w:hint="default"/>
+        <w:sz w:val="20"/>
+      </w:rPr>
+    </w:lvl>
+    <w:lvl w:ilvl="1" w:tentative="1">
+      <w:start w:val="1"/>
+      <w:numFmt w:val="bullet"/>
+      <w:lvlText w:val="o"/>
+      <w:lvlJc w:val="left"/>
+      <w:pPr>
+        <w:tabs>
+          <w:tab w:val="num" w:pos="1440"/>
+        </w:tabs>
+        <w:ind w:left="1440" w:hanging="360"/>
+      </w:pPr>
+      <w:rPr>
+        <w:rFonts w:ascii="Courier New" w:hAnsi="Courier New" w:hint="default"/>
+        <w:sz w:val="20"/>
+      </w:rPr>
+    </w:lvl>
+    <w:lvl w:ilvl="2" w:tentative="1">
+      <w:start w:val="1"/>
+      <w:numFmt w:val="bullet"/>
+      <w:lvlText w:val=""/>
+      <w:lvlJc w:val="left"/>
+      <w:pPr>
+        <w:tabs>
+          <w:tab w:val="num" w:pos="2160"/>
+        </w:tabs>
+        <w:ind w:left="2160" w:hanging="360"/>
+      </w:pPr>
+      <w:rPr>
+        <w:rFonts w:ascii="Wingdings" w:hAnsi="Wingdings" w:hint="default"/>
+        <w:sz w:val="20"/>
+      </w:rPr>
+    </w:lvl>
+    <w:lvl w:ilvl="3" w:tentative="1">
+      <w:start w:val="1"/>
+      <w:numFmt w:val="bullet"/>
+      <w:lvlText w:val=""/>
+      <w:lvlJc w:val="left"/>
+      <w:pPr>
+        <w:tabs>
+          <w:tab w:val="num" w:pos="2880"/>
+        </w:tabs>
+        <w:ind w:left="2880" w:hanging="360"/>
+      </w:pPr>
+      <w:rPr>
+        <w:rFonts w:ascii="Wingdings" w:hAnsi="Wingdings" w:hint="default"/>
+        <w:sz w:val="20"/>
+      </w:rPr>
+    </w:lvl>
+    <w:lvl w:ilvl="4" w:tentative="1">
+      <w:start w:val="1"/>
+      <w:numFmt w:val="bullet"/>
+      <w:lvlText w:val=""/>
+      <w:lvlJc w:val="left"/>
+      <w:pPr>
+        <w:tabs>
+          <w:tab w:val="num" w:pos="3600"/>
+        </w:tabs>
+        <w:ind w:left="3600" w:hanging="360"/>
+      </w:pPr>
+      <w:rPr>
+        <w:rFonts w:ascii="Wingdings" w:hAnsi="Wingdings" w:hint="default"/>
+        <w:sz w:val="20"/>
+      </w:rPr>
+    </w:lvl>
+    <w:lvl w:ilvl="5" w:tentative="1">
+      <w:start w:val="1"/>
+      <w:numFmt w:val="bullet"/>
+      <w:lvlText w:val=""/>
+      <w:lvlJc w:val="left"/>
+      <w:pPr>
+        <w:tabs>
+          <w:tab w:val="num" w:pos="4320"/>
+        </w:tabs>
+        <w:ind w:left="4320" w:hanging="360"/>
+      </w:pPr>
+      <w:rPr>
+        <w:rFonts w:ascii="Wingdings" w:hAnsi="Wingdings" w:hint="default"/>
+        <w:sz w:val="20"/>
+      </w:rPr>
+    </w:lvl>
+    <w:lvl w:ilvl="6" w:tentative="1">
+      <w:start w:val="1"/>
+      <w:numFmt w:val="bullet"/>
+      <w:lvlText w:val=""/>
+      <w:lvlJc w:val="left"/>
+      <w:pPr>
+        <w:tabs>
+          <w:tab w:val="num" w:pos="5040"/>
+        </w:tabs>
+        <w:ind w:left="5040" w:hanging="360"/>
+      </w:pPr>
+      <w:rPr>
+        <w:rFonts w:ascii="Wingdings" w:hAnsi="Wingdings" w:hint="default"/>
+        <w:sz w:val="20"/>
+      </w:rPr>
+    </w:lvl>
+    <w:lvl w:ilvl="7" w:tentative="1">
+      <w:start w:val="1"/>
+      <w:numFmt w:val="bullet"/>
+      <w:lvlText w:val=""/>
+      <w:lvlJc w:val="left"/>
+      <w:pPr>
+        <w:tabs>
+          <w:tab w:val="num" w:pos="5760"/>
+        </w:tabs>
+        <w:ind w:left="5760" w:hanging="360"/>
+      </w:pPr>
+      <w:rPr>
+        <w:rFonts w:ascii="Wingdings" w:hAnsi="Wingdings" w:hint="default"/>
+        <w:sz w:val="20"/>
+      </w:rPr>
+    </w:lvl>
+    <w:lvl w:ilvl="8" w:tentative="1">
+      <w:start w:val="1"/>
+      <w:numFmt w:val="bullet"/>
+      <w:lvlText w:val=""/>
+      <w:lvlJc w:val="left"/>
+      <w:pPr>
+        <w:tabs>
+          <w:tab w:val="num" w:pos="6480"/>
+        </w:tabs>
+        <w:ind w:left="6480" w:hanging="360"/>
+      </w:pPr>
+      <w:rPr>
+        <w:rFonts w:ascii="Wingdings" w:hAnsi="Wingdings" w:hint="default"/>
+        <w:sz w:val="20"/>
+      </w:rPr>
+    </w:lvl>
+  </w:abstractNum>
+  <w:abstractNum w:abstractNumId="14" w15:restartNumberingAfterBreak="0">
     <w:nsid w:val="240E63BB"/>
     <w:multiLevelType w:val="multilevel"/>
     <w:tmpl w:val="9EC8E662"/>
@@ -6319,7 +8483,7 @@
       </w:rPr>
     </w:lvl>
   </w:abstractNum>
-  <w:abstractNum w:abstractNumId="12" w15:restartNumberingAfterBreak="0">
+  <w:abstractNum w:abstractNumId="15" w15:restartNumberingAfterBreak="0">
     <w:nsid w:val="24B86808"/>
     <w:multiLevelType w:val="multilevel"/>
     <w:tmpl w:val="9B4A0796"/>
@@ -6468,7 +8632,7 @@
       </w:rPr>
     </w:lvl>
   </w:abstractNum>
-  <w:abstractNum w:abstractNumId="13" w15:restartNumberingAfterBreak="0">
+  <w:abstractNum w:abstractNumId="16" w15:restartNumberingAfterBreak="0">
     <w:nsid w:val="251F49EA"/>
     <w:multiLevelType w:val="multilevel"/>
     <w:tmpl w:val="CAE8C108"/>
@@ -6617,7 +8781,156 @@
       </w:rPr>
     </w:lvl>
   </w:abstractNum>
-  <w:abstractNum w:abstractNumId="14" w15:restartNumberingAfterBreak="0">
+  <w:abstractNum w:abstractNumId="17" w15:restartNumberingAfterBreak="0">
+    <w:nsid w:val="258F118F"/>
+    <w:multiLevelType w:val="multilevel"/>
+    <w:tmpl w:val="96862330"/>
+    <w:lvl w:ilvl="0">
+      <w:start w:val="1"/>
+      <w:numFmt w:val="bullet"/>
+      <w:lvlText w:val=""/>
+      <w:lvlJc w:val="left"/>
+      <w:pPr>
+        <w:tabs>
+          <w:tab w:val="num" w:pos="720"/>
+        </w:tabs>
+        <w:ind w:left="720" w:hanging="360"/>
+      </w:pPr>
+      <w:rPr>
+        <w:rFonts w:ascii="Symbol" w:hAnsi="Symbol" w:hint="default"/>
+        <w:sz w:val="20"/>
+      </w:rPr>
+    </w:lvl>
+    <w:lvl w:ilvl="1" w:tentative="1">
+      <w:start w:val="1"/>
+      <w:numFmt w:val="bullet"/>
+      <w:lvlText w:val="o"/>
+      <w:lvlJc w:val="left"/>
+      <w:pPr>
+        <w:tabs>
+          <w:tab w:val="num" w:pos="1440"/>
+        </w:tabs>
+        <w:ind w:left="1440" w:hanging="360"/>
+      </w:pPr>
+      <w:rPr>
+        <w:rFonts w:ascii="Courier New" w:hAnsi="Courier New" w:hint="default"/>
+        <w:sz w:val="20"/>
+      </w:rPr>
+    </w:lvl>
+    <w:lvl w:ilvl="2" w:tentative="1">
+      <w:start w:val="1"/>
+      <w:numFmt w:val="bullet"/>
+      <w:lvlText w:val=""/>
+      <w:lvlJc w:val="left"/>
+      <w:pPr>
+        <w:tabs>
+          <w:tab w:val="num" w:pos="2160"/>
+        </w:tabs>
+        <w:ind w:left="2160" w:hanging="360"/>
+      </w:pPr>
+      <w:rPr>
+        <w:rFonts w:ascii="Wingdings" w:hAnsi="Wingdings" w:hint="default"/>
+        <w:sz w:val="20"/>
+      </w:rPr>
+    </w:lvl>
+    <w:lvl w:ilvl="3" w:tentative="1">
+      <w:start w:val="1"/>
+      <w:numFmt w:val="bullet"/>
+      <w:lvlText w:val=""/>
+      <w:lvlJc w:val="left"/>
+      <w:pPr>
+        <w:tabs>
+          <w:tab w:val="num" w:pos="2880"/>
+        </w:tabs>
+        <w:ind w:left="2880" w:hanging="360"/>
+      </w:pPr>
+      <w:rPr>
+        <w:rFonts w:ascii="Wingdings" w:hAnsi="Wingdings" w:hint="default"/>
+        <w:sz w:val="20"/>
+      </w:rPr>
+    </w:lvl>
+    <w:lvl w:ilvl="4" w:tentative="1">
+      <w:start w:val="1"/>
+      <w:numFmt w:val="bullet"/>
+      <w:lvlText w:val=""/>
+      <w:lvlJc w:val="left"/>
+      <w:pPr>
+        <w:tabs>
+          <w:tab w:val="num" w:pos="3600"/>
+        </w:tabs>
+        <w:ind w:left="3600" w:hanging="360"/>
+      </w:pPr>
+      <w:rPr>
+        <w:rFonts w:ascii="Wingdings" w:hAnsi="Wingdings" w:hint="default"/>
+        <w:sz w:val="20"/>
+      </w:rPr>
+    </w:lvl>
+    <w:lvl w:ilvl="5" w:tentative="1">
+      <w:start w:val="1"/>
+      <w:numFmt w:val="bullet"/>
+      <w:lvlText w:val=""/>
+      <w:lvlJc w:val="left"/>
+      <w:pPr>
+        <w:tabs>
+          <w:tab w:val="num" w:pos="4320"/>
+        </w:tabs>
+        <w:ind w:left="4320" w:hanging="360"/>
+      </w:pPr>
+      <w:rPr>
+        <w:rFonts w:ascii="Wingdings" w:hAnsi="Wingdings" w:hint="default"/>
+        <w:sz w:val="20"/>
+      </w:rPr>
+    </w:lvl>
+    <w:lvl w:ilvl="6" w:tentative="1">
+      <w:start w:val="1"/>
+      <w:numFmt w:val="bullet"/>
+      <w:lvlText w:val=""/>
+      <w:lvlJc w:val="left"/>
+      <w:pPr>
+        <w:tabs>
+          <w:tab w:val="num" w:pos="5040"/>
+        </w:tabs>
+        <w:ind w:left="5040" w:hanging="360"/>
+      </w:pPr>
+      <w:rPr>
+        <w:rFonts w:ascii="Wingdings" w:hAnsi="Wingdings" w:hint="default"/>
+        <w:sz w:val="20"/>
+      </w:rPr>
+    </w:lvl>
+    <w:lvl w:ilvl="7" w:tentative="1">
+      <w:start w:val="1"/>
+      <w:numFmt w:val="bullet"/>
+      <w:lvlText w:val=""/>
+      <w:lvlJc w:val="left"/>
+      <w:pPr>
+        <w:tabs>
+          <w:tab w:val="num" w:pos="5760"/>
+        </w:tabs>
+        <w:ind w:left="5760" w:hanging="360"/>
+      </w:pPr>
+      <w:rPr>
+        <w:rFonts w:ascii="Wingdings" w:hAnsi="Wingdings" w:hint="default"/>
+        <w:sz w:val="20"/>
+      </w:rPr>
+    </w:lvl>
+    <w:lvl w:ilvl="8" w:tentative="1">
+      <w:start w:val="1"/>
+      <w:numFmt w:val="bullet"/>
+      <w:lvlText w:val=""/>
+      <w:lvlJc w:val="left"/>
+      <w:pPr>
+        <w:tabs>
+          <w:tab w:val="num" w:pos="6480"/>
+        </w:tabs>
+        <w:ind w:left="6480" w:hanging="360"/>
+      </w:pPr>
+      <w:rPr>
+        <w:rFonts w:ascii="Wingdings" w:hAnsi="Wingdings" w:hint="default"/>
+        <w:sz w:val="20"/>
+      </w:rPr>
+    </w:lvl>
+  </w:abstractNum>
+  <w:abstractNum w:abstractNumId="18" w15:restartNumberingAfterBreak="0">
     <w:nsid w:val="26C20CD3"/>
     <w:multiLevelType w:val="multilevel"/>
     <w:tmpl w:val="62A6099E"/>
@@ -6766,7 +9079,7 @@
       </w:rPr>
     </w:lvl>
   </w:abstractNum>
-  <w:abstractNum w:abstractNumId="15" w15:restartNumberingAfterBreak="0">
+  <w:abstractNum w:abstractNumId="19" w15:restartNumberingAfterBreak="0">
     <w:nsid w:val="27495347"/>
     <w:multiLevelType w:val="multilevel"/>
     <w:tmpl w:val="37DA0990"/>
@@ -6915,7 +9228,7 @@
       </w:rPr>
     </w:lvl>
   </w:abstractNum>
-  <w:abstractNum w:abstractNumId="16" w15:restartNumberingAfterBreak="0">
+  <w:abstractNum w:abstractNumId="20" w15:restartNumberingAfterBreak="0">
     <w:nsid w:val="2B3B3F96"/>
     <w:multiLevelType w:val="multilevel"/>
     <w:tmpl w:val="2F00979A"/>
@@ -7064,7 +9377,7 @@
       </w:rPr>
     </w:lvl>
   </w:abstractNum>
-  <w:abstractNum w:abstractNumId="17" w15:restartNumberingAfterBreak="0">
+  <w:abstractNum w:abstractNumId="21" w15:restartNumberingAfterBreak="0">
     <w:nsid w:val="2C766FCF"/>
     <w:multiLevelType w:val="multilevel"/>
     <w:tmpl w:val="66E4BDA0"/>
@@ -7213,7 +9526,7 @@
       </w:rPr>
     </w:lvl>
   </w:abstractNum>
-  <w:abstractNum w:abstractNumId="18" w15:restartNumberingAfterBreak="0">
+  <w:abstractNum w:abstractNumId="22" w15:restartNumberingAfterBreak="0">
     <w:nsid w:val="2D571952"/>
     <w:multiLevelType w:val="multilevel"/>
     <w:tmpl w:val="3DA66B84"/>
@@ -7362,7 +9675,7 @@
       </w:rPr>
     </w:lvl>
   </w:abstractNum>
-  <w:abstractNum w:abstractNumId="19" w15:restartNumberingAfterBreak="0">
+  <w:abstractNum w:abstractNumId="23" w15:restartNumberingAfterBreak="0">
     <w:nsid w:val="2F5E532E"/>
     <w:multiLevelType w:val="multilevel"/>
     <w:tmpl w:val="96B63F36"/>
@@ -7511,7 +9824,7 @@
       </w:rPr>
     </w:lvl>
   </w:abstractNum>
-  <w:abstractNum w:abstractNumId="20" w15:restartNumberingAfterBreak="0">
+  <w:abstractNum w:abstractNumId="24" w15:restartNumberingAfterBreak="0">
     <w:nsid w:val="31A003AF"/>
     <w:multiLevelType w:val="multilevel"/>
     <w:tmpl w:val="04F200F8"/>
@@ -7660,7 +9973,7 @@
       </w:rPr>
     </w:lvl>
   </w:abstractNum>
-  <w:abstractNum w:abstractNumId="21" w15:restartNumberingAfterBreak="0">
+  <w:abstractNum w:abstractNumId="25" w15:restartNumberingAfterBreak="0">
     <w:nsid w:val="31F36C73"/>
     <w:multiLevelType w:val="multilevel"/>
     <w:tmpl w:val="73EA5A92"/>
@@ -7809,7 +10122,7 @@
       </w:rPr>
     </w:lvl>
   </w:abstractNum>
-  <w:abstractNum w:abstractNumId="22" w15:restartNumberingAfterBreak="0">
+  <w:abstractNum w:abstractNumId="26" w15:restartNumberingAfterBreak="0">
     <w:nsid w:val="3A417D5F"/>
     <w:multiLevelType w:val="multilevel"/>
     <w:tmpl w:val="090C5218"/>
@@ -7958,7 +10271,7 @@
       </w:rPr>
     </w:lvl>
   </w:abstractNum>
-  <w:abstractNum w:abstractNumId="23" w15:restartNumberingAfterBreak="0">
+  <w:abstractNum w:abstractNumId="27" w15:restartNumberingAfterBreak="0">
     <w:nsid w:val="49A50C0A"/>
     <w:multiLevelType w:val="multilevel"/>
     <w:tmpl w:val="38BAAE28"/>
@@ -8107,7 +10420,7 @@
       </w:rPr>
     </w:lvl>
   </w:abstractNum>
-  <w:abstractNum w:abstractNumId="24" w15:restartNumberingAfterBreak="0">
+  <w:abstractNum w:abstractNumId="28" w15:restartNumberingAfterBreak="0">
     <w:nsid w:val="4E7A589A"/>
     <w:multiLevelType w:val="multilevel"/>
     <w:tmpl w:val="A0D82AD2"/>
@@ -8256,7 +10569,7 @@
       </w:rPr>
     </w:lvl>
   </w:abstractNum>
-  <w:abstractNum w:abstractNumId="25" w15:restartNumberingAfterBreak="0">
+  <w:abstractNum w:abstractNumId="29" w15:restartNumberingAfterBreak="0">
     <w:nsid w:val="52530106"/>
     <w:multiLevelType w:val="multilevel"/>
     <w:tmpl w:val="DF9E4E90"/>
@@ -8405,7 +10718,7 @@
       </w:rPr>
     </w:lvl>
   </w:abstractNum>
-  <w:abstractNum w:abstractNumId="26" w15:restartNumberingAfterBreak="0">
+  <w:abstractNum w:abstractNumId="30" w15:restartNumberingAfterBreak="0">
     <w:nsid w:val="579B22F6"/>
     <w:multiLevelType w:val="multilevel"/>
     <w:tmpl w:val="E654B84C"/>
@@ -8554,7 +10867,7 @@
       </w:rPr>
     </w:lvl>
   </w:abstractNum>
-  <w:abstractNum w:abstractNumId="27" w15:restartNumberingAfterBreak="0">
+  <w:abstractNum w:abstractNumId="31" w15:restartNumberingAfterBreak="0">
     <w:nsid w:val="58021DC2"/>
     <w:multiLevelType w:val="multilevel"/>
     <w:tmpl w:val="82104120"/>
@@ -8703,7 +11016,156 @@
       </w:rPr>
     </w:lvl>
   </w:abstractNum>
-  <w:abstractNum w:abstractNumId="28" w15:restartNumberingAfterBreak="0">
+  <w:abstractNum w:abstractNumId="32" w15:restartNumberingAfterBreak="0">
+    <w:nsid w:val="5A87367F"/>
+    <w:multiLevelType w:val="multilevel"/>
+    <w:tmpl w:val="C2CCA71C"/>
+    <w:lvl w:ilvl="0">
+      <w:start w:val="1"/>
+      <w:numFmt w:val="bullet"/>
+      <w:lvlText w:val=""/>
+      <w:lvlJc w:val="left"/>
+      <w:pPr>
+        <w:tabs>
+          <w:tab w:val="num" w:pos="720"/>
+        </w:tabs>
+        <w:ind w:left="720" w:hanging="360"/>
+      </w:pPr>
+      <w:rPr>
+        <w:rFonts w:ascii="Symbol" w:hAnsi="Symbol" w:hint="default"/>
+        <w:sz w:val="20"/>
+      </w:rPr>
+    </w:lvl>
+    <w:lvl w:ilvl="1">
+      <w:start w:val="1"/>
+      <w:numFmt w:val="bullet"/>
+      <w:lvlText w:val="o"/>
+      <w:lvlJc w:val="left"/>
+      <w:pPr>
+        <w:tabs>
+          <w:tab w:val="num" w:pos="1440"/>
+        </w:tabs>
+        <w:ind w:left="1440" w:hanging="360"/>
+      </w:pPr>
+      <w:rPr>
+        <w:rFonts w:ascii="Courier New" w:hAnsi="Courier New" w:hint="default"/>
+        <w:sz w:val="20"/>
+      </w:rPr>
+    </w:lvl>
+    <w:lvl w:ilvl="2" w:tentative="1">
+      <w:start w:val="1"/>
+      <w:numFmt w:val="bullet"/>
+      <w:lvlText w:val=""/>
+      <w:lvlJc w:val="left"/>
+      <w:pPr>
+        <w:tabs>
+          <w:tab w:val="num" w:pos="2160"/>
+        </w:tabs>
+        <w:ind w:left="2160" w:hanging="360"/>
+      </w:pPr>
+      <w:rPr>
+        <w:rFonts w:ascii="Wingdings" w:hAnsi="Wingdings" w:hint="default"/>
+        <w:sz w:val="20"/>
+      </w:rPr>
+    </w:lvl>
+    <w:lvl w:ilvl="3" w:tentative="1">
+      <w:start w:val="1"/>
+      <w:numFmt w:val="bullet"/>
+      <w:lvlText w:val=""/>
+      <w:lvlJc w:val="left"/>
+      <w:pPr>
+        <w:tabs>
+          <w:tab w:val="num" w:pos="2880"/>
+        </w:tabs>
+        <w:ind w:left="2880" w:hanging="360"/>
+      </w:pPr>
+      <w:rPr>
+        <w:rFonts w:ascii="Wingdings" w:hAnsi="Wingdings" w:hint="default"/>
+        <w:sz w:val="20"/>
+      </w:rPr>
+    </w:lvl>
+    <w:lvl w:ilvl="4" w:tentative="1">
+      <w:start w:val="1"/>
+      <w:numFmt w:val="bullet"/>
+      <w:lvlText w:val=""/>
+      <w:lvlJc w:val="left"/>
+      <w:pPr>
+        <w:tabs>
+          <w:tab w:val="num" w:pos="3600"/>
+        </w:tabs>
+        <w:ind w:left="3600" w:hanging="360"/>
+      </w:pPr>
+      <w:rPr>
+        <w:rFonts w:ascii="Wingdings" w:hAnsi="Wingdings" w:hint="default"/>
+        <w:sz w:val="20"/>
+      </w:rPr>
+    </w:lvl>
+    <w:lvl w:ilvl="5" w:tentative="1">
+      <w:start w:val="1"/>
+      <w:numFmt w:val="bullet"/>
+      <w:lvlText w:val=""/>
+      <w:lvlJc w:val="left"/>
+      <w:pPr>
+        <w:tabs>
+          <w:tab w:val="num" w:pos="4320"/>
+        </w:tabs>
+        <w:ind w:left="4320" w:hanging="360"/>
+      </w:pPr>
+      <w:rPr>
+        <w:rFonts w:ascii="Wingdings" w:hAnsi="Wingdings" w:hint="default"/>
+        <w:sz w:val="20"/>
+      </w:rPr>
+    </w:lvl>
+    <w:lvl w:ilvl="6" w:tentative="1">
+      <w:start w:val="1"/>
+      <w:numFmt w:val="bullet"/>
+      <w:lvlText w:val=""/>
+      <w:lvlJc w:val="left"/>
+      <w:pPr>
+        <w:tabs>
+          <w:tab w:val="num" w:pos="5040"/>
+        </w:tabs>
+        <w:ind w:left="5040" w:hanging="360"/>
+      </w:pPr>
+      <w:rPr>
+        <w:rFonts w:ascii="Wingdings" w:hAnsi="Wingdings" w:hint="default"/>
+        <w:sz w:val="20"/>
+      </w:rPr>
+    </w:lvl>
+    <w:lvl w:ilvl="7" w:tentative="1">
+      <w:start w:val="1"/>
+      <w:numFmt w:val="bullet"/>
+      <w:lvlText w:val=""/>
+      <w:lvlJc w:val="left"/>
+      <w:pPr>
+        <w:tabs>
+          <w:tab w:val="num" w:pos="5760"/>
+        </w:tabs>
+        <w:ind w:left="5760" w:hanging="360"/>
+      </w:pPr>
+      <w:rPr>
+        <w:rFonts w:ascii="Wingdings" w:hAnsi="Wingdings" w:hint="default"/>
+        <w:sz w:val="20"/>
+      </w:rPr>
+    </w:lvl>
+    <w:lvl w:ilvl="8" w:tentative="1">
+      <w:start w:val="1"/>
+      <w:numFmt w:val="bullet"/>
+      <w:lvlText w:val=""/>
+      <w:lvlJc w:val="left"/>
+      <w:pPr>
+        <w:tabs>
+          <w:tab w:val="num" w:pos="6480"/>
+        </w:tabs>
+        <w:ind w:left="6480" w:hanging="360"/>
+      </w:pPr>
+      <w:rPr>
+        <w:rFonts w:ascii="Wingdings" w:hAnsi="Wingdings" w:hint="default"/>
+        <w:sz w:val="20"/>
+      </w:rPr>
+    </w:lvl>
+  </w:abstractNum>
+  <w:abstractNum w:abstractNumId="33" w15:restartNumberingAfterBreak="0">
     <w:nsid w:val="5ECE3F49"/>
     <w:multiLevelType w:val="multilevel"/>
     <w:tmpl w:val="1958B164"/>
@@ -8852,7 +11314,7 @@
       </w:rPr>
     </w:lvl>
   </w:abstractNum>
-  <w:abstractNum w:abstractNumId="29" w15:restartNumberingAfterBreak="0">
+  <w:abstractNum w:abstractNumId="34" w15:restartNumberingAfterBreak="0">
     <w:nsid w:val="60991102"/>
     <w:multiLevelType w:val="multilevel"/>
     <w:tmpl w:val="713EC634"/>
@@ -9001,7 +11463,7 @@
       </w:rPr>
     </w:lvl>
   </w:abstractNum>
-  <w:abstractNum w:abstractNumId="30" w15:restartNumberingAfterBreak="0">
+  <w:abstractNum w:abstractNumId="35" w15:restartNumberingAfterBreak="0">
     <w:nsid w:val="62302534"/>
     <w:multiLevelType w:val="multilevel"/>
     <w:tmpl w:val="F75AE8F0"/>
@@ -9150,7 +11612,7 @@
       </w:rPr>
     </w:lvl>
   </w:abstractNum>
-  <w:abstractNum w:abstractNumId="31" w15:restartNumberingAfterBreak="0">
+  <w:abstractNum w:abstractNumId="36" w15:restartNumberingAfterBreak="0">
     <w:nsid w:val="6CC173AC"/>
     <w:multiLevelType w:val="multilevel"/>
     <w:tmpl w:val="D67265CC"/>
@@ -9299,7 +11761,156 @@
       </w:rPr>
     </w:lvl>
   </w:abstractNum>
-  <w:abstractNum w:abstractNumId="32" w15:restartNumberingAfterBreak="0">
+  <w:abstractNum w:abstractNumId="37" w15:restartNumberingAfterBreak="0">
+    <w:nsid w:val="6D814052"/>
+    <w:multiLevelType w:val="multilevel"/>
+    <w:tmpl w:val="8E04B6BC"/>
+    <w:lvl w:ilvl="0">
+      <w:start w:val="1"/>
+      <w:numFmt w:val="bullet"/>
+      <w:lvlText w:val=""/>
+      <w:lvlJc w:val="left"/>
+      <w:pPr>
+        <w:tabs>
+          <w:tab w:val="num" w:pos="720"/>
+        </w:tabs>
+        <w:ind w:left="720" w:hanging="360"/>
+      </w:pPr>
+      <w:rPr>
+        <w:rFonts w:ascii="Symbol" w:hAnsi="Symbol" w:hint="default"/>
+        <w:sz w:val="20"/>
+      </w:rPr>
+    </w:lvl>
+    <w:lvl w:ilvl="1">
+      <w:start w:val="1"/>
+      <w:numFmt w:val="bullet"/>
+      <w:lvlText w:val="o"/>
+      <w:lvlJc w:val="left"/>
+      <w:pPr>
+        <w:tabs>
+          <w:tab w:val="num" w:pos="1440"/>
+        </w:tabs>
+        <w:ind w:left="1440" w:hanging="360"/>
+      </w:pPr>
+      <w:rPr>
+        <w:rFonts w:ascii="Courier New" w:hAnsi="Courier New" w:hint="default"/>
+        <w:sz w:val="20"/>
+      </w:rPr>
+    </w:lvl>
+    <w:lvl w:ilvl="2">
+      <w:start w:val="1"/>
+      <w:numFmt w:val="bullet"/>
+      <w:lvlText w:val=""/>
+      <w:lvlJc w:val="left"/>
+      <w:pPr>
+        <w:tabs>
+          <w:tab w:val="num" w:pos="2160"/>
+        </w:tabs>
+        <w:ind w:left="2160" w:hanging="360"/>
+      </w:pPr>
+      <w:rPr>
+        <w:rFonts w:ascii="Wingdings" w:hAnsi="Wingdings" w:hint="default"/>
+        <w:sz w:val="20"/>
+      </w:rPr>
+    </w:lvl>
+    <w:lvl w:ilvl="3" w:tentative="1">
+      <w:start w:val="1"/>
+      <w:numFmt w:val="bullet"/>
+      <w:lvlText w:val=""/>
+      <w:lvlJc w:val="left"/>
+      <w:pPr>
+        <w:tabs>
+          <w:tab w:val="num" w:pos="2880"/>
+        </w:tabs>
+        <w:ind w:left="2880" w:hanging="360"/>
+      </w:pPr>
+      <w:rPr>
+        <w:rFonts w:ascii="Wingdings" w:hAnsi="Wingdings" w:hint="default"/>
+        <w:sz w:val="20"/>
+      </w:rPr>
+    </w:lvl>
+    <w:lvl w:ilvl="4" w:tentative="1">
+      <w:start w:val="1"/>
+      <w:numFmt w:val="bullet"/>
+      <w:lvlText w:val=""/>
+      <w:lvlJc w:val="left"/>
+      <w:pPr>
+        <w:tabs>
+          <w:tab w:val="num" w:pos="3600"/>
+        </w:tabs>
+        <w:ind w:left="3600" w:hanging="360"/>
+      </w:pPr>
+      <w:rPr>
+        <w:rFonts w:ascii="Wingdings" w:hAnsi="Wingdings" w:hint="default"/>
+        <w:sz w:val="20"/>
+      </w:rPr>
+    </w:lvl>
+    <w:lvl w:ilvl="5" w:tentative="1">
+      <w:start w:val="1"/>
+      <w:numFmt w:val="bullet"/>
+      <w:lvlText w:val=""/>
+      <w:lvlJc w:val="left"/>
+      <w:pPr>
+        <w:tabs>
+          <w:tab w:val="num" w:pos="4320"/>
+        </w:tabs>
+        <w:ind w:left="4320" w:hanging="360"/>
+      </w:pPr>
+      <w:rPr>
+        <w:rFonts w:ascii="Wingdings" w:hAnsi="Wingdings" w:hint="default"/>
+        <w:sz w:val="20"/>
+      </w:rPr>
+    </w:lvl>
+    <w:lvl w:ilvl="6" w:tentative="1">
+      <w:start w:val="1"/>
+      <w:numFmt w:val="bullet"/>
+      <w:lvlText w:val=""/>
+      <w:lvlJc w:val="left"/>
+      <w:pPr>
+        <w:tabs>
+          <w:tab w:val="num" w:pos="5040"/>
+        </w:tabs>
+        <w:ind w:left="5040" w:hanging="360"/>
+      </w:pPr>
+      <w:rPr>
+        <w:rFonts w:ascii="Wingdings" w:hAnsi="Wingdings" w:hint="default"/>
+        <w:sz w:val="20"/>
+      </w:rPr>
+    </w:lvl>
+    <w:lvl w:ilvl="7" w:tentative="1">
+      <w:start w:val="1"/>
+      <w:numFmt w:val="bullet"/>
+      <w:lvlText w:val=""/>
+      <w:lvlJc w:val="left"/>
+      <w:pPr>
+        <w:tabs>
+          <w:tab w:val="num" w:pos="5760"/>
+        </w:tabs>
+        <w:ind w:left="5760" w:hanging="360"/>
+      </w:pPr>
+      <w:rPr>
+        <w:rFonts w:ascii="Wingdings" w:hAnsi="Wingdings" w:hint="default"/>
+        <w:sz w:val="20"/>
+      </w:rPr>
+    </w:lvl>
+    <w:lvl w:ilvl="8" w:tentative="1">
+      <w:start w:val="1"/>
+      <w:numFmt w:val="bullet"/>
+      <w:lvlText w:val=""/>
+      <w:lvlJc w:val="left"/>
+      <w:pPr>
+        <w:tabs>
+          <w:tab w:val="num" w:pos="6480"/>
+        </w:tabs>
+        <w:ind w:left="6480" w:hanging="360"/>
+      </w:pPr>
+      <w:rPr>
+        <w:rFonts w:ascii="Wingdings" w:hAnsi="Wingdings" w:hint="default"/>
+        <w:sz w:val="20"/>
+      </w:rPr>
+    </w:lvl>
+  </w:abstractNum>
+  <w:abstractNum w:abstractNumId="38" w15:restartNumberingAfterBreak="0">
     <w:nsid w:val="6D8C54B0"/>
     <w:multiLevelType w:val="multilevel"/>
     <w:tmpl w:val="37C4E3B2"/>
@@ -9448,7 +12059,7 @@
       </w:rPr>
     </w:lvl>
   </w:abstractNum>
-  <w:abstractNum w:abstractNumId="33" w15:restartNumberingAfterBreak="0">
+  <w:abstractNum w:abstractNumId="39" w15:restartNumberingAfterBreak="0">
     <w:nsid w:val="6E092798"/>
     <w:multiLevelType w:val="multilevel"/>
     <w:tmpl w:val="695ED14A"/>
@@ -9597,7 +12208,305 @@
       </w:rPr>
     </w:lvl>
   </w:abstractNum>
-  <w:abstractNum w:abstractNumId="34" w15:restartNumberingAfterBreak="0">
+  <w:abstractNum w:abstractNumId="40" w15:restartNumberingAfterBreak="0">
+    <w:nsid w:val="703E5A5F"/>
+    <w:multiLevelType w:val="multilevel"/>
+    <w:tmpl w:val="77322966"/>
+    <w:lvl w:ilvl="0">
+      <w:start w:val="1"/>
+      <w:numFmt w:val="bullet"/>
+      <w:lvlText w:val=""/>
+      <w:lvlJc w:val="left"/>
+      <w:pPr>
+        <w:tabs>
+          <w:tab w:val="num" w:pos="720"/>
+        </w:tabs>
+        <w:ind w:left="720" w:hanging="360"/>
+      </w:pPr>
+      <w:rPr>
+        <w:rFonts w:ascii="Symbol" w:hAnsi="Symbol" w:hint="default"/>
+        <w:sz w:val="20"/>
+      </w:rPr>
+    </w:lvl>
+    <w:lvl w:ilvl="1" w:tentative="1">
+      <w:start w:val="1"/>
+      <w:numFmt w:val="bullet"/>
+      <w:lvlText w:val="o"/>
+      <w:lvlJc w:val="left"/>
+      <w:pPr>
+        <w:tabs>
+          <w:tab w:val="num" w:pos="1440"/>
+        </w:tabs>
+        <w:ind w:left="1440" w:hanging="360"/>
+      </w:pPr>
+      <w:rPr>
+        <w:rFonts w:ascii="Courier New" w:hAnsi="Courier New" w:hint="default"/>
+        <w:sz w:val="20"/>
+      </w:rPr>
+    </w:lvl>
+    <w:lvl w:ilvl="2" w:tentative="1">
+      <w:start w:val="1"/>
+      <w:numFmt w:val="bullet"/>
+      <w:lvlText w:val=""/>
+      <w:lvlJc w:val="left"/>
+      <w:pPr>
+        <w:tabs>
+          <w:tab w:val="num" w:pos="2160"/>
+        </w:tabs>
+        <w:ind w:left="2160" w:hanging="360"/>
+      </w:pPr>
+      <w:rPr>
+        <w:rFonts w:ascii="Wingdings" w:hAnsi="Wingdings" w:hint="default"/>
+        <w:sz w:val="20"/>
+      </w:rPr>
+    </w:lvl>
+    <w:lvl w:ilvl="3" w:tentative="1">
+      <w:start w:val="1"/>
+      <w:numFmt w:val="bullet"/>
+      <w:lvlText w:val=""/>
+      <w:lvlJc w:val="left"/>
+      <w:pPr>
+        <w:tabs>
+          <w:tab w:val="num" w:pos="2880"/>
+        </w:tabs>
+        <w:ind w:left="2880" w:hanging="360"/>
+      </w:pPr>
+      <w:rPr>
+        <w:rFonts w:ascii="Wingdings" w:hAnsi="Wingdings" w:hint="default"/>
+        <w:sz w:val="20"/>
+      </w:rPr>
+    </w:lvl>
+    <w:lvl w:ilvl="4" w:tentative="1">
+      <w:start w:val="1"/>
+      <w:numFmt w:val="bullet"/>
+      <w:lvlText w:val=""/>
+      <w:lvlJc w:val="left"/>
+      <w:pPr>
+        <w:tabs>
+          <w:tab w:val="num" w:pos="3600"/>
+        </w:tabs>
+        <w:ind w:left="3600" w:hanging="360"/>
+      </w:pPr>
+      <w:rPr>
+        <w:rFonts w:ascii="Wingdings" w:hAnsi="Wingdings" w:hint="default"/>
+        <w:sz w:val="20"/>
+      </w:rPr>
+    </w:lvl>
+    <w:lvl w:ilvl="5" w:tentative="1">
+      <w:start w:val="1"/>
+      <w:numFmt w:val="bullet"/>
+      <w:lvlText w:val=""/>
+      <w:lvlJc w:val="left"/>
+      <w:pPr>
+        <w:tabs>
+          <w:tab w:val="num" w:pos="4320"/>
+        </w:tabs>
+        <w:ind w:left="4320" w:hanging="360"/>
+      </w:pPr>
+      <w:rPr>
+        <w:rFonts w:ascii="Wingdings" w:hAnsi="Wingdings" w:hint="default"/>
+        <w:sz w:val="20"/>
+      </w:rPr>
+    </w:lvl>
+    <w:lvl w:ilvl="6" w:tentative="1">
+      <w:start w:val="1"/>
+      <w:numFmt w:val="bullet"/>
+      <w:lvlText w:val=""/>
+      <w:lvlJc w:val="left"/>
+      <w:pPr>
+        <w:tabs>
+          <w:tab w:val="num" w:pos="5040"/>
+        </w:tabs>
+        <w:ind w:left="5040" w:hanging="360"/>
+      </w:pPr>
+      <w:rPr>
+        <w:rFonts w:ascii="Wingdings" w:hAnsi="Wingdings" w:hint="default"/>
+        <w:sz w:val="20"/>
+      </w:rPr>
+    </w:lvl>
+    <w:lvl w:ilvl="7" w:tentative="1">
+      <w:start w:val="1"/>
+      <w:numFmt w:val="bullet"/>
+      <w:lvlText w:val=""/>
+      <w:lvlJc w:val="left"/>
+      <w:pPr>
+        <w:tabs>
+          <w:tab w:val="num" w:pos="5760"/>
+        </w:tabs>
+        <w:ind w:left="5760" w:hanging="360"/>
+      </w:pPr>
+      <w:rPr>
+        <w:rFonts w:ascii="Wingdings" w:hAnsi="Wingdings" w:hint="default"/>
+        <w:sz w:val="20"/>
+      </w:rPr>
+    </w:lvl>
+    <w:lvl w:ilvl="8" w:tentative="1">
+      <w:start w:val="1"/>
+      <w:numFmt w:val="bullet"/>
+      <w:lvlText w:val=""/>
+      <w:lvlJc w:val="left"/>
+      <w:pPr>
+        <w:tabs>
+          <w:tab w:val="num" w:pos="6480"/>
+        </w:tabs>
+        <w:ind w:left="6480" w:hanging="360"/>
+      </w:pPr>
+      <w:rPr>
+        <w:rFonts w:ascii="Wingdings" w:hAnsi="Wingdings" w:hint="default"/>
+        <w:sz w:val="20"/>
+      </w:rPr>
+    </w:lvl>
+  </w:abstractNum>
+  <w:abstractNum w:abstractNumId="41" w15:restartNumberingAfterBreak="0">
+    <w:nsid w:val="71870CE9"/>
+    <w:multiLevelType w:val="multilevel"/>
+    <w:tmpl w:val="0CFA3350"/>
+    <w:lvl w:ilvl="0">
+      <w:start w:val="1"/>
+      <w:numFmt w:val="bullet"/>
+      <w:lvlText w:val=""/>
+      <w:lvlJc w:val="left"/>
+      <w:pPr>
+        <w:tabs>
+          <w:tab w:val="num" w:pos="720"/>
+        </w:tabs>
+        <w:ind w:left="720" w:hanging="360"/>
+      </w:pPr>
+      <w:rPr>
+        <w:rFonts w:ascii="Symbol" w:hAnsi="Symbol" w:hint="default"/>
+        <w:sz w:val="20"/>
+      </w:rPr>
+    </w:lvl>
+    <w:lvl w:ilvl="1" w:tentative="1">
+      <w:start w:val="1"/>
+      <w:numFmt w:val="bullet"/>
+      <w:lvlText w:val="o"/>
+      <w:lvlJc w:val="left"/>
+      <w:pPr>
+        <w:tabs>
+          <w:tab w:val="num" w:pos="1440"/>
+        </w:tabs>
+        <w:ind w:left="1440" w:hanging="360"/>
+      </w:pPr>
+      <w:rPr>
+        <w:rFonts w:ascii="Courier New" w:hAnsi="Courier New" w:hint="default"/>
+        <w:sz w:val="20"/>
+      </w:rPr>
+    </w:lvl>
+    <w:lvl w:ilvl="2" w:tentative="1">
+      <w:start w:val="1"/>
+      <w:numFmt w:val="bullet"/>
+      <w:lvlText w:val=""/>
+      <w:lvlJc w:val="left"/>
+      <w:pPr>
+        <w:tabs>
+          <w:tab w:val="num" w:pos="2160"/>
+        </w:tabs>
+        <w:ind w:left="2160" w:hanging="360"/>
+      </w:pPr>
+      <w:rPr>
+        <w:rFonts w:ascii="Wingdings" w:hAnsi="Wingdings" w:hint="default"/>
+        <w:sz w:val="20"/>
+      </w:rPr>
+    </w:lvl>
+    <w:lvl w:ilvl="3" w:tentative="1">
+      <w:start w:val="1"/>
+      <w:numFmt w:val="bullet"/>
+      <w:lvlText w:val=""/>
+      <w:lvlJc w:val="left"/>
+      <w:pPr>
+        <w:tabs>
+          <w:tab w:val="num" w:pos="2880"/>
+        </w:tabs>
+        <w:ind w:left="2880" w:hanging="360"/>
+      </w:pPr>
+      <w:rPr>
+        <w:rFonts w:ascii="Wingdings" w:hAnsi="Wingdings" w:hint="default"/>
+        <w:sz w:val="20"/>
+      </w:rPr>
+    </w:lvl>
+    <w:lvl w:ilvl="4" w:tentative="1">
+      <w:start w:val="1"/>
+      <w:numFmt w:val="bullet"/>
+      <w:lvlText w:val=""/>
+      <w:lvlJc w:val="left"/>
+      <w:pPr>
+        <w:tabs>
+          <w:tab w:val="num" w:pos="3600"/>
+        </w:tabs>
+        <w:ind w:left="3600" w:hanging="360"/>
+      </w:pPr>
+      <w:rPr>
+        <w:rFonts w:ascii="Wingdings" w:hAnsi="Wingdings" w:hint="default"/>
+        <w:sz w:val="20"/>
+      </w:rPr>
+    </w:lvl>
+    <w:lvl w:ilvl="5" w:tentative="1">
+      <w:start w:val="1"/>
+      <w:numFmt w:val="bullet"/>
+      <w:lvlText w:val=""/>
+      <w:lvlJc w:val="left"/>
+      <w:pPr>
+        <w:tabs>
+          <w:tab w:val="num" w:pos="4320"/>
+        </w:tabs>
+        <w:ind w:left="4320" w:hanging="360"/>
+      </w:pPr>
+      <w:rPr>
+        <w:rFonts w:ascii="Wingdings" w:hAnsi="Wingdings" w:hint="default"/>
+        <w:sz w:val="20"/>
+      </w:rPr>
+    </w:lvl>
+    <w:lvl w:ilvl="6" w:tentative="1">
+      <w:start w:val="1"/>
+      <w:numFmt w:val="bullet"/>
+      <w:lvlText w:val=""/>
+      <w:lvlJc w:val="left"/>
+      <w:pPr>
+        <w:tabs>
+          <w:tab w:val="num" w:pos="5040"/>
+        </w:tabs>
+        <w:ind w:left="5040" w:hanging="360"/>
+      </w:pPr>
+      <w:rPr>
+        <w:rFonts w:ascii="Wingdings" w:hAnsi="Wingdings" w:hint="default"/>
+        <w:sz w:val="20"/>
+      </w:rPr>
+    </w:lvl>
+    <w:lvl w:ilvl="7" w:tentative="1">
+      <w:start w:val="1"/>
+      <w:numFmt w:val="bullet"/>
+      <w:lvlText w:val=""/>
+      <w:lvlJc w:val="left"/>
+      <w:pPr>
+        <w:tabs>
+          <w:tab w:val="num" w:pos="5760"/>
+        </w:tabs>
+        <w:ind w:left="5760" w:hanging="360"/>
+      </w:pPr>
+      <w:rPr>
+        <w:rFonts w:ascii="Wingdings" w:hAnsi="Wingdings" w:hint="default"/>
+        <w:sz w:val="20"/>
+      </w:rPr>
+    </w:lvl>
+    <w:lvl w:ilvl="8" w:tentative="1">
+      <w:start w:val="1"/>
+      <w:numFmt w:val="bullet"/>
+      <w:lvlText w:val=""/>
+      <w:lvlJc w:val="left"/>
+      <w:pPr>
+        <w:tabs>
+          <w:tab w:val="num" w:pos="6480"/>
+        </w:tabs>
+        <w:ind w:left="6480" w:hanging="360"/>
+      </w:pPr>
+      <w:rPr>
+        <w:rFonts w:ascii="Wingdings" w:hAnsi="Wingdings" w:hint="default"/>
+        <w:sz w:val="20"/>
+      </w:rPr>
+    </w:lvl>
+  </w:abstractNum>
+  <w:abstractNum w:abstractNumId="42" w15:restartNumberingAfterBreak="0">
     <w:nsid w:val="7638144D"/>
     <w:multiLevelType w:val="multilevel"/>
     <w:tmpl w:val="21BE00E2"/>
@@ -9747,109 +12656,133 @@
     </w:lvl>
   </w:abstractNum>
   <w:num w:numId="1" w16cid:durableId="133527383">
-    <w:abstractNumId w:val="10"/>
+    <w:abstractNumId w:val="12"/>
   </w:num>
   <w:num w:numId="2" w16cid:durableId="1949894423">
-    <w:abstractNumId w:val="7"/>
+    <w:abstractNumId w:val="9"/>
   </w:num>
   <w:num w:numId="3" w16cid:durableId="1930195777">
-    <w:abstractNumId w:val="22"/>
+    <w:abstractNumId w:val="26"/>
   </w:num>
   <w:num w:numId="4" w16cid:durableId="701784512">
-    <w:abstractNumId w:val="25"/>
+    <w:abstractNumId w:val="29"/>
   </w:num>
   <w:num w:numId="5" w16cid:durableId="526992074">
-    <w:abstractNumId w:val="24"/>
+    <w:abstractNumId w:val="28"/>
   </w:num>
   <w:num w:numId="6" w16cid:durableId="212471105">
-    <w:abstractNumId w:val="3"/>
+    <w:abstractNumId w:val="5"/>
   </w:num>
   <w:num w:numId="7" w16cid:durableId="1772428672">
-    <w:abstractNumId w:val="5"/>
+    <w:abstractNumId w:val="7"/>
   </w:num>
   <w:num w:numId="8" w16cid:durableId="1805078313">
     <w:abstractNumId w:val="1"/>
   </w:num>
   <w:num w:numId="9" w16cid:durableId="444928011">
-    <w:abstractNumId w:val="18"/>
+    <w:abstractNumId w:val="22"/>
   </w:num>
   <w:num w:numId="10" w16cid:durableId="1814977998">
-    <w:abstractNumId w:val="13"/>
+    <w:abstractNumId w:val="16"/>
   </w:num>
   <w:num w:numId="11" w16cid:durableId="519202613">
     <w:abstractNumId w:val="0"/>
   </w:num>
   <w:num w:numId="12" w16cid:durableId="1172335234">
-    <w:abstractNumId w:val="19"/>
+    <w:abstractNumId w:val="23"/>
   </w:num>
   <w:num w:numId="13" w16cid:durableId="1352297192">
-    <w:abstractNumId w:val="23"/>
+    <w:abstractNumId w:val="27"/>
   </w:num>
   <w:num w:numId="14" w16cid:durableId="480117175">
-    <w:abstractNumId w:val="14"/>
+    <w:abstractNumId w:val="18"/>
   </w:num>
   <w:num w:numId="15" w16cid:durableId="1089472372">
     <w:abstractNumId w:val="2"/>
   </w:num>
   <w:num w:numId="16" w16cid:durableId="1190683533">
+    <w:abstractNumId w:val="8"/>
+  </w:num>
+  <w:num w:numId="17" w16cid:durableId="1749692753">
+    <w:abstractNumId w:val="30"/>
+  </w:num>
+  <w:num w:numId="18" w16cid:durableId="212621603">
+    <w:abstractNumId w:val="21"/>
+  </w:num>
+  <w:num w:numId="19" w16cid:durableId="2031570090">
+    <w:abstractNumId w:val="33"/>
+  </w:num>
+  <w:num w:numId="20" w16cid:durableId="1560634624">
+    <w:abstractNumId w:val="36"/>
+  </w:num>
+  <w:num w:numId="21" w16cid:durableId="1750153203">
+    <w:abstractNumId w:val="38"/>
+  </w:num>
+  <w:num w:numId="22" w16cid:durableId="927928201">
+    <w:abstractNumId w:val="20"/>
+  </w:num>
+  <w:num w:numId="23" w16cid:durableId="1266961602">
+    <w:abstractNumId w:val="24"/>
+  </w:num>
+  <w:num w:numId="24" w16cid:durableId="2082830000">
+    <w:abstractNumId w:val="35"/>
+  </w:num>
+  <w:num w:numId="25" w16cid:durableId="394933328">
+    <w:abstractNumId w:val="10"/>
+  </w:num>
+  <w:num w:numId="26" w16cid:durableId="2072076955">
+    <w:abstractNumId w:val="25"/>
+  </w:num>
+  <w:num w:numId="27" w16cid:durableId="2102527872">
+    <w:abstractNumId w:val="14"/>
+  </w:num>
+  <w:num w:numId="28" w16cid:durableId="702286492">
+    <w:abstractNumId w:val="42"/>
+  </w:num>
+  <w:num w:numId="29" w16cid:durableId="799610513">
+    <w:abstractNumId w:val="15"/>
+  </w:num>
+  <w:num w:numId="30" w16cid:durableId="1554388454">
+    <w:abstractNumId w:val="39"/>
+  </w:num>
+  <w:num w:numId="31" w16cid:durableId="1813935859">
+    <w:abstractNumId w:val="31"/>
+  </w:num>
+  <w:num w:numId="32" w16cid:durableId="965354912">
+    <w:abstractNumId w:val="11"/>
+  </w:num>
+  <w:num w:numId="33" w16cid:durableId="492528333">
+    <w:abstractNumId w:val="19"/>
+  </w:num>
+  <w:num w:numId="34" w16cid:durableId="859709163">
     <w:abstractNumId w:val="6"/>
   </w:num>
-  <w:num w:numId="17" w16cid:durableId="1749692753">
-    <w:abstractNumId w:val="26"/>
+  <w:num w:numId="35" w16cid:durableId="730618573">
+    <w:abstractNumId w:val="34"/>
   </w:num>
-  <w:num w:numId="18" w16cid:durableId="212621603">
+  <w:num w:numId="36" w16cid:durableId="649753194">
     <w:abstractNumId w:val="17"/>
   </w:num>
-  <w:num w:numId="19" w16cid:durableId="2031570090">
-    <w:abstractNumId w:val="28"/>
+  <w:num w:numId="37" w16cid:durableId="2109081722">
+    <w:abstractNumId w:val="13"/>
   </w:num>
-  <w:num w:numId="20" w16cid:durableId="1560634624">
-    <w:abstractNumId w:val="31"/>
+  <w:num w:numId="38" w16cid:durableId="63725760">
+    <w:abstractNumId w:val="41"/>
   </w:num>
-  <w:num w:numId="21" w16cid:durableId="1750153203">
+  <w:num w:numId="39" w16cid:durableId="1181966156">
+    <w:abstractNumId w:val="40"/>
+  </w:num>
+  <w:num w:numId="40" w16cid:durableId="586816399">
     <w:abstractNumId w:val="32"/>
   </w:num>
-  <w:num w:numId="22" w16cid:durableId="927928201">
-    <w:abstractNumId w:val="16"/>
+  <w:num w:numId="41" w16cid:durableId="2045909470">
+    <w:abstractNumId w:val="37"/>
   </w:num>
-  <w:num w:numId="23" w16cid:durableId="1266961602">
-    <w:abstractNumId w:val="20"/>
-  </w:num>
-  <w:num w:numId="24" w16cid:durableId="2082830000">
-    <w:abstractNumId w:val="30"/>
-  </w:num>
-  <w:num w:numId="25" w16cid:durableId="394933328">
-    <w:abstractNumId w:val="8"/>
-  </w:num>
-  <w:num w:numId="26" w16cid:durableId="2072076955">
-    <w:abstractNumId w:val="21"/>
-  </w:num>
-  <w:num w:numId="27" w16cid:durableId="2102527872">
-    <w:abstractNumId w:val="11"/>
-  </w:num>
-  <w:num w:numId="28" w16cid:durableId="702286492">
-    <w:abstractNumId w:val="34"/>
-  </w:num>
-  <w:num w:numId="29" w16cid:durableId="799610513">
-    <w:abstractNumId w:val="12"/>
-  </w:num>
-  <w:num w:numId="30" w16cid:durableId="1554388454">
-    <w:abstractNumId w:val="33"/>
-  </w:num>
-  <w:num w:numId="31" w16cid:durableId="1813935859">
-    <w:abstractNumId w:val="27"/>
-  </w:num>
-  <w:num w:numId="32" w16cid:durableId="965354912">
-    <w:abstractNumId w:val="9"/>
-  </w:num>
-  <w:num w:numId="33" w16cid:durableId="492528333">
-    <w:abstractNumId w:val="15"/>
-  </w:num>
-  <w:num w:numId="34" w16cid:durableId="859709163">
+  <w:num w:numId="42" w16cid:durableId="1735006032">
     <w:abstractNumId w:val="4"/>
   </w:num>
-  <w:num w:numId="35" w16cid:durableId="730618573">
-    <w:abstractNumId w:val="29"/>
+  <w:num w:numId="43" w16cid:durableId="1083381784">
+    <w:abstractNumId w:val="3"/>
   </w:num>
 </w:numbering>
 </file>
@@ -10457,7 +13390,6 @@
   <w:style w:type="character" w:default="1" w:styleId="DefaultParagraphFont">
     <w:name w:val="Default Paragraph Font"/>
     <w:uiPriority w:val="1"/>
-    <w:semiHidden/>
     <w:unhideWhenUsed/>
   </w:style>
   <w:style w:type="table" w:default="1" w:styleId="TableNormal">

</xml_diff>

<commit_message>
feat: introduce slider input mode and improve answer UX
</commit_message>
<xml_diff>
--- a/SESSION.md.docx
+++ b/SESSION.md.docx
@@ -5306,7 +5306,7 @@
           <w14:ligatures w14:val="none"/>
         </w:rPr>
         <w:pict w14:anchorId="216674FC">
-          <v:rect id="_x0000_i1065" style="width:0;height:1.5pt" o:hralign="center" o:hrstd="t" o:hr="t" fillcolor="#a0a0a0" stroked="f"/>
+          <v:rect id="_x0000_i1041" style="width:0;height:1.5pt" o:hralign="center" o:hrstd="t" o:hr="t" fillcolor="#a0a0a0" stroked="f"/>
         </w:pict>
       </w:r>
     </w:p>
@@ -5478,7 +5478,6 @@
         </w:rPr>
       </w:pPr>
       <w:proofErr w:type="spellStart"/>
-      <w:proofErr w:type="gramStart"/>
       <w:r>
         <w:rPr>
           <w:rFonts w:ascii="Times New Roman" w:eastAsia="Times New Roman" w:hAnsi="Times New Roman" w:cs="Times New Roman"/>
@@ -5491,7 +5490,6 @@
         <w:t>question.options</w:t>
       </w:r>
       <w:proofErr w:type="spellEnd"/>
-      <w:proofErr w:type="gramEnd"/>
       <w:r>
         <w:rPr>
           <w:rFonts w:ascii="Times New Roman" w:eastAsia="Times New Roman" w:hAnsi="Times New Roman" w:cs="Times New Roman"/>
@@ -5532,7 +5530,6 @@
         <w:t xml:space="preserve">fallback to </w:t>
       </w:r>
       <w:proofErr w:type="spellStart"/>
-      <w:proofErr w:type="gramStart"/>
       <w:r>
         <w:rPr>
           <w:rFonts w:ascii="Times New Roman" w:eastAsia="Times New Roman" w:hAnsi="Times New Roman" w:cs="Times New Roman"/>
@@ -5545,7 +5542,6 @@
         <w:t>scale.options</w:t>
       </w:r>
       <w:proofErr w:type="spellEnd"/>
-      <w:proofErr w:type="gramEnd"/>
       <w:r>
         <w:rPr>
           <w:rFonts w:ascii="Times New Roman" w:eastAsia="Times New Roman" w:hAnsi="Times New Roman" w:cs="Times New Roman"/>
@@ -5580,7 +5576,7 @@
           <w14:ligatures w14:val="none"/>
         </w:rPr>
         <w:pict w14:anchorId="4BE48D4D">
-          <v:rect id="_x0000_i1059" style="width:0;height:1.5pt" o:hralign="center" o:hrstd="t" o:hr="t" fillcolor="#a0a0a0" stroked="f"/>
+          <v:rect id="_x0000_i1042" style="width:0;height:1.5pt" o:hralign="center" o:hrstd="t" o:hr="t" fillcolor="#a0a0a0" stroked="f"/>
         </w:pict>
       </w:r>
     </w:p>
@@ -5895,7 +5891,7 @@
           <w14:ligatures w14:val="none"/>
         </w:rPr>
         <w:pict w14:anchorId="1A0D8E5A">
-          <v:rect id="_x0000_i1060" style="width:0;height:1.5pt" o:hralign="center" o:hrstd="t" o:hr="t" fillcolor="#a0a0a0" stroked="f"/>
+          <v:rect id="_x0000_i1043" style="width:0;height:1.5pt" o:hralign="center" o:hrstd="t" o:hr="t" fillcolor="#a0a0a0" stroked="f"/>
         </w:pict>
       </w:r>
     </w:p>
@@ -6126,7 +6122,7 @@
           <w14:ligatures w14:val="none"/>
         </w:rPr>
         <w:pict w14:anchorId="151AE232">
-          <v:rect id="_x0000_i1061" style="width:0;height:1.5pt" o:hralign="center" o:hrstd="t" o:hr="t" fillcolor="#a0a0a0" stroked="f"/>
+          <v:rect id="_x0000_i1044" style="width:0;height:1.5pt" o:hralign="center" o:hrstd="t" o:hr="t" fillcolor="#a0a0a0" stroked="f"/>
         </w:pict>
       </w:r>
     </w:p>
@@ -6227,7 +6223,6 @@
         <w:t xml:space="preserve">add validation for </w:t>
       </w:r>
       <w:proofErr w:type="spellStart"/>
-      <w:proofErr w:type="gramStart"/>
       <w:r>
         <w:rPr>
           <w:rFonts w:ascii="Times New Roman" w:eastAsia="Times New Roman" w:hAnsi="Times New Roman" w:cs="Times New Roman"/>
@@ -6240,7 +6235,6 @@
         <w:t>question.options</w:t>
       </w:r>
       <w:proofErr w:type="spellEnd"/>
-      <w:proofErr w:type="gramEnd"/>
       <w:r>
         <w:rPr>
           <w:rFonts w:ascii="Times New Roman" w:eastAsia="Times New Roman" w:hAnsi="Times New Roman" w:cs="Times New Roman"/>
@@ -6275,6 +6269,664 @@
         </w:rPr>
         <w:t xml:space="preserve">ensure backward compatibility with existing tests </w:t>
       </w:r>
+    </w:p>
+    <w:p>
+      <w:pPr>
+        <w:spacing w:before="100" w:beforeAutospacing="1" w:after="100" w:afterAutospacing="1" w:line="240" w:lineRule="auto"/>
+        <w:rPr>
+          <w:rFonts w:ascii="Times New Roman" w:eastAsia="Times New Roman" w:hAnsi="Times New Roman" w:cs="Times New Roman"/>
+          <w:kern w:val="0"/>
+          <w:sz w:val="24"/>
+          <w:szCs w:val="24"/>
+          <w:lang w:val="ru-RU" w:eastAsia="en-GB"/>
+          <w14:ligatures w14:val="none"/>
+        </w:rPr>
+      </w:pPr>
+    </w:p>
+    <w:p>
+      <w:pPr>
+        <w:spacing w:before="100" w:beforeAutospacing="1" w:after="100" w:afterAutospacing="1" w:line="240" w:lineRule="auto"/>
+        <w:rPr>
+          <w:lang w:val="en-GB"/>
+        </w:rPr>
+      </w:pPr>
+      <w:r>
+        <w:rPr>
+          <w:lang w:val="en-GB"/>
+        </w:rPr>
+        <w:pict w14:anchorId="04DD64FB">
+          <v:rect id="_x0000_i1075" style="width:0;height:1.5pt" o:hralign="center" o:hrstd="t" o:hr="t" fillcolor="#a0a0a0" stroked="f"/>
+        </w:pict>
+      </w:r>
+    </w:p>
+    <w:p>
+      <w:pPr>
+        <w:spacing w:before="100" w:beforeAutospacing="1" w:after="100" w:afterAutospacing="1" w:line="240" w:lineRule="auto"/>
+        <w:rPr>
+          <w:b/>
+          <w:bCs/>
+          <w:lang w:val="en-GB"/>
+        </w:rPr>
+      </w:pPr>
+      <w:r>
+        <w:rPr>
+          <w:rFonts w:ascii="Segoe UI Emoji" w:hAnsi="Segoe UI Emoji" w:cs="Segoe UI Emoji"/>
+          <w:b/>
+          <w:bCs/>
+          <w:lang w:val="en-GB"/>
+        </w:rPr>
+        <w:t>🧠</w:t>
+      </w:r>
+      <w:r>
+        <w:rPr>
+          <w:b/>
+          <w:bCs/>
+          <w:lang w:val="en-GB"/>
+        </w:rPr>
+        <w:t xml:space="preserve"> feat: add slider input mode with virtual default values and improved answer handling</w:t>
+      </w:r>
+    </w:p>
+    <w:p>
+      <w:pPr>
+        <w:numPr>
+          <w:ilvl w:val="0"/>
+          <w:numId w:val="44"/>
+        </w:numPr>
+        <w:spacing w:before="100" w:beforeAutospacing="1" w:after="100" w:afterAutospacing="1" w:line="240" w:lineRule="auto"/>
+        <w:rPr>
+          <w:lang w:val="en-GB"/>
+        </w:rPr>
+      </w:pPr>
+      <w:r>
+        <w:rPr>
+          <w:lang w:val="en-GB"/>
+        </w:rPr>
+        <w:t xml:space="preserve">implement </w:t>
+      </w:r>
+      <w:proofErr w:type="spellStart"/>
+      <w:r>
+        <w:rPr>
+          <w:lang w:val="en-GB"/>
+        </w:rPr>
+        <w:t>ui.inputMode</w:t>
+      </w:r>
+      <w:proofErr w:type="spellEnd"/>
+      <w:r>
+        <w:rPr>
+          <w:lang w:val="en-GB"/>
+        </w:rPr>
+        <w:t xml:space="preserve"> with support for: </w:t>
+      </w:r>
+    </w:p>
+    <w:p>
+      <w:pPr>
+        <w:numPr>
+          <w:ilvl w:val="1"/>
+          <w:numId w:val="44"/>
+        </w:numPr>
+        <w:spacing w:before="100" w:beforeAutospacing="1" w:after="100" w:afterAutospacing="1" w:line="240" w:lineRule="auto"/>
+        <w:rPr>
+          <w:lang w:val="en-GB"/>
+        </w:rPr>
+      </w:pPr>
+      <w:r>
+        <w:rPr>
+          <w:lang w:val="en-GB"/>
+        </w:rPr>
+        <w:t xml:space="preserve">"buttons" </w:t>
+      </w:r>
+    </w:p>
+    <w:p>
+      <w:pPr>
+        <w:numPr>
+          <w:ilvl w:val="1"/>
+          <w:numId w:val="44"/>
+        </w:numPr>
+        <w:spacing w:before="100" w:beforeAutospacing="1" w:after="100" w:afterAutospacing="1" w:line="240" w:lineRule="auto"/>
+        <w:rPr>
+          <w:lang w:val="en-GB"/>
+        </w:rPr>
+      </w:pPr>
+      <w:r>
+        <w:rPr>
+          <w:lang w:val="en-GB"/>
+        </w:rPr>
+        <w:t xml:space="preserve">"slider" </w:t>
+      </w:r>
+    </w:p>
+    <w:p>
+      <w:pPr>
+        <w:numPr>
+          <w:ilvl w:val="1"/>
+          <w:numId w:val="44"/>
+        </w:numPr>
+        <w:spacing w:before="100" w:beforeAutospacing="1" w:after="100" w:afterAutospacing="1" w:line="240" w:lineRule="auto"/>
+        <w:rPr>
+          <w:lang w:val="en-GB"/>
+        </w:rPr>
+      </w:pPr>
+      <w:r>
+        <w:rPr>
+          <w:lang w:val="en-GB"/>
+        </w:rPr>
+        <w:t xml:space="preserve">"mixed" </w:t>
+      </w:r>
+    </w:p>
+    <w:p>
+      <w:pPr>
+        <w:spacing w:before="100" w:beforeAutospacing="1" w:after="100" w:afterAutospacing="1" w:line="240" w:lineRule="auto"/>
+        <w:rPr>
+          <w:lang w:val="en-GB"/>
+        </w:rPr>
+      </w:pPr>
+      <w:r>
+        <w:rPr>
+          <w:lang w:val="en-GB"/>
+        </w:rPr>
+        <w:pict w14:anchorId="3C77AF86">
+          <v:rect id="_x0000_i1076" style="width:0;height:1.5pt" o:hralign="center" o:hrstd="t" o:hr="t" fillcolor="#a0a0a0" stroked="f"/>
+        </w:pict>
+      </w:r>
+    </w:p>
+    <w:p>
+      <w:pPr>
+        <w:spacing w:before="100" w:beforeAutospacing="1" w:after="100" w:afterAutospacing="1" w:line="240" w:lineRule="auto"/>
+        <w:rPr>
+          <w:b/>
+          <w:bCs/>
+          <w:lang w:val="en-GB"/>
+        </w:rPr>
+      </w:pPr>
+      <w:r>
+        <w:rPr>
+          <w:rFonts w:ascii="Segoe UI Emoji" w:hAnsi="Segoe UI Emoji" w:cs="Segoe UI Emoji"/>
+          <w:b/>
+          <w:bCs/>
+          <w:lang w:val="en-GB"/>
+        </w:rPr>
+        <w:t>🎚️</w:t>
+      </w:r>
+      <w:r>
+        <w:rPr>
+          <w:b/>
+          <w:bCs/>
+          <w:lang w:val="en-GB"/>
+        </w:rPr>
+        <w:t xml:space="preserve"> slider </w:t>
+      </w:r>
+      <w:proofErr w:type="spellStart"/>
+      <w:r>
+        <w:rPr>
+          <w:b/>
+          <w:bCs/>
+          <w:lang w:val="en-GB"/>
+        </w:rPr>
+        <w:t>behavior</w:t>
+      </w:r>
+      <w:proofErr w:type="spellEnd"/>
+    </w:p>
+    <w:p>
+      <w:pPr>
+        <w:numPr>
+          <w:ilvl w:val="0"/>
+          <w:numId w:val="45"/>
+        </w:numPr>
+        <w:spacing w:before="100" w:beforeAutospacing="1" w:after="100" w:afterAutospacing="1" w:line="240" w:lineRule="auto"/>
+        <w:rPr>
+          <w:lang w:val="en-GB"/>
+        </w:rPr>
+      </w:pPr>
+      <w:r>
+        <w:rPr>
+          <w:lang w:val="en-GB"/>
+        </w:rPr>
+        <w:t xml:space="preserve">add slider as alternative input method </w:t>
+      </w:r>
+    </w:p>
+    <w:p>
+      <w:pPr>
+        <w:numPr>
+          <w:ilvl w:val="0"/>
+          <w:numId w:val="45"/>
+        </w:numPr>
+        <w:spacing w:before="100" w:beforeAutospacing="1" w:after="100" w:afterAutospacing="1" w:line="240" w:lineRule="auto"/>
+        <w:rPr>
+          <w:lang w:val="en-GB"/>
+        </w:rPr>
+      </w:pPr>
+      <w:r>
+        <w:rPr>
+          <w:lang w:val="en-GB"/>
+        </w:rPr>
+        <w:t xml:space="preserve">in mixed mode show both slider and buttons </w:t>
+      </w:r>
+    </w:p>
+    <w:p>
+      <w:pPr>
+        <w:numPr>
+          <w:ilvl w:val="0"/>
+          <w:numId w:val="45"/>
+        </w:numPr>
+        <w:spacing w:before="100" w:beforeAutospacing="1" w:after="100" w:afterAutospacing="1" w:line="240" w:lineRule="auto"/>
+        <w:rPr>
+          <w:lang w:val="en-GB"/>
+        </w:rPr>
+      </w:pPr>
+      <w:r>
+        <w:rPr>
+          <w:lang w:val="en-GB"/>
+        </w:rPr>
+        <w:t xml:space="preserve">hide answer legend when slider is active </w:t>
+      </w:r>
+    </w:p>
+    <w:p>
+      <w:pPr>
+        <w:numPr>
+          <w:ilvl w:val="0"/>
+          <w:numId w:val="45"/>
+        </w:numPr>
+        <w:spacing w:before="100" w:beforeAutospacing="1" w:after="100" w:afterAutospacing="1" w:line="240" w:lineRule="auto"/>
+        <w:rPr>
+          <w:lang w:val="en-GB"/>
+        </w:rPr>
+      </w:pPr>
+      <w:r>
+        <w:rPr>
+          <w:lang w:val="en-GB"/>
+        </w:rPr>
+        <w:t xml:space="preserve">display selected option label under slider </w:t>
+      </w:r>
+    </w:p>
+    <w:p>
+      <w:pPr>
+        <w:spacing w:before="100" w:beforeAutospacing="1" w:after="100" w:afterAutospacing="1" w:line="240" w:lineRule="auto"/>
+        <w:rPr>
+          <w:lang w:val="en-GB"/>
+        </w:rPr>
+      </w:pPr>
+      <w:r>
+        <w:rPr>
+          <w:lang w:val="en-GB"/>
+        </w:rPr>
+        <w:pict w14:anchorId="56958650">
+          <v:rect id="_x0000_i1077" style="width:0;height:1.5pt" o:hralign="center" o:hrstd="t" o:hr="t" fillcolor="#a0a0a0" stroked="f"/>
+        </w:pict>
+      </w:r>
+    </w:p>
+    <w:p>
+      <w:pPr>
+        <w:spacing w:before="100" w:beforeAutospacing="1" w:after="100" w:afterAutospacing="1" w:line="240" w:lineRule="auto"/>
+        <w:rPr>
+          <w:b/>
+          <w:bCs/>
+          <w:lang w:val="en-GB"/>
+        </w:rPr>
+      </w:pPr>
+      <w:r>
+        <w:rPr>
+          <w:rFonts w:ascii="Segoe UI Emoji" w:hAnsi="Segoe UI Emoji" w:cs="Segoe UI Emoji"/>
+          <w:b/>
+          <w:bCs/>
+          <w:lang w:val="en-GB"/>
+        </w:rPr>
+        <w:t>⚙️</w:t>
+      </w:r>
+      <w:r>
+        <w:rPr>
+          <w:b/>
+          <w:bCs/>
+          <w:lang w:val="en-GB"/>
+        </w:rPr>
+        <w:t xml:space="preserve"> answer logic improvements</w:t>
+      </w:r>
+    </w:p>
+    <w:p>
+      <w:pPr>
+        <w:numPr>
+          <w:ilvl w:val="0"/>
+          <w:numId w:val="46"/>
+        </w:numPr>
+        <w:spacing w:before="100" w:beforeAutospacing="1" w:after="100" w:afterAutospacing="1" w:line="240" w:lineRule="auto"/>
+        <w:rPr>
+          <w:lang w:val="en-GB"/>
+        </w:rPr>
+      </w:pPr>
+      <w:r>
+        <w:rPr>
+          <w:lang w:val="en-GB"/>
+        </w:rPr>
+        <w:t xml:space="preserve">introduce </w:t>
+      </w:r>
+      <w:proofErr w:type="spellStart"/>
+      <w:r>
+        <w:rPr>
+          <w:lang w:val="en-GB"/>
+        </w:rPr>
+        <w:t>effectiveAnswer</w:t>
+      </w:r>
+      <w:proofErr w:type="spellEnd"/>
+      <w:r>
+        <w:rPr>
+          <w:lang w:val="en-GB"/>
+        </w:rPr>
+        <w:t xml:space="preserve">: </w:t>
+      </w:r>
+    </w:p>
+    <w:p>
+      <w:pPr>
+        <w:numPr>
+          <w:ilvl w:val="1"/>
+          <w:numId w:val="46"/>
+        </w:numPr>
+        <w:spacing w:before="100" w:beforeAutospacing="1" w:after="100" w:afterAutospacing="1" w:line="240" w:lineRule="auto"/>
+        <w:rPr>
+          <w:lang w:val="en-GB"/>
+        </w:rPr>
+      </w:pPr>
+      <w:r>
+        <w:rPr>
+          <w:lang w:val="en-GB"/>
+        </w:rPr>
+        <w:t xml:space="preserve">provides virtual default value for slider mode </w:t>
+      </w:r>
+    </w:p>
+    <w:p>
+      <w:pPr>
+        <w:numPr>
+          <w:ilvl w:val="1"/>
+          <w:numId w:val="46"/>
+        </w:numPr>
+        <w:spacing w:before="100" w:beforeAutospacing="1" w:after="100" w:afterAutospacing="1" w:line="240" w:lineRule="auto"/>
+        <w:rPr>
+          <w:lang w:val="en-GB"/>
+        </w:rPr>
+      </w:pPr>
+      <w:r>
+        <w:rPr>
+          <w:lang w:val="en-GB"/>
+        </w:rPr>
+        <w:t xml:space="preserve">avoids empty state ambiguity </w:t>
+      </w:r>
+    </w:p>
+    <w:p>
+      <w:pPr>
+        <w:numPr>
+          <w:ilvl w:val="0"/>
+          <w:numId w:val="46"/>
+        </w:numPr>
+        <w:spacing w:before="100" w:beforeAutospacing="1" w:after="100" w:afterAutospacing="1" w:line="240" w:lineRule="auto"/>
+        <w:rPr>
+          <w:lang w:val="en-GB"/>
+        </w:rPr>
+      </w:pPr>
+      <w:r>
+        <w:rPr>
+          <w:lang w:val="en-GB"/>
+        </w:rPr>
+        <w:t xml:space="preserve">synchronize slider and button selection via </w:t>
+      </w:r>
+      <w:proofErr w:type="spellStart"/>
+      <w:r>
+        <w:rPr>
+          <w:lang w:val="en-GB"/>
+        </w:rPr>
+        <w:t>effectiveAnswer</w:t>
+      </w:r>
+      <w:proofErr w:type="spellEnd"/>
+      <w:r>
+        <w:rPr>
+          <w:lang w:val="en-GB"/>
+        </w:rPr>
+        <w:t xml:space="preserve"> </w:t>
+      </w:r>
+    </w:p>
+    <w:p>
+      <w:pPr>
+        <w:numPr>
+          <w:ilvl w:val="0"/>
+          <w:numId w:val="46"/>
+        </w:numPr>
+        <w:spacing w:before="100" w:beforeAutospacing="1" w:after="100" w:afterAutospacing="1" w:line="240" w:lineRule="auto"/>
+        <w:rPr>
+          <w:lang w:val="en-GB"/>
+        </w:rPr>
+      </w:pPr>
+      <w:r>
+        <w:rPr>
+          <w:lang w:val="en-GB"/>
+        </w:rPr>
+        <w:t>ensure answer is persisted on navigation (</w:t>
+      </w:r>
+      <w:proofErr w:type="spellStart"/>
+      <w:r>
+        <w:rPr>
+          <w:lang w:val="en-GB"/>
+        </w:rPr>
+        <w:t>handleNext</w:t>
+      </w:r>
+      <w:proofErr w:type="spellEnd"/>
+      <w:r>
+        <w:rPr>
+          <w:lang w:val="en-GB"/>
+        </w:rPr>
+        <w:t xml:space="preserve">) </w:t>
+      </w:r>
+    </w:p>
+    <w:p>
+      <w:pPr>
+        <w:spacing w:before="100" w:beforeAutospacing="1" w:after="100" w:afterAutospacing="1" w:line="240" w:lineRule="auto"/>
+        <w:rPr>
+          <w:lang w:val="en-GB"/>
+        </w:rPr>
+      </w:pPr>
+      <w:r>
+        <w:rPr>
+          <w:lang w:val="en-GB"/>
+        </w:rPr>
+        <w:pict w14:anchorId="414E94B6">
+          <v:rect id="_x0000_i1078" style="width:0;height:1.5pt" o:hralign="center" o:hrstd="t" o:hr="t" fillcolor="#a0a0a0" stroked="f"/>
+        </w:pict>
+      </w:r>
+    </w:p>
+    <w:p>
+      <w:pPr>
+        <w:spacing w:before="100" w:beforeAutospacing="1" w:after="100" w:afterAutospacing="1" w:line="240" w:lineRule="auto"/>
+        <w:rPr>
+          <w:b/>
+          <w:bCs/>
+          <w:lang w:val="en-GB"/>
+        </w:rPr>
+      </w:pPr>
+      <w:r>
+        <w:rPr>
+          <w:rFonts w:ascii="Segoe UI Emoji" w:hAnsi="Segoe UI Emoji" w:cs="Segoe UI Emoji"/>
+          <w:b/>
+          <w:bCs/>
+          <w:lang w:val="en-GB"/>
+        </w:rPr>
+        <w:t>📊</w:t>
+      </w:r>
+      <w:r>
+        <w:rPr>
+          <w:b/>
+          <w:bCs/>
+          <w:lang w:val="en-GB"/>
+        </w:rPr>
+        <w:t xml:space="preserve"> UX fixes</w:t>
+      </w:r>
+    </w:p>
+    <w:p>
+      <w:pPr>
+        <w:numPr>
+          <w:ilvl w:val="0"/>
+          <w:numId w:val="47"/>
+        </w:numPr>
+        <w:spacing w:before="100" w:beforeAutospacing="1" w:after="100" w:afterAutospacing="1" w:line="240" w:lineRule="auto"/>
+        <w:rPr>
+          <w:lang w:val="en-GB"/>
+        </w:rPr>
+      </w:pPr>
+      <w:r>
+        <w:rPr>
+          <w:lang w:val="en-GB"/>
+        </w:rPr>
+        <w:t xml:space="preserve">prevent layout shifts (stable label rendering) </w:t>
+      </w:r>
+    </w:p>
+    <w:p>
+      <w:pPr>
+        <w:numPr>
+          <w:ilvl w:val="0"/>
+          <w:numId w:val="47"/>
+        </w:numPr>
+        <w:spacing w:before="100" w:beforeAutospacing="1" w:after="100" w:afterAutospacing="1" w:line="240" w:lineRule="auto"/>
+        <w:rPr>
+          <w:lang w:val="en-GB"/>
+        </w:rPr>
+      </w:pPr>
+      <w:r>
+        <w:rPr>
+          <w:lang w:val="en-GB"/>
+        </w:rPr>
+        <w:t xml:space="preserve">fix "Next" button disabled state for slider mode </w:t>
+      </w:r>
+    </w:p>
+    <w:p>
+      <w:pPr>
+        <w:numPr>
+          <w:ilvl w:val="0"/>
+          <w:numId w:val="47"/>
+        </w:numPr>
+        <w:spacing w:before="100" w:beforeAutospacing="1" w:after="100" w:afterAutospacing="1" w:line="240" w:lineRule="auto"/>
+        <w:rPr>
+          <w:lang w:val="en-GB"/>
+        </w:rPr>
+      </w:pPr>
+      <w:r>
+        <w:rPr>
+          <w:lang w:val="en-GB"/>
+        </w:rPr>
+        <w:t xml:space="preserve">fix answered counter to include current virtual answer </w:t>
+      </w:r>
+    </w:p>
+    <w:p>
+      <w:pPr>
+        <w:spacing w:before="100" w:beforeAutospacing="1" w:after="100" w:afterAutospacing="1" w:line="240" w:lineRule="auto"/>
+        <w:rPr>
+          <w:lang w:val="en-GB"/>
+        </w:rPr>
+      </w:pPr>
+      <w:r>
+        <w:rPr>
+          <w:lang w:val="en-GB"/>
+        </w:rPr>
+        <w:pict w14:anchorId="7EABE84C">
+          <v:rect id="_x0000_i1079" style="width:0;height:1.5pt" o:hralign="center" o:hrstd="t" o:hr="t" fillcolor="#a0a0a0" stroked="f"/>
+        </w:pict>
+      </w:r>
+    </w:p>
+    <w:p>
+      <w:pPr>
+        <w:spacing w:before="100" w:beforeAutospacing="1" w:after="100" w:afterAutospacing="1" w:line="240" w:lineRule="auto"/>
+        <w:rPr>
+          <w:b/>
+          <w:bCs/>
+          <w:lang w:val="en-GB"/>
+        </w:rPr>
+      </w:pPr>
+      <w:r>
+        <w:rPr>
+          <w:rFonts w:ascii="Segoe UI Emoji" w:hAnsi="Segoe UI Emoji" w:cs="Segoe UI Emoji"/>
+          <w:b/>
+          <w:bCs/>
+          <w:lang w:val="en-GB"/>
+        </w:rPr>
+        <w:t>🧹</w:t>
+      </w:r>
+      <w:r>
+        <w:rPr>
+          <w:b/>
+          <w:bCs/>
+          <w:lang w:val="en-GB"/>
+        </w:rPr>
+        <w:t xml:space="preserve"> refactoring</w:t>
+      </w:r>
+    </w:p>
+    <w:p>
+      <w:pPr>
+        <w:numPr>
+          <w:ilvl w:val="0"/>
+          <w:numId w:val="48"/>
+        </w:numPr>
+        <w:spacing w:before="100" w:beforeAutospacing="1" w:after="100" w:afterAutospacing="1" w:line="240" w:lineRule="auto"/>
+        <w:rPr>
+          <w:lang w:val="en-GB"/>
+        </w:rPr>
+      </w:pPr>
+      <w:r>
+        <w:rPr>
+          <w:lang w:val="en-GB"/>
+        </w:rPr>
+        <w:t xml:space="preserve">simplify answer state handling </w:t>
+      </w:r>
+    </w:p>
+    <w:p>
+      <w:pPr>
+        <w:numPr>
+          <w:ilvl w:val="0"/>
+          <w:numId w:val="48"/>
+        </w:numPr>
+        <w:spacing w:before="100" w:beforeAutospacing="1" w:after="100" w:afterAutospacing="1" w:line="240" w:lineRule="auto"/>
+        <w:rPr>
+          <w:lang w:val="en-GB"/>
+        </w:rPr>
+      </w:pPr>
+      <w:r>
+        <w:rPr>
+          <w:lang w:val="en-GB"/>
+        </w:rPr>
+        <w:t>remove redundant variables (</w:t>
+      </w:r>
+      <w:proofErr w:type="spellStart"/>
+      <w:r>
+        <w:rPr>
+          <w:lang w:val="en-GB"/>
+        </w:rPr>
+        <w:t>currentAnswer</w:t>
+      </w:r>
+      <w:proofErr w:type="spellEnd"/>
+      <w:r>
+        <w:rPr>
+          <w:lang w:val="en-GB"/>
+        </w:rPr>
+        <w:t xml:space="preserve">) </w:t>
+      </w:r>
+    </w:p>
+    <w:p>
+      <w:pPr>
+        <w:numPr>
+          <w:ilvl w:val="0"/>
+          <w:numId w:val="48"/>
+        </w:numPr>
+        <w:spacing w:before="100" w:beforeAutospacing="1" w:after="100" w:afterAutospacing="1" w:line="240" w:lineRule="auto"/>
+        <w:rPr>
+          <w:lang w:val="en-GB"/>
+        </w:rPr>
+      </w:pPr>
+      <w:r>
+        <w:rPr>
+          <w:lang w:val="en-GB"/>
+        </w:rPr>
+        <w:t xml:space="preserve">clean up debug output </w:t>
+      </w:r>
+    </w:p>
+    <w:p>
+      <w:pPr>
+        <w:spacing w:before="100" w:beforeAutospacing="1" w:after="100" w:afterAutospacing="1" w:line="240" w:lineRule="auto"/>
+        <w:rPr>
+          <w:lang w:val="ru-RU"/>
+        </w:rPr>
+      </w:pPr>
     </w:p>
     <w:sectPr>
       <w:pgSz w:w="12240" w:h="15840"/>
@@ -6885,6 +7537,304 @@
     </w:lvl>
   </w:abstractNum>
   <w:abstractNum w:abstractNumId="4" w15:restartNumberingAfterBreak="0">
+    <w:nsid w:val="0B074843"/>
+    <w:multiLevelType w:val="multilevel"/>
+    <w:tmpl w:val="F17CB2F4"/>
+    <w:lvl w:ilvl="0">
+      <w:start w:val="1"/>
+      <w:numFmt w:val="bullet"/>
+      <w:lvlText w:val=""/>
+      <w:lvlJc w:val="left"/>
+      <w:pPr>
+        <w:tabs>
+          <w:tab w:val="num" w:pos="720"/>
+        </w:tabs>
+        <w:ind w:left="720" w:hanging="360"/>
+      </w:pPr>
+      <w:rPr>
+        <w:rFonts w:ascii="Symbol" w:hAnsi="Symbol" w:hint="default"/>
+        <w:sz w:val="20"/>
+      </w:rPr>
+    </w:lvl>
+    <w:lvl w:ilvl="1" w:tentative="1">
+      <w:start w:val="1"/>
+      <w:numFmt w:val="bullet"/>
+      <w:lvlText w:val="o"/>
+      <w:lvlJc w:val="left"/>
+      <w:pPr>
+        <w:tabs>
+          <w:tab w:val="num" w:pos="1440"/>
+        </w:tabs>
+        <w:ind w:left="1440" w:hanging="360"/>
+      </w:pPr>
+      <w:rPr>
+        <w:rFonts w:ascii="Courier New" w:hAnsi="Courier New" w:hint="default"/>
+        <w:sz w:val="20"/>
+      </w:rPr>
+    </w:lvl>
+    <w:lvl w:ilvl="2" w:tentative="1">
+      <w:start w:val="1"/>
+      <w:numFmt w:val="bullet"/>
+      <w:lvlText w:val=""/>
+      <w:lvlJc w:val="left"/>
+      <w:pPr>
+        <w:tabs>
+          <w:tab w:val="num" w:pos="2160"/>
+        </w:tabs>
+        <w:ind w:left="2160" w:hanging="360"/>
+      </w:pPr>
+      <w:rPr>
+        <w:rFonts w:ascii="Wingdings" w:hAnsi="Wingdings" w:hint="default"/>
+        <w:sz w:val="20"/>
+      </w:rPr>
+    </w:lvl>
+    <w:lvl w:ilvl="3" w:tentative="1">
+      <w:start w:val="1"/>
+      <w:numFmt w:val="bullet"/>
+      <w:lvlText w:val=""/>
+      <w:lvlJc w:val="left"/>
+      <w:pPr>
+        <w:tabs>
+          <w:tab w:val="num" w:pos="2880"/>
+        </w:tabs>
+        <w:ind w:left="2880" w:hanging="360"/>
+      </w:pPr>
+      <w:rPr>
+        <w:rFonts w:ascii="Wingdings" w:hAnsi="Wingdings" w:hint="default"/>
+        <w:sz w:val="20"/>
+      </w:rPr>
+    </w:lvl>
+    <w:lvl w:ilvl="4" w:tentative="1">
+      <w:start w:val="1"/>
+      <w:numFmt w:val="bullet"/>
+      <w:lvlText w:val=""/>
+      <w:lvlJc w:val="left"/>
+      <w:pPr>
+        <w:tabs>
+          <w:tab w:val="num" w:pos="3600"/>
+        </w:tabs>
+        <w:ind w:left="3600" w:hanging="360"/>
+      </w:pPr>
+      <w:rPr>
+        <w:rFonts w:ascii="Wingdings" w:hAnsi="Wingdings" w:hint="default"/>
+        <w:sz w:val="20"/>
+      </w:rPr>
+    </w:lvl>
+    <w:lvl w:ilvl="5" w:tentative="1">
+      <w:start w:val="1"/>
+      <w:numFmt w:val="bullet"/>
+      <w:lvlText w:val=""/>
+      <w:lvlJc w:val="left"/>
+      <w:pPr>
+        <w:tabs>
+          <w:tab w:val="num" w:pos="4320"/>
+        </w:tabs>
+        <w:ind w:left="4320" w:hanging="360"/>
+      </w:pPr>
+      <w:rPr>
+        <w:rFonts w:ascii="Wingdings" w:hAnsi="Wingdings" w:hint="default"/>
+        <w:sz w:val="20"/>
+      </w:rPr>
+    </w:lvl>
+    <w:lvl w:ilvl="6" w:tentative="1">
+      <w:start w:val="1"/>
+      <w:numFmt w:val="bullet"/>
+      <w:lvlText w:val=""/>
+      <w:lvlJc w:val="left"/>
+      <w:pPr>
+        <w:tabs>
+          <w:tab w:val="num" w:pos="5040"/>
+        </w:tabs>
+        <w:ind w:left="5040" w:hanging="360"/>
+      </w:pPr>
+      <w:rPr>
+        <w:rFonts w:ascii="Wingdings" w:hAnsi="Wingdings" w:hint="default"/>
+        <w:sz w:val="20"/>
+      </w:rPr>
+    </w:lvl>
+    <w:lvl w:ilvl="7" w:tentative="1">
+      <w:start w:val="1"/>
+      <w:numFmt w:val="bullet"/>
+      <w:lvlText w:val=""/>
+      <w:lvlJc w:val="left"/>
+      <w:pPr>
+        <w:tabs>
+          <w:tab w:val="num" w:pos="5760"/>
+        </w:tabs>
+        <w:ind w:left="5760" w:hanging="360"/>
+      </w:pPr>
+      <w:rPr>
+        <w:rFonts w:ascii="Wingdings" w:hAnsi="Wingdings" w:hint="default"/>
+        <w:sz w:val="20"/>
+      </w:rPr>
+    </w:lvl>
+    <w:lvl w:ilvl="8" w:tentative="1">
+      <w:start w:val="1"/>
+      <w:numFmt w:val="bullet"/>
+      <w:lvlText w:val=""/>
+      <w:lvlJc w:val="left"/>
+      <w:pPr>
+        <w:tabs>
+          <w:tab w:val="num" w:pos="6480"/>
+        </w:tabs>
+        <w:ind w:left="6480" w:hanging="360"/>
+      </w:pPr>
+      <w:rPr>
+        <w:rFonts w:ascii="Wingdings" w:hAnsi="Wingdings" w:hint="default"/>
+        <w:sz w:val="20"/>
+      </w:rPr>
+    </w:lvl>
+  </w:abstractNum>
+  <w:abstractNum w:abstractNumId="5" w15:restartNumberingAfterBreak="0">
+    <w:nsid w:val="0BDF1339"/>
+    <w:multiLevelType w:val="multilevel"/>
+    <w:tmpl w:val="576EA25E"/>
+    <w:lvl w:ilvl="0">
+      <w:start w:val="1"/>
+      <w:numFmt w:val="bullet"/>
+      <w:lvlText w:val=""/>
+      <w:lvlJc w:val="left"/>
+      <w:pPr>
+        <w:tabs>
+          <w:tab w:val="num" w:pos="720"/>
+        </w:tabs>
+        <w:ind w:left="720" w:hanging="360"/>
+      </w:pPr>
+      <w:rPr>
+        <w:rFonts w:ascii="Symbol" w:hAnsi="Symbol" w:hint="default"/>
+        <w:sz w:val="20"/>
+      </w:rPr>
+    </w:lvl>
+    <w:lvl w:ilvl="1">
+      <w:start w:val="1"/>
+      <w:numFmt w:val="bullet"/>
+      <w:lvlText w:val="o"/>
+      <w:lvlJc w:val="left"/>
+      <w:pPr>
+        <w:tabs>
+          <w:tab w:val="num" w:pos="1440"/>
+        </w:tabs>
+        <w:ind w:left="1440" w:hanging="360"/>
+      </w:pPr>
+      <w:rPr>
+        <w:rFonts w:ascii="Courier New" w:hAnsi="Courier New" w:hint="default"/>
+        <w:sz w:val="20"/>
+      </w:rPr>
+    </w:lvl>
+    <w:lvl w:ilvl="2" w:tentative="1">
+      <w:start w:val="1"/>
+      <w:numFmt w:val="bullet"/>
+      <w:lvlText w:val=""/>
+      <w:lvlJc w:val="left"/>
+      <w:pPr>
+        <w:tabs>
+          <w:tab w:val="num" w:pos="2160"/>
+        </w:tabs>
+        <w:ind w:left="2160" w:hanging="360"/>
+      </w:pPr>
+      <w:rPr>
+        <w:rFonts w:ascii="Wingdings" w:hAnsi="Wingdings" w:hint="default"/>
+        <w:sz w:val="20"/>
+      </w:rPr>
+    </w:lvl>
+    <w:lvl w:ilvl="3" w:tentative="1">
+      <w:start w:val="1"/>
+      <w:numFmt w:val="bullet"/>
+      <w:lvlText w:val=""/>
+      <w:lvlJc w:val="left"/>
+      <w:pPr>
+        <w:tabs>
+          <w:tab w:val="num" w:pos="2880"/>
+        </w:tabs>
+        <w:ind w:left="2880" w:hanging="360"/>
+      </w:pPr>
+      <w:rPr>
+        <w:rFonts w:ascii="Wingdings" w:hAnsi="Wingdings" w:hint="default"/>
+        <w:sz w:val="20"/>
+      </w:rPr>
+    </w:lvl>
+    <w:lvl w:ilvl="4" w:tentative="1">
+      <w:start w:val="1"/>
+      <w:numFmt w:val="bullet"/>
+      <w:lvlText w:val=""/>
+      <w:lvlJc w:val="left"/>
+      <w:pPr>
+        <w:tabs>
+          <w:tab w:val="num" w:pos="3600"/>
+        </w:tabs>
+        <w:ind w:left="3600" w:hanging="360"/>
+      </w:pPr>
+      <w:rPr>
+        <w:rFonts w:ascii="Wingdings" w:hAnsi="Wingdings" w:hint="default"/>
+        <w:sz w:val="20"/>
+      </w:rPr>
+    </w:lvl>
+    <w:lvl w:ilvl="5" w:tentative="1">
+      <w:start w:val="1"/>
+      <w:numFmt w:val="bullet"/>
+      <w:lvlText w:val=""/>
+      <w:lvlJc w:val="left"/>
+      <w:pPr>
+        <w:tabs>
+          <w:tab w:val="num" w:pos="4320"/>
+        </w:tabs>
+        <w:ind w:left="4320" w:hanging="360"/>
+      </w:pPr>
+      <w:rPr>
+        <w:rFonts w:ascii="Wingdings" w:hAnsi="Wingdings" w:hint="default"/>
+        <w:sz w:val="20"/>
+      </w:rPr>
+    </w:lvl>
+    <w:lvl w:ilvl="6" w:tentative="1">
+      <w:start w:val="1"/>
+      <w:numFmt w:val="bullet"/>
+      <w:lvlText w:val=""/>
+      <w:lvlJc w:val="left"/>
+      <w:pPr>
+        <w:tabs>
+          <w:tab w:val="num" w:pos="5040"/>
+        </w:tabs>
+        <w:ind w:left="5040" w:hanging="360"/>
+      </w:pPr>
+      <w:rPr>
+        <w:rFonts w:ascii="Wingdings" w:hAnsi="Wingdings" w:hint="default"/>
+        <w:sz w:val="20"/>
+      </w:rPr>
+    </w:lvl>
+    <w:lvl w:ilvl="7" w:tentative="1">
+      <w:start w:val="1"/>
+      <w:numFmt w:val="bullet"/>
+      <w:lvlText w:val=""/>
+      <w:lvlJc w:val="left"/>
+      <w:pPr>
+        <w:tabs>
+          <w:tab w:val="num" w:pos="5760"/>
+        </w:tabs>
+        <w:ind w:left="5760" w:hanging="360"/>
+      </w:pPr>
+      <w:rPr>
+        <w:rFonts w:ascii="Wingdings" w:hAnsi="Wingdings" w:hint="default"/>
+        <w:sz w:val="20"/>
+      </w:rPr>
+    </w:lvl>
+    <w:lvl w:ilvl="8" w:tentative="1">
+      <w:start w:val="1"/>
+      <w:numFmt w:val="bullet"/>
+      <w:lvlText w:val=""/>
+      <w:lvlJc w:val="left"/>
+      <w:pPr>
+        <w:tabs>
+          <w:tab w:val="num" w:pos="6480"/>
+        </w:tabs>
+        <w:ind w:left="6480" w:hanging="360"/>
+      </w:pPr>
+      <w:rPr>
+        <w:rFonts w:ascii="Wingdings" w:hAnsi="Wingdings" w:hint="default"/>
+        <w:sz w:val="20"/>
+      </w:rPr>
+    </w:lvl>
+  </w:abstractNum>
+  <w:abstractNum w:abstractNumId="6" w15:restartNumberingAfterBreak="0">
     <w:nsid w:val="14802EF4"/>
     <w:multiLevelType w:val="multilevel"/>
     <w:tmpl w:val="25BE497E"/>
@@ -7033,7 +7983,7 @@
       </w:rPr>
     </w:lvl>
   </w:abstractNum>
-  <w:abstractNum w:abstractNumId="5" w15:restartNumberingAfterBreak="0">
+  <w:abstractNum w:abstractNumId="7" w15:restartNumberingAfterBreak="0">
     <w:nsid w:val="14B774A9"/>
     <w:multiLevelType w:val="multilevel"/>
     <w:tmpl w:val="A468B562"/>
@@ -7182,7 +8132,7 @@
       </w:rPr>
     </w:lvl>
   </w:abstractNum>
-  <w:abstractNum w:abstractNumId="6" w15:restartNumberingAfterBreak="0">
+  <w:abstractNum w:abstractNumId="8" w15:restartNumberingAfterBreak="0">
     <w:nsid w:val="14E0040C"/>
     <w:multiLevelType w:val="multilevel"/>
     <w:tmpl w:val="FE06C8D0"/>
@@ -7331,7 +8281,7 @@
       </w:rPr>
     </w:lvl>
   </w:abstractNum>
-  <w:abstractNum w:abstractNumId="7" w15:restartNumberingAfterBreak="0">
+  <w:abstractNum w:abstractNumId="9" w15:restartNumberingAfterBreak="0">
     <w:nsid w:val="179A1941"/>
     <w:multiLevelType w:val="multilevel"/>
     <w:tmpl w:val="17D00A7E"/>
@@ -7480,7 +8430,7 @@
       </w:rPr>
     </w:lvl>
   </w:abstractNum>
-  <w:abstractNum w:abstractNumId="8" w15:restartNumberingAfterBreak="0">
+  <w:abstractNum w:abstractNumId="10" w15:restartNumberingAfterBreak="0">
     <w:nsid w:val="1A0207E2"/>
     <w:multiLevelType w:val="multilevel"/>
     <w:tmpl w:val="56D8362C"/>
@@ -7593,7 +8543,7 @@
       </w:pPr>
     </w:lvl>
   </w:abstractNum>
-  <w:abstractNum w:abstractNumId="9" w15:restartNumberingAfterBreak="0">
+  <w:abstractNum w:abstractNumId="11" w15:restartNumberingAfterBreak="0">
     <w:nsid w:val="1DBF5F20"/>
     <w:multiLevelType w:val="multilevel"/>
     <w:tmpl w:val="1A12A100"/>
@@ -7742,7 +8692,7 @@
       </w:rPr>
     </w:lvl>
   </w:abstractNum>
-  <w:abstractNum w:abstractNumId="10" w15:restartNumberingAfterBreak="0">
+  <w:abstractNum w:abstractNumId="12" w15:restartNumberingAfterBreak="0">
     <w:nsid w:val="1E3E57E3"/>
     <w:multiLevelType w:val="multilevel"/>
     <w:tmpl w:val="F2B24F14"/>
@@ -7891,7 +8841,7 @@
       </w:rPr>
     </w:lvl>
   </w:abstractNum>
-  <w:abstractNum w:abstractNumId="11" w15:restartNumberingAfterBreak="0">
+  <w:abstractNum w:abstractNumId="13" w15:restartNumberingAfterBreak="0">
     <w:nsid w:val="1FCD3590"/>
     <w:multiLevelType w:val="multilevel"/>
     <w:tmpl w:val="33D25A94"/>
@@ -8040,7 +8990,7 @@
       </w:rPr>
     </w:lvl>
   </w:abstractNum>
-  <w:abstractNum w:abstractNumId="12" w15:restartNumberingAfterBreak="0">
+  <w:abstractNum w:abstractNumId="14" w15:restartNumberingAfterBreak="0">
     <w:nsid w:val="1FD852BF"/>
     <w:multiLevelType w:val="multilevel"/>
     <w:tmpl w:val="78EC6982"/>
@@ -8189,7 +9139,7 @@
       </w:rPr>
     </w:lvl>
   </w:abstractNum>
-  <w:abstractNum w:abstractNumId="13" w15:restartNumberingAfterBreak="0">
+  <w:abstractNum w:abstractNumId="15" w15:restartNumberingAfterBreak="0">
     <w:nsid w:val="214F1896"/>
     <w:multiLevelType w:val="multilevel"/>
     <w:tmpl w:val="D3F60152"/>
@@ -8338,7 +9288,7 @@
       </w:rPr>
     </w:lvl>
   </w:abstractNum>
-  <w:abstractNum w:abstractNumId="14" w15:restartNumberingAfterBreak="0">
+  <w:abstractNum w:abstractNumId="16" w15:restartNumberingAfterBreak="0">
     <w:nsid w:val="240E63BB"/>
     <w:multiLevelType w:val="multilevel"/>
     <w:tmpl w:val="9EC8E662"/>
@@ -8483,7 +9433,7 @@
       </w:rPr>
     </w:lvl>
   </w:abstractNum>
-  <w:abstractNum w:abstractNumId="15" w15:restartNumberingAfterBreak="0">
+  <w:abstractNum w:abstractNumId="17" w15:restartNumberingAfterBreak="0">
     <w:nsid w:val="24B86808"/>
     <w:multiLevelType w:val="multilevel"/>
     <w:tmpl w:val="9B4A0796"/>
@@ -8632,7 +9582,7 @@
       </w:rPr>
     </w:lvl>
   </w:abstractNum>
-  <w:abstractNum w:abstractNumId="16" w15:restartNumberingAfterBreak="0">
+  <w:abstractNum w:abstractNumId="18" w15:restartNumberingAfterBreak="0">
     <w:nsid w:val="251F49EA"/>
     <w:multiLevelType w:val="multilevel"/>
     <w:tmpl w:val="CAE8C108"/>
@@ -8781,7 +9731,7 @@
       </w:rPr>
     </w:lvl>
   </w:abstractNum>
-  <w:abstractNum w:abstractNumId="17" w15:restartNumberingAfterBreak="0">
+  <w:abstractNum w:abstractNumId="19" w15:restartNumberingAfterBreak="0">
     <w:nsid w:val="258F118F"/>
     <w:multiLevelType w:val="multilevel"/>
     <w:tmpl w:val="96862330"/>
@@ -8930,7 +9880,7 @@
       </w:rPr>
     </w:lvl>
   </w:abstractNum>
-  <w:abstractNum w:abstractNumId="18" w15:restartNumberingAfterBreak="0">
+  <w:abstractNum w:abstractNumId="20" w15:restartNumberingAfterBreak="0">
     <w:nsid w:val="26C20CD3"/>
     <w:multiLevelType w:val="multilevel"/>
     <w:tmpl w:val="62A6099E"/>
@@ -9079,7 +10029,7 @@
       </w:rPr>
     </w:lvl>
   </w:abstractNum>
-  <w:abstractNum w:abstractNumId="19" w15:restartNumberingAfterBreak="0">
+  <w:abstractNum w:abstractNumId="21" w15:restartNumberingAfterBreak="0">
     <w:nsid w:val="27495347"/>
     <w:multiLevelType w:val="multilevel"/>
     <w:tmpl w:val="37DA0990"/>
@@ -9228,7 +10178,7 @@
       </w:rPr>
     </w:lvl>
   </w:abstractNum>
-  <w:abstractNum w:abstractNumId="20" w15:restartNumberingAfterBreak="0">
+  <w:abstractNum w:abstractNumId="22" w15:restartNumberingAfterBreak="0">
     <w:nsid w:val="2B3B3F96"/>
     <w:multiLevelType w:val="multilevel"/>
     <w:tmpl w:val="2F00979A"/>
@@ -9377,7 +10327,156 @@
       </w:rPr>
     </w:lvl>
   </w:abstractNum>
-  <w:abstractNum w:abstractNumId="21" w15:restartNumberingAfterBreak="0">
+  <w:abstractNum w:abstractNumId="23" w15:restartNumberingAfterBreak="0">
+    <w:nsid w:val="2BE64FA3"/>
+    <w:multiLevelType w:val="multilevel"/>
+    <w:tmpl w:val="B2CCF318"/>
+    <w:lvl w:ilvl="0">
+      <w:start w:val="1"/>
+      <w:numFmt w:val="bullet"/>
+      <w:lvlText w:val=""/>
+      <w:lvlJc w:val="left"/>
+      <w:pPr>
+        <w:tabs>
+          <w:tab w:val="num" w:pos="720"/>
+        </w:tabs>
+        <w:ind w:left="720" w:hanging="360"/>
+      </w:pPr>
+      <w:rPr>
+        <w:rFonts w:ascii="Symbol" w:hAnsi="Symbol" w:hint="default"/>
+        <w:sz w:val="20"/>
+      </w:rPr>
+    </w:lvl>
+    <w:lvl w:ilvl="1" w:tentative="1">
+      <w:start w:val="1"/>
+      <w:numFmt w:val="bullet"/>
+      <w:lvlText w:val="o"/>
+      <w:lvlJc w:val="left"/>
+      <w:pPr>
+        <w:tabs>
+          <w:tab w:val="num" w:pos="1440"/>
+        </w:tabs>
+        <w:ind w:left="1440" w:hanging="360"/>
+      </w:pPr>
+      <w:rPr>
+        <w:rFonts w:ascii="Courier New" w:hAnsi="Courier New" w:hint="default"/>
+        <w:sz w:val="20"/>
+      </w:rPr>
+    </w:lvl>
+    <w:lvl w:ilvl="2" w:tentative="1">
+      <w:start w:val="1"/>
+      <w:numFmt w:val="bullet"/>
+      <w:lvlText w:val=""/>
+      <w:lvlJc w:val="left"/>
+      <w:pPr>
+        <w:tabs>
+          <w:tab w:val="num" w:pos="2160"/>
+        </w:tabs>
+        <w:ind w:left="2160" w:hanging="360"/>
+      </w:pPr>
+      <w:rPr>
+        <w:rFonts w:ascii="Wingdings" w:hAnsi="Wingdings" w:hint="default"/>
+        <w:sz w:val="20"/>
+      </w:rPr>
+    </w:lvl>
+    <w:lvl w:ilvl="3" w:tentative="1">
+      <w:start w:val="1"/>
+      <w:numFmt w:val="bullet"/>
+      <w:lvlText w:val=""/>
+      <w:lvlJc w:val="left"/>
+      <w:pPr>
+        <w:tabs>
+          <w:tab w:val="num" w:pos="2880"/>
+        </w:tabs>
+        <w:ind w:left="2880" w:hanging="360"/>
+      </w:pPr>
+      <w:rPr>
+        <w:rFonts w:ascii="Wingdings" w:hAnsi="Wingdings" w:hint="default"/>
+        <w:sz w:val="20"/>
+      </w:rPr>
+    </w:lvl>
+    <w:lvl w:ilvl="4" w:tentative="1">
+      <w:start w:val="1"/>
+      <w:numFmt w:val="bullet"/>
+      <w:lvlText w:val=""/>
+      <w:lvlJc w:val="left"/>
+      <w:pPr>
+        <w:tabs>
+          <w:tab w:val="num" w:pos="3600"/>
+        </w:tabs>
+        <w:ind w:left="3600" w:hanging="360"/>
+      </w:pPr>
+      <w:rPr>
+        <w:rFonts w:ascii="Wingdings" w:hAnsi="Wingdings" w:hint="default"/>
+        <w:sz w:val="20"/>
+      </w:rPr>
+    </w:lvl>
+    <w:lvl w:ilvl="5" w:tentative="1">
+      <w:start w:val="1"/>
+      <w:numFmt w:val="bullet"/>
+      <w:lvlText w:val=""/>
+      <w:lvlJc w:val="left"/>
+      <w:pPr>
+        <w:tabs>
+          <w:tab w:val="num" w:pos="4320"/>
+        </w:tabs>
+        <w:ind w:left="4320" w:hanging="360"/>
+      </w:pPr>
+      <w:rPr>
+        <w:rFonts w:ascii="Wingdings" w:hAnsi="Wingdings" w:hint="default"/>
+        <w:sz w:val="20"/>
+      </w:rPr>
+    </w:lvl>
+    <w:lvl w:ilvl="6" w:tentative="1">
+      <w:start w:val="1"/>
+      <w:numFmt w:val="bullet"/>
+      <w:lvlText w:val=""/>
+      <w:lvlJc w:val="left"/>
+      <w:pPr>
+        <w:tabs>
+          <w:tab w:val="num" w:pos="5040"/>
+        </w:tabs>
+        <w:ind w:left="5040" w:hanging="360"/>
+      </w:pPr>
+      <w:rPr>
+        <w:rFonts w:ascii="Wingdings" w:hAnsi="Wingdings" w:hint="default"/>
+        <w:sz w:val="20"/>
+      </w:rPr>
+    </w:lvl>
+    <w:lvl w:ilvl="7" w:tentative="1">
+      <w:start w:val="1"/>
+      <w:numFmt w:val="bullet"/>
+      <w:lvlText w:val=""/>
+      <w:lvlJc w:val="left"/>
+      <w:pPr>
+        <w:tabs>
+          <w:tab w:val="num" w:pos="5760"/>
+        </w:tabs>
+        <w:ind w:left="5760" w:hanging="360"/>
+      </w:pPr>
+      <w:rPr>
+        <w:rFonts w:ascii="Wingdings" w:hAnsi="Wingdings" w:hint="default"/>
+        <w:sz w:val="20"/>
+      </w:rPr>
+    </w:lvl>
+    <w:lvl w:ilvl="8" w:tentative="1">
+      <w:start w:val="1"/>
+      <w:numFmt w:val="bullet"/>
+      <w:lvlText w:val=""/>
+      <w:lvlJc w:val="left"/>
+      <w:pPr>
+        <w:tabs>
+          <w:tab w:val="num" w:pos="6480"/>
+        </w:tabs>
+        <w:ind w:left="6480" w:hanging="360"/>
+      </w:pPr>
+      <w:rPr>
+        <w:rFonts w:ascii="Wingdings" w:hAnsi="Wingdings" w:hint="default"/>
+        <w:sz w:val="20"/>
+      </w:rPr>
+    </w:lvl>
+  </w:abstractNum>
+  <w:abstractNum w:abstractNumId="24" w15:restartNumberingAfterBreak="0">
     <w:nsid w:val="2C766FCF"/>
     <w:multiLevelType w:val="multilevel"/>
     <w:tmpl w:val="66E4BDA0"/>
@@ -9526,7 +10625,7 @@
       </w:rPr>
     </w:lvl>
   </w:abstractNum>
-  <w:abstractNum w:abstractNumId="22" w15:restartNumberingAfterBreak="0">
+  <w:abstractNum w:abstractNumId="25" w15:restartNumberingAfterBreak="0">
     <w:nsid w:val="2D571952"/>
     <w:multiLevelType w:val="multilevel"/>
     <w:tmpl w:val="3DA66B84"/>
@@ -9675,7 +10774,7 @@
       </w:rPr>
     </w:lvl>
   </w:abstractNum>
-  <w:abstractNum w:abstractNumId="23" w15:restartNumberingAfterBreak="0">
+  <w:abstractNum w:abstractNumId="26" w15:restartNumberingAfterBreak="0">
     <w:nsid w:val="2F5E532E"/>
     <w:multiLevelType w:val="multilevel"/>
     <w:tmpl w:val="96B63F36"/>
@@ -9824,7 +10923,7 @@
       </w:rPr>
     </w:lvl>
   </w:abstractNum>
-  <w:abstractNum w:abstractNumId="24" w15:restartNumberingAfterBreak="0">
+  <w:abstractNum w:abstractNumId="27" w15:restartNumberingAfterBreak="0">
     <w:nsid w:val="31A003AF"/>
     <w:multiLevelType w:val="multilevel"/>
     <w:tmpl w:val="04F200F8"/>
@@ -9973,7 +11072,7 @@
       </w:rPr>
     </w:lvl>
   </w:abstractNum>
-  <w:abstractNum w:abstractNumId="25" w15:restartNumberingAfterBreak="0">
+  <w:abstractNum w:abstractNumId="28" w15:restartNumberingAfterBreak="0">
     <w:nsid w:val="31F36C73"/>
     <w:multiLevelType w:val="multilevel"/>
     <w:tmpl w:val="73EA5A92"/>
@@ -10122,7 +11221,7 @@
       </w:rPr>
     </w:lvl>
   </w:abstractNum>
-  <w:abstractNum w:abstractNumId="26" w15:restartNumberingAfterBreak="0">
+  <w:abstractNum w:abstractNumId="29" w15:restartNumberingAfterBreak="0">
     <w:nsid w:val="3A417D5F"/>
     <w:multiLevelType w:val="multilevel"/>
     <w:tmpl w:val="090C5218"/>
@@ -10271,7 +11370,156 @@
       </w:rPr>
     </w:lvl>
   </w:abstractNum>
-  <w:abstractNum w:abstractNumId="27" w15:restartNumberingAfterBreak="0">
+  <w:abstractNum w:abstractNumId="30" w15:restartNumberingAfterBreak="0">
+    <w:nsid w:val="441758D8"/>
+    <w:multiLevelType w:val="multilevel"/>
+    <w:tmpl w:val="38EC223A"/>
+    <w:lvl w:ilvl="0">
+      <w:start w:val="1"/>
+      <w:numFmt w:val="bullet"/>
+      <w:lvlText w:val=""/>
+      <w:lvlJc w:val="left"/>
+      <w:pPr>
+        <w:tabs>
+          <w:tab w:val="num" w:pos="720"/>
+        </w:tabs>
+        <w:ind w:left="720" w:hanging="360"/>
+      </w:pPr>
+      <w:rPr>
+        <w:rFonts w:ascii="Symbol" w:hAnsi="Symbol" w:hint="default"/>
+        <w:sz w:val="20"/>
+      </w:rPr>
+    </w:lvl>
+    <w:lvl w:ilvl="1">
+      <w:start w:val="1"/>
+      <w:numFmt w:val="bullet"/>
+      <w:lvlText w:val="o"/>
+      <w:lvlJc w:val="left"/>
+      <w:pPr>
+        <w:tabs>
+          <w:tab w:val="num" w:pos="1440"/>
+        </w:tabs>
+        <w:ind w:left="1440" w:hanging="360"/>
+      </w:pPr>
+      <w:rPr>
+        <w:rFonts w:ascii="Courier New" w:hAnsi="Courier New" w:hint="default"/>
+        <w:sz w:val="20"/>
+      </w:rPr>
+    </w:lvl>
+    <w:lvl w:ilvl="2" w:tentative="1">
+      <w:start w:val="1"/>
+      <w:numFmt w:val="bullet"/>
+      <w:lvlText w:val=""/>
+      <w:lvlJc w:val="left"/>
+      <w:pPr>
+        <w:tabs>
+          <w:tab w:val="num" w:pos="2160"/>
+        </w:tabs>
+        <w:ind w:left="2160" w:hanging="360"/>
+      </w:pPr>
+      <w:rPr>
+        <w:rFonts w:ascii="Wingdings" w:hAnsi="Wingdings" w:hint="default"/>
+        <w:sz w:val="20"/>
+      </w:rPr>
+    </w:lvl>
+    <w:lvl w:ilvl="3" w:tentative="1">
+      <w:start w:val="1"/>
+      <w:numFmt w:val="bullet"/>
+      <w:lvlText w:val=""/>
+      <w:lvlJc w:val="left"/>
+      <w:pPr>
+        <w:tabs>
+          <w:tab w:val="num" w:pos="2880"/>
+        </w:tabs>
+        <w:ind w:left="2880" w:hanging="360"/>
+      </w:pPr>
+      <w:rPr>
+        <w:rFonts w:ascii="Wingdings" w:hAnsi="Wingdings" w:hint="default"/>
+        <w:sz w:val="20"/>
+      </w:rPr>
+    </w:lvl>
+    <w:lvl w:ilvl="4" w:tentative="1">
+      <w:start w:val="1"/>
+      <w:numFmt w:val="bullet"/>
+      <w:lvlText w:val=""/>
+      <w:lvlJc w:val="left"/>
+      <w:pPr>
+        <w:tabs>
+          <w:tab w:val="num" w:pos="3600"/>
+        </w:tabs>
+        <w:ind w:left="3600" w:hanging="360"/>
+      </w:pPr>
+      <w:rPr>
+        <w:rFonts w:ascii="Wingdings" w:hAnsi="Wingdings" w:hint="default"/>
+        <w:sz w:val="20"/>
+      </w:rPr>
+    </w:lvl>
+    <w:lvl w:ilvl="5" w:tentative="1">
+      <w:start w:val="1"/>
+      <w:numFmt w:val="bullet"/>
+      <w:lvlText w:val=""/>
+      <w:lvlJc w:val="left"/>
+      <w:pPr>
+        <w:tabs>
+          <w:tab w:val="num" w:pos="4320"/>
+        </w:tabs>
+        <w:ind w:left="4320" w:hanging="360"/>
+      </w:pPr>
+      <w:rPr>
+        <w:rFonts w:ascii="Wingdings" w:hAnsi="Wingdings" w:hint="default"/>
+        <w:sz w:val="20"/>
+      </w:rPr>
+    </w:lvl>
+    <w:lvl w:ilvl="6" w:tentative="1">
+      <w:start w:val="1"/>
+      <w:numFmt w:val="bullet"/>
+      <w:lvlText w:val=""/>
+      <w:lvlJc w:val="left"/>
+      <w:pPr>
+        <w:tabs>
+          <w:tab w:val="num" w:pos="5040"/>
+        </w:tabs>
+        <w:ind w:left="5040" w:hanging="360"/>
+      </w:pPr>
+      <w:rPr>
+        <w:rFonts w:ascii="Wingdings" w:hAnsi="Wingdings" w:hint="default"/>
+        <w:sz w:val="20"/>
+      </w:rPr>
+    </w:lvl>
+    <w:lvl w:ilvl="7" w:tentative="1">
+      <w:start w:val="1"/>
+      <w:numFmt w:val="bullet"/>
+      <w:lvlText w:val=""/>
+      <w:lvlJc w:val="left"/>
+      <w:pPr>
+        <w:tabs>
+          <w:tab w:val="num" w:pos="5760"/>
+        </w:tabs>
+        <w:ind w:left="5760" w:hanging="360"/>
+      </w:pPr>
+      <w:rPr>
+        <w:rFonts w:ascii="Wingdings" w:hAnsi="Wingdings" w:hint="default"/>
+        <w:sz w:val="20"/>
+      </w:rPr>
+    </w:lvl>
+    <w:lvl w:ilvl="8" w:tentative="1">
+      <w:start w:val="1"/>
+      <w:numFmt w:val="bullet"/>
+      <w:lvlText w:val=""/>
+      <w:lvlJc w:val="left"/>
+      <w:pPr>
+        <w:tabs>
+          <w:tab w:val="num" w:pos="6480"/>
+        </w:tabs>
+        <w:ind w:left="6480" w:hanging="360"/>
+      </w:pPr>
+      <w:rPr>
+        <w:rFonts w:ascii="Wingdings" w:hAnsi="Wingdings" w:hint="default"/>
+        <w:sz w:val="20"/>
+      </w:rPr>
+    </w:lvl>
+  </w:abstractNum>
+  <w:abstractNum w:abstractNumId="31" w15:restartNumberingAfterBreak="0">
     <w:nsid w:val="49A50C0A"/>
     <w:multiLevelType w:val="multilevel"/>
     <w:tmpl w:val="38BAAE28"/>
@@ -10420,7 +11668,7 @@
       </w:rPr>
     </w:lvl>
   </w:abstractNum>
-  <w:abstractNum w:abstractNumId="28" w15:restartNumberingAfterBreak="0">
+  <w:abstractNum w:abstractNumId="32" w15:restartNumberingAfterBreak="0">
     <w:nsid w:val="4E7A589A"/>
     <w:multiLevelType w:val="multilevel"/>
     <w:tmpl w:val="A0D82AD2"/>
@@ -10569,7 +11817,7 @@
       </w:rPr>
     </w:lvl>
   </w:abstractNum>
-  <w:abstractNum w:abstractNumId="29" w15:restartNumberingAfterBreak="0">
+  <w:abstractNum w:abstractNumId="33" w15:restartNumberingAfterBreak="0">
     <w:nsid w:val="52530106"/>
     <w:multiLevelType w:val="multilevel"/>
     <w:tmpl w:val="DF9E4E90"/>
@@ -10718,7 +11966,7 @@
       </w:rPr>
     </w:lvl>
   </w:abstractNum>
-  <w:abstractNum w:abstractNumId="30" w15:restartNumberingAfterBreak="0">
+  <w:abstractNum w:abstractNumId="34" w15:restartNumberingAfterBreak="0">
     <w:nsid w:val="579B22F6"/>
     <w:multiLevelType w:val="multilevel"/>
     <w:tmpl w:val="E654B84C"/>
@@ -10867,7 +12115,7 @@
       </w:rPr>
     </w:lvl>
   </w:abstractNum>
-  <w:abstractNum w:abstractNumId="31" w15:restartNumberingAfterBreak="0">
+  <w:abstractNum w:abstractNumId="35" w15:restartNumberingAfterBreak="0">
     <w:nsid w:val="58021DC2"/>
     <w:multiLevelType w:val="multilevel"/>
     <w:tmpl w:val="82104120"/>
@@ -11016,7 +12264,7 @@
       </w:rPr>
     </w:lvl>
   </w:abstractNum>
-  <w:abstractNum w:abstractNumId="32" w15:restartNumberingAfterBreak="0">
+  <w:abstractNum w:abstractNumId="36" w15:restartNumberingAfterBreak="0">
     <w:nsid w:val="5A87367F"/>
     <w:multiLevelType w:val="multilevel"/>
     <w:tmpl w:val="C2CCA71C"/>
@@ -11165,7 +12413,156 @@
       </w:rPr>
     </w:lvl>
   </w:abstractNum>
-  <w:abstractNum w:abstractNumId="33" w15:restartNumberingAfterBreak="0">
+  <w:abstractNum w:abstractNumId="37" w15:restartNumberingAfterBreak="0">
+    <w:nsid w:val="5B4E151B"/>
+    <w:multiLevelType w:val="multilevel"/>
+    <w:tmpl w:val="DC9CCD4C"/>
+    <w:lvl w:ilvl="0">
+      <w:start w:val="1"/>
+      <w:numFmt w:val="bullet"/>
+      <w:lvlText w:val=""/>
+      <w:lvlJc w:val="left"/>
+      <w:pPr>
+        <w:tabs>
+          <w:tab w:val="num" w:pos="720"/>
+        </w:tabs>
+        <w:ind w:left="720" w:hanging="360"/>
+      </w:pPr>
+      <w:rPr>
+        <w:rFonts w:ascii="Symbol" w:hAnsi="Symbol" w:hint="default"/>
+        <w:sz w:val="20"/>
+      </w:rPr>
+    </w:lvl>
+    <w:lvl w:ilvl="1" w:tentative="1">
+      <w:start w:val="1"/>
+      <w:numFmt w:val="bullet"/>
+      <w:lvlText w:val="o"/>
+      <w:lvlJc w:val="left"/>
+      <w:pPr>
+        <w:tabs>
+          <w:tab w:val="num" w:pos="1440"/>
+        </w:tabs>
+        <w:ind w:left="1440" w:hanging="360"/>
+      </w:pPr>
+      <w:rPr>
+        <w:rFonts w:ascii="Courier New" w:hAnsi="Courier New" w:hint="default"/>
+        <w:sz w:val="20"/>
+      </w:rPr>
+    </w:lvl>
+    <w:lvl w:ilvl="2" w:tentative="1">
+      <w:start w:val="1"/>
+      <w:numFmt w:val="bullet"/>
+      <w:lvlText w:val=""/>
+      <w:lvlJc w:val="left"/>
+      <w:pPr>
+        <w:tabs>
+          <w:tab w:val="num" w:pos="2160"/>
+        </w:tabs>
+        <w:ind w:left="2160" w:hanging="360"/>
+      </w:pPr>
+      <w:rPr>
+        <w:rFonts w:ascii="Wingdings" w:hAnsi="Wingdings" w:hint="default"/>
+        <w:sz w:val="20"/>
+      </w:rPr>
+    </w:lvl>
+    <w:lvl w:ilvl="3" w:tentative="1">
+      <w:start w:val="1"/>
+      <w:numFmt w:val="bullet"/>
+      <w:lvlText w:val=""/>
+      <w:lvlJc w:val="left"/>
+      <w:pPr>
+        <w:tabs>
+          <w:tab w:val="num" w:pos="2880"/>
+        </w:tabs>
+        <w:ind w:left="2880" w:hanging="360"/>
+      </w:pPr>
+      <w:rPr>
+        <w:rFonts w:ascii="Wingdings" w:hAnsi="Wingdings" w:hint="default"/>
+        <w:sz w:val="20"/>
+      </w:rPr>
+    </w:lvl>
+    <w:lvl w:ilvl="4" w:tentative="1">
+      <w:start w:val="1"/>
+      <w:numFmt w:val="bullet"/>
+      <w:lvlText w:val=""/>
+      <w:lvlJc w:val="left"/>
+      <w:pPr>
+        <w:tabs>
+          <w:tab w:val="num" w:pos="3600"/>
+        </w:tabs>
+        <w:ind w:left="3600" w:hanging="360"/>
+      </w:pPr>
+      <w:rPr>
+        <w:rFonts w:ascii="Wingdings" w:hAnsi="Wingdings" w:hint="default"/>
+        <w:sz w:val="20"/>
+      </w:rPr>
+    </w:lvl>
+    <w:lvl w:ilvl="5" w:tentative="1">
+      <w:start w:val="1"/>
+      <w:numFmt w:val="bullet"/>
+      <w:lvlText w:val=""/>
+      <w:lvlJc w:val="left"/>
+      <w:pPr>
+        <w:tabs>
+          <w:tab w:val="num" w:pos="4320"/>
+        </w:tabs>
+        <w:ind w:left="4320" w:hanging="360"/>
+      </w:pPr>
+      <w:rPr>
+        <w:rFonts w:ascii="Wingdings" w:hAnsi="Wingdings" w:hint="default"/>
+        <w:sz w:val="20"/>
+      </w:rPr>
+    </w:lvl>
+    <w:lvl w:ilvl="6" w:tentative="1">
+      <w:start w:val="1"/>
+      <w:numFmt w:val="bullet"/>
+      <w:lvlText w:val=""/>
+      <w:lvlJc w:val="left"/>
+      <w:pPr>
+        <w:tabs>
+          <w:tab w:val="num" w:pos="5040"/>
+        </w:tabs>
+        <w:ind w:left="5040" w:hanging="360"/>
+      </w:pPr>
+      <w:rPr>
+        <w:rFonts w:ascii="Wingdings" w:hAnsi="Wingdings" w:hint="default"/>
+        <w:sz w:val="20"/>
+      </w:rPr>
+    </w:lvl>
+    <w:lvl w:ilvl="7" w:tentative="1">
+      <w:start w:val="1"/>
+      <w:numFmt w:val="bullet"/>
+      <w:lvlText w:val=""/>
+      <w:lvlJc w:val="left"/>
+      <w:pPr>
+        <w:tabs>
+          <w:tab w:val="num" w:pos="5760"/>
+        </w:tabs>
+        <w:ind w:left="5760" w:hanging="360"/>
+      </w:pPr>
+      <w:rPr>
+        <w:rFonts w:ascii="Wingdings" w:hAnsi="Wingdings" w:hint="default"/>
+        <w:sz w:val="20"/>
+      </w:rPr>
+    </w:lvl>
+    <w:lvl w:ilvl="8" w:tentative="1">
+      <w:start w:val="1"/>
+      <w:numFmt w:val="bullet"/>
+      <w:lvlText w:val=""/>
+      <w:lvlJc w:val="left"/>
+      <w:pPr>
+        <w:tabs>
+          <w:tab w:val="num" w:pos="6480"/>
+        </w:tabs>
+        <w:ind w:left="6480" w:hanging="360"/>
+      </w:pPr>
+      <w:rPr>
+        <w:rFonts w:ascii="Wingdings" w:hAnsi="Wingdings" w:hint="default"/>
+        <w:sz w:val="20"/>
+      </w:rPr>
+    </w:lvl>
+  </w:abstractNum>
+  <w:abstractNum w:abstractNumId="38" w15:restartNumberingAfterBreak="0">
     <w:nsid w:val="5ECE3F49"/>
     <w:multiLevelType w:val="multilevel"/>
     <w:tmpl w:val="1958B164"/>
@@ -11314,7 +12711,7 @@
       </w:rPr>
     </w:lvl>
   </w:abstractNum>
-  <w:abstractNum w:abstractNumId="34" w15:restartNumberingAfterBreak="0">
+  <w:abstractNum w:abstractNumId="39" w15:restartNumberingAfterBreak="0">
     <w:nsid w:val="60991102"/>
     <w:multiLevelType w:val="multilevel"/>
     <w:tmpl w:val="713EC634"/>
@@ -11463,7 +12860,7 @@
       </w:rPr>
     </w:lvl>
   </w:abstractNum>
-  <w:abstractNum w:abstractNumId="35" w15:restartNumberingAfterBreak="0">
+  <w:abstractNum w:abstractNumId="40" w15:restartNumberingAfterBreak="0">
     <w:nsid w:val="62302534"/>
     <w:multiLevelType w:val="multilevel"/>
     <w:tmpl w:val="F75AE8F0"/>
@@ -11612,7 +13009,7 @@
       </w:rPr>
     </w:lvl>
   </w:abstractNum>
-  <w:abstractNum w:abstractNumId="36" w15:restartNumberingAfterBreak="0">
+  <w:abstractNum w:abstractNumId="41" w15:restartNumberingAfterBreak="0">
     <w:nsid w:val="6CC173AC"/>
     <w:multiLevelType w:val="multilevel"/>
     <w:tmpl w:val="D67265CC"/>
@@ -11761,7 +13158,7 @@
       </w:rPr>
     </w:lvl>
   </w:abstractNum>
-  <w:abstractNum w:abstractNumId="37" w15:restartNumberingAfterBreak="0">
+  <w:abstractNum w:abstractNumId="42" w15:restartNumberingAfterBreak="0">
     <w:nsid w:val="6D814052"/>
     <w:multiLevelType w:val="multilevel"/>
     <w:tmpl w:val="8E04B6BC"/>
@@ -11910,7 +13307,7 @@
       </w:rPr>
     </w:lvl>
   </w:abstractNum>
-  <w:abstractNum w:abstractNumId="38" w15:restartNumberingAfterBreak="0">
+  <w:abstractNum w:abstractNumId="43" w15:restartNumberingAfterBreak="0">
     <w:nsid w:val="6D8C54B0"/>
     <w:multiLevelType w:val="multilevel"/>
     <w:tmpl w:val="37C4E3B2"/>
@@ -12059,7 +13456,7 @@
       </w:rPr>
     </w:lvl>
   </w:abstractNum>
-  <w:abstractNum w:abstractNumId="39" w15:restartNumberingAfterBreak="0">
+  <w:abstractNum w:abstractNumId="44" w15:restartNumberingAfterBreak="0">
     <w:nsid w:val="6E092798"/>
     <w:multiLevelType w:val="multilevel"/>
     <w:tmpl w:val="695ED14A"/>
@@ -12208,7 +13605,7 @@
       </w:rPr>
     </w:lvl>
   </w:abstractNum>
-  <w:abstractNum w:abstractNumId="40" w15:restartNumberingAfterBreak="0">
+  <w:abstractNum w:abstractNumId="45" w15:restartNumberingAfterBreak="0">
     <w:nsid w:val="703E5A5F"/>
     <w:multiLevelType w:val="multilevel"/>
     <w:tmpl w:val="77322966"/>
@@ -12357,7 +13754,7 @@
       </w:rPr>
     </w:lvl>
   </w:abstractNum>
-  <w:abstractNum w:abstractNumId="41" w15:restartNumberingAfterBreak="0">
+  <w:abstractNum w:abstractNumId="46" w15:restartNumberingAfterBreak="0">
     <w:nsid w:val="71870CE9"/>
     <w:multiLevelType w:val="multilevel"/>
     <w:tmpl w:val="0CFA3350"/>
@@ -12506,7 +13903,7 @@
       </w:rPr>
     </w:lvl>
   </w:abstractNum>
-  <w:abstractNum w:abstractNumId="42" w15:restartNumberingAfterBreak="0">
+  <w:abstractNum w:abstractNumId="47" w15:restartNumberingAfterBreak="0">
     <w:nsid w:val="7638144D"/>
     <w:multiLevelType w:val="multilevel"/>
     <w:tmpl w:val="21BE00E2"/>
@@ -12656,133 +14053,148 @@
     </w:lvl>
   </w:abstractNum>
   <w:num w:numId="1" w16cid:durableId="133527383">
-    <w:abstractNumId w:val="12"/>
+    <w:abstractNumId w:val="14"/>
   </w:num>
   <w:num w:numId="2" w16cid:durableId="1949894423">
-    <w:abstractNumId w:val="9"/>
+    <w:abstractNumId w:val="11"/>
   </w:num>
   <w:num w:numId="3" w16cid:durableId="1930195777">
-    <w:abstractNumId w:val="26"/>
+    <w:abstractNumId w:val="29"/>
   </w:num>
   <w:num w:numId="4" w16cid:durableId="701784512">
-    <w:abstractNumId w:val="29"/>
+    <w:abstractNumId w:val="33"/>
   </w:num>
   <w:num w:numId="5" w16cid:durableId="526992074">
-    <w:abstractNumId w:val="28"/>
+    <w:abstractNumId w:val="32"/>
   </w:num>
   <w:num w:numId="6" w16cid:durableId="212471105">
-    <w:abstractNumId w:val="5"/>
+    <w:abstractNumId w:val="7"/>
   </w:num>
   <w:num w:numId="7" w16cid:durableId="1772428672">
-    <w:abstractNumId w:val="7"/>
+    <w:abstractNumId w:val="9"/>
   </w:num>
   <w:num w:numId="8" w16cid:durableId="1805078313">
     <w:abstractNumId w:val="1"/>
   </w:num>
   <w:num w:numId="9" w16cid:durableId="444928011">
-    <w:abstractNumId w:val="22"/>
+    <w:abstractNumId w:val="25"/>
   </w:num>
   <w:num w:numId="10" w16cid:durableId="1814977998">
-    <w:abstractNumId w:val="16"/>
+    <w:abstractNumId w:val="18"/>
   </w:num>
   <w:num w:numId="11" w16cid:durableId="519202613">
     <w:abstractNumId w:val="0"/>
   </w:num>
   <w:num w:numId="12" w16cid:durableId="1172335234">
-    <w:abstractNumId w:val="23"/>
+    <w:abstractNumId w:val="26"/>
   </w:num>
   <w:num w:numId="13" w16cid:durableId="1352297192">
-    <w:abstractNumId w:val="27"/>
+    <w:abstractNumId w:val="31"/>
   </w:num>
   <w:num w:numId="14" w16cid:durableId="480117175">
-    <w:abstractNumId w:val="18"/>
+    <w:abstractNumId w:val="20"/>
   </w:num>
   <w:num w:numId="15" w16cid:durableId="1089472372">
     <w:abstractNumId w:val="2"/>
   </w:num>
   <w:num w:numId="16" w16cid:durableId="1190683533">
+    <w:abstractNumId w:val="10"/>
+  </w:num>
+  <w:num w:numId="17" w16cid:durableId="1749692753">
+    <w:abstractNumId w:val="34"/>
+  </w:num>
+  <w:num w:numId="18" w16cid:durableId="212621603">
+    <w:abstractNumId w:val="24"/>
+  </w:num>
+  <w:num w:numId="19" w16cid:durableId="2031570090">
+    <w:abstractNumId w:val="38"/>
+  </w:num>
+  <w:num w:numId="20" w16cid:durableId="1560634624">
+    <w:abstractNumId w:val="41"/>
+  </w:num>
+  <w:num w:numId="21" w16cid:durableId="1750153203">
+    <w:abstractNumId w:val="43"/>
+  </w:num>
+  <w:num w:numId="22" w16cid:durableId="927928201">
+    <w:abstractNumId w:val="22"/>
+  </w:num>
+  <w:num w:numId="23" w16cid:durableId="1266961602">
+    <w:abstractNumId w:val="27"/>
+  </w:num>
+  <w:num w:numId="24" w16cid:durableId="2082830000">
+    <w:abstractNumId w:val="40"/>
+  </w:num>
+  <w:num w:numId="25" w16cid:durableId="394933328">
+    <w:abstractNumId w:val="12"/>
+  </w:num>
+  <w:num w:numId="26" w16cid:durableId="2072076955">
+    <w:abstractNumId w:val="28"/>
+  </w:num>
+  <w:num w:numId="27" w16cid:durableId="2102527872">
+    <w:abstractNumId w:val="16"/>
+  </w:num>
+  <w:num w:numId="28" w16cid:durableId="702286492">
+    <w:abstractNumId w:val="47"/>
+  </w:num>
+  <w:num w:numId="29" w16cid:durableId="799610513">
+    <w:abstractNumId w:val="17"/>
+  </w:num>
+  <w:num w:numId="30" w16cid:durableId="1554388454">
+    <w:abstractNumId w:val="44"/>
+  </w:num>
+  <w:num w:numId="31" w16cid:durableId="1813935859">
+    <w:abstractNumId w:val="35"/>
+  </w:num>
+  <w:num w:numId="32" w16cid:durableId="965354912">
+    <w:abstractNumId w:val="13"/>
+  </w:num>
+  <w:num w:numId="33" w16cid:durableId="492528333">
+    <w:abstractNumId w:val="21"/>
+  </w:num>
+  <w:num w:numId="34" w16cid:durableId="859709163">
     <w:abstractNumId w:val="8"/>
   </w:num>
-  <w:num w:numId="17" w16cid:durableId="1749692753">
-    <w:abstractNumId w:val="30"/>
+  <w:num w:numId="35" w16cid:durableId="730618573">
+    <w:abstractNumId w:val="39"/>
   </w:num>
-  <w:num w:numId="18" w16cid:durableId="212621603">
-    <w:abstractNumId w:val="21"/>
+  <w:num w:numId="36" w16cid:durableId="649753194">
+    <w:abstractNumId w:val="19"/>
   </w:num>
-  <w:num w:numId="19" w16cid:durableId="2031570090">
-    <w:abstractNumId w:val="33"/>
+  <w:num w:numId="37" w16cid:durableId="2109081722">
+    <w:abstractNumId w:val="15"/>
   </w:num>
-  <w:num w:numId="20" w16cid:durableId="1560634624">
+  <w:num w:numId="38" w16cid:durableId="63725760">
+    <w:abstractNumId w:val="46"/>
+  </w:num>
+  <w:num w:numId="39" w16cid:durableId="1181966156">
+    <w:abstractNumId w:val="45"/>
+  </w:num>
+  <w:num w:numId="40" w16cid:durableId="586816399">
     <w:abstractNumId w:val="36"/>
   </w:num>
-  <w:num w:numId="21" w16cid:durableId="1750153203">
-    <w:abstractNumId w:val="38"/>
-  </w:num>
-  <w:num w:numId="22" w16cid:durableId="927928201">
-    <w:abstractNumId w:val="20"/>
-  </w:num>
-  <w:num w:numId="23" w16cid:durableId="1266961602">
-    <w:abstractNumId w:val="24"/>
-  </w:num>
-  <w:num w:numId="24" w16cid:durableId="2082830000">
-    <w:abstractNumId w:val="35"/>
-  </w:num>
-  <w:num w:numId="25" w16cid:durableId="394933328">
-    <w:abstractNumId w:val="10"/>
-  </w:num>
-  <w:num w:numId="26" w16cid:durableId="2072076955">
-    <w:abstractNumId w:val="25"/>
-  </w:num>
-  <w:num w:numId="27" w16cid:durableId="2102527872">
-    <w:abstractNumId w:val="14"/>
-  </w:num>
-  <w:num w:numId="28" w16cid:durableId="702286492">
+  <w:num w:numId="41" w16cid:durableId="2045909470">
     <w:abstractNumId w:val="42"/>
   </w:num>
-  <w:num w:numId="29" w16cid:durableId="799610513">
-    <w:abstractNumId w:val="15"/>
-  </w:num>
-  <w:num w:numId="30" w16cid:durableId="1554388454">
-    <w:abstractNumId w:val="39"/>
-  </w:num>
-  <w:num w:numId="31" w16cid:durableId="1813935859">
-    <w:abstractNumId w:val="31"/>
-  </w:num>
-  <w:num w:numId="32" w16cid:durableId="965354912">
-    <w:abstractNumId w:val="11"/>
-  </w:num>
-  <w:num w:numId="33" w16cid:durableId="492528333">
-    <w:abstractNumId w:val="19"/>
-  </w:num>
-  <w:num w:numId="34" w16cid:durableId="859709163">
+  <w:num w:numId="42" w16cid:durableId="1735006032">
     <w:abstractNumId w:val="6"/>
-  </w:num>
-  <w:num w:numId="35" w16cid:durableId="730618573">
-    <w:abstractNumId w:val="34"/>
-  </w:num>
-  <w:num w:numId="36" w16cid:durableId="649753194">
-    <w:abstractNumId w:val="17"/>
-  </w:num>
-  <w:num w:numId="37" w16cid:durableId="2109081722">
-    <w:abstractNumId w:val="13"/>
-  </w:num>
-  <w:num w:numId="38" w16cid:durableId="63725760">
-    <w:abstractNumId w:val="41"/>
-  </w:num>
-  <w:num w:numId="39" w16cid:durableId="1181966156">
-    <w:abstractNumId w:val="40"/>
-  </w:num>
-  <w:num w:numId="40" w16cid:durableId="586816399">
-    <w:abstractNumId w:val="32"/>
-  </w:num>
-  <w:num w:numId="41" w16cid:durableId="2045909470">
-    <w:abstractNumId w:val="37"/>
-  </w:num>
-  <w:num w:numId="42" w16cid:durableId="1735006032">
-    <w:abstractNumId w:val="4"/>
   </w:num>
   <w:num w:numId="43" w16cid:durableId="1083381784">
     <w:abstractNumId w:val="3"/>
+  </w:num>
+  <w:num w:numId="44" w16cid:durableId="919950318">
+    <w:abstractNumId w:val="5"/>
+  </w:num>
+  <w:num w:numId="45" w16cid:durableId="1074742468">
+    <w:abstractNumId w:val="23"/>
+  </w:num>
+  <w:num w:numId="46" w16cid:durableId="641811098">
+    <w:abstractNumId w:val="30"/>
+  </w:num>
+  <w:num w:numId="47" w16cid:durableId="1164391450">
+    <w:abstractNumId w:val="37"/>
+  </w:num>
+  <w:num w:numId="48" w16cid:durableId="1894346074">
+    <w:abstractNumId w:val="4"/>
   </w:num>
 </w:numbering>
 </file>

</xml_diff>

<commit_message>
feat: add language & category grouping, fix duplicate answer options handling
</commit_message>
<xml_diff>
--- a/SESSION.md.docx
+++ b/SESSION.md.docx
@@ -640,19 +640,6 @@
           <w14:ligatures w14:val="none"/>
         </w:rPr>
       </w:pPr>
-      <w:r>
-        <w:rPr>
-          <w:rFonts w:ascii="Times New Roman" w:eastAsia="Times New Roman" w:hAnsi="Times New Roman" w:cs="Times New Roman"/>
-          <w:kern w:val="0"/>
-          <w:sz w:val="24"/>
-          <w:szCs w:val="24"/>
-          <w:lang w:val="en-GB" w:eastAsia="en-GB"/>
-          <w14:ligatures w14:val="none"/>
-        </w:rPr>
-        <w:pict w14:anchorId="0EBDB9E2">
-          <v:rect id="_x0000_i1026" style="width:0;height:1.5pt" o:hralign="center" o:hrstd="t" o:hr="t" fillcolor="#a0a0a0" stroked="f"/>
-        </w:pict>
-      </w:r>
     </w:p>
     <w:p>
       <w:pPr>
@@ -1049,20 +1036,6 @@
           <w14:ligatures w14:val="none"/>
         </w:rPr>
       </w:pPr>
-      <w:r>
-        <w:rPr>
-          <w:rFonts w:ascii="Times New Roman" w:eastAsia="Times New Roman" w:hAnsi="Times New Roman" w:cs="Times New Roman"/>
-          <w:kern w:val="0"/>
-          <w:sz w:val="24"/>
-          <w:szCs w:val="24"/>
-          <w:lang w:val="en-GB" w:eastAsia="en-GB"/>
-          <w14:ligatures w14:val="none"/>
-        </w:rPr>
-        <w:lastRenderedPageBreak/>
-        <w:pict w14:anchorId="1F90DAF6">
-          <v:rect id="_x0000_i1027" style="width:0;height:1.5pt" o:hralign="center" o:hrstd="t" o:hr="t" fillcolor="#a0a0a0" stroked="f"/>
-        </w:pict>
-      </w:r>
     </w:p>
     <w:p>
       <w:pPr>
@@ -1271,9 +1244,8 @@
           <w14:ligatures w14:val="none"/>
         </w:rPr>
         <w:br/>
-        <w:t xml:space="preserve">  level: </w:t>
-      </w:r>
-      <w:proofErr w:type="gramStart"/>
+        <w:t xml:space="preserve">  level: { key, label, min, max } | null</w:t>
+      </w:r>
       <w:r>
         <w:rPr>
           <w:rFonts w:ascii="Courier New" w:eastAsia="Times New Roman" w:hAnsi="Courier New" w:cs="Courier New"/>
@@ -1283,79 +1255,8 @@
           <w:lang w:val="en-GB" w:eastAsia="en-GB"/>
           <w14:ligatures w14:val="none"/>
         </w:rPr>
-        <w:t>{ key</w:t>
-      </w:r>
-      <w:proofErr w:type="gramEnd"/>
-      <w:r>
-        <w:rPr>
-          <w:rFonts w:ascii="Courier New" w:eastAsia="Times New Roman" w:hAnsi="Courier New" w:cs="Courier New"/>
-          <w:kern w:val="0"/>
-          <w:sz w:val="20"/>
-          <w:szCs w:val="20"/>
-          <w:lang w:val="en-GB" w:eastAsia="en-GB"/>
-          <w14:ligatures w14:val="none"/>
-        </w:rPr>
-        <w:t xml:space="preserve">, label, min, </w:t>
-      </w:r>
-      <w:proofErr w:type="gramStart"/>
-      <w:r>
-        <w:rPr>
-          <w:rFonts w:ascii="Courier New" w:eastAsia="Times New Roman" w:hAnsi="Courier New" w:cs="Courier New"/>
-          <w:kern w:val="0"/>
-          <w:sz w:val="20"/>
-          <w:szCs w:val="20"/>
-          <w:lang w:val="en-GB" w:eastAsia="en-GB"/>
-          <w14:ligatures w14:val="none"/>
-        </w:rPr>
-        <w:t>max }</w:t>
-      </w:r>
-      <w:proofErr w:type="gramEnd"/>
-      <w:r>
-        <w:rPr>
-          <w:rFonts w:ascii="Courier New" w:eastAsia="Times New Roman" w:hAnsi="Courier New" w:cs="Courier New"/>
-          <w:kern w:val="0"/>
-          <w:sz w:val="20"/>
-          <w:szCs w:val="20"/>
-          <w:lang w:val="en-GB" w:eastAsia="en-GB"/>
-          <w14:ligatures w14:val="none"/>
-        </w:rPr>
-        <w:t xml:space="preserve"> | null</w:t>
-      </w:r>
-      <w:r>
-        <w:rPr>
-          <w:rFonts w:ascii="Courier New" w:eastAsia="Times New Roman" w:hAnsi="Courier New" w:cs="Courier New"/>
-          <w:kern w:val="0"/>
-          <w:sz w:val="20"/>
-          <w:szCs w:val="20"/>
-          <w:lang w:val="en-GB" w:eastAsia="en-GB"/>
-          <w14:ligatures w14:val="none"/>
-        </w:rPr>
         <w:br/>
-        <w:t xml:space="preserve">  </w:t>
-      </w:r>
-      <w:proofErr w:type="gramStart"/>
-      <w:r>
-        <w:rPr>
-          <w:rFonts w:ascii="Courier New" w:eastAsia="Times New Roman" w:hAnsi="Courier New" w:cs="Courier New"/>
-          <w:kern w:val="0"/>
-          <w:sz w:val="20"/>
-          <w:szCs w:val="20"/>
-          <w:lang w:val="en-GB" w:eastAsia="en-GB"/>
-          <w14:ligatures w14:val="none"/>
-        </w:rPr>
-        <w:t>subscales?:</w:t>
-      </w:r>
-      <w:proofErr w:type="gramEnd"/>
-      <w:r>
-        <w:rPr>
-          <w:rFonts w:ascii="Courier New" w:eastAsia="Times New Roman" w:hAnsi="Courier New" w:cs="Courier New"/>
-          <w:kern w:val="0"/>
-          <w:sz w:val="20"/>
-          <w:szCs w:val="20"/>
-          <w:lang w:val="en-GB" w:eastAsia="en-GB"/>
-          <w14:ligatures w14:val="none"/>
-        </w:rPr>
-        <w:t xml:space="preserve"> [...]</w:t>
+        <w:t xml:space="preserve">  subscales?: [...]</w:t>
       </w:r>
       <w:r>
         <w:rPr>
@@ -1545,19 +1446,6 @@
           <w14:ligatures w14:val="none"/>
         </w:rPr>
       </w:pPr>
-      <w:r>
-        <w:rPr>
-          <w:rFonts w:ascii="Times New Roman" w:eastAsia="Times New Roman" w:hAnsi="Times New Roman" w:cs="Times New Roman"/>
-          <w:kern w:val="0"/>
-          <w:sz w:val="24"/>
-          <w:szCs w:val="24"/>
-          <w:lang w:val="en-GB" w:eastAsia="en-GB"/>
-          <w14:ligatures w14:val="none"/>
-        </w:rPr>
-        <w:pict w14:anchorId="132CCA44">
-          <v:rect id="_x0000_i1028" style="width:0;height:1.5pt" o:hralign="center" o:hrstd="t" o:hr="t" fillcolor="#a0a0a0" stroked="f"/>
-        </w:pict>
-      </w:r>
     </w:p>
     <w:p>
       <w:pPr>
@@ -2062,20 +1950,6 @@
           <w14:ligatures w14:val="none"/>
         </w:rPr>
       </w:pPr>
-      <w:r>
-        <w:rPr>
-          <w:rFonts w:ascii="Times New Roman" w:eastAsia="Times New Roman" w:hAnsi="Times New Roman" w:cs="Times New Roman"/>
-          <w:kern w:val="0"/>
-          <w:sz w:val="24"/>
-          <w:szCs w:val="24"/>
-          <w:lang w:val="en-GB" w:eastAsia="en-GB"/>
-          <w14:ligatures w14:val="none"/>
-        </w:rPr>
-        <w:lastRenderedPageBreak/>
-        <w:pict w14:anchorId="38583D57">
-          <v:rect id="_x0000_i1029" style="width:0;height:1.5pt" o:hralign="center" o:hrstd="t" o:hr="t" fillcolor="#a0a0a0" stroked="f"/>
-        </w:pict>
-      </w:r>
     </w:p>
     <w:p>
       <w:pPr>
@@ -2355,19 +2229,6 @@
           <w14:ligatures w14:val="none"/>
         </w:rPr>
       </w:pPr>
-      <w:r>
-        <w:rPr>
-          <w:rFonts w:ascii="Times New Roman" w:eastAsia="Times New Roman" w:hAnsi="Times New Roman" w:cs="Times New Roman"/>
-          <w:kern w:val="0"/>
-          <w:sz w:val="24"/>
-          <w:szCs w:val="24"/>
-          <w:lang w:val="en-GB" w:eastAsia="en-GB"/>
-          <w14:ligatures w14:val="none"/>
-        </w:rPr>
-        <w:pict w14:anchorId="2C35F3A5">
-          <v:rect id="_x0000_i1030" style="width:0;height:1.5pt" o:hralign="center" o:hrstd="t" o:hr="t" fillcolor="#a0a0a0" stroked="f"/>
-        </w:pict>
-      </w:r>
     </w:p>
     <w:p>
       <w:pPr>
@@ -2436,19 +2297,7 @@
           <w:lang w:val="en-GB" w:eastAsia="en-GB"/>
           <w14:ligatures w14:val="none"/>
         </w:rPr>
-        <w:t>CSS build error (</w:t>
-      </w:r>
-      <w:proofErr w:type="gramStart"/>
-      <w:r>
-        <w:rPr>
-          <w:rFonts w:ascii="Times New Roman" w:eastAsia="Times New Roman" w:hAnsi="Times New Roman" w:cs="Times New Roman"/>
-          <w:kern w:val="0"/>
-          <w:sz w:val="24"/>
-          <w:szCs w:val="24"/>
-          <w:lang w:val="en-GB" w:eastAsia="en-GB"/>
-          <w14:ligatures w14:val="none"/>
-        </w:rPr>
-        <w:t xml:space="preserve">extra </w:t>
+        <w:t xml:space="preserve">CSS build error (extra </w:t>
       </w:r>
       <w:r>
         <w:rPr>
@@ -2461,7 +2310,6 @@
         </w:rPr>
         <w:t>}</w:t>
       </w:r>
-      <w:proofErr w:type="gramEnd"/>
       <w:r>
         <w:rPr>
           <w:rFonts w:ascii="Times New Roman" w:eastAsia="Times New Roman" w:hAnsi="Times New Roman" w:cs="Times New Roman"/>
@@ -2626,19 +2474,6 @@
           <w14:ligatures w14:val="none"/>
         </w:rPr>
       </w:pPr>
-      <w:r>
-        <w:rPr>
-          <w:rFonts w:ascii="Times New Roman" w:eastAsia="Times New Roman" w:hAnsi="Times New Roman" w:cs="Times New Roman"/>
-          <w:kern w:val="0"/>
-          <w:sz w:val="24"/>
-          <w:szCs w:val="24"/>
-          <w:lang w:val="en-GB" w:eastAsia="en-GB"/>
-          <w14:ligatures w14:val="none"/>
-        </w:rPr>
-        <w:pict w14:anchorId="2CD0CDE5">
-          <v:rect id="_x0000_i1031" style="width:0;height:1.5pt" o:hralign="center" o:hrstd="t" o:hr="t" fillcolor="#a0a0a0" stroked="f"/>
-        </w:pict>
-      </w:r>
     </w:p>
     <w:p>
       <w:pPr>
@@ -2822,19 +2657,6 @@
           <w14:ligatures w14:val="none"/>
         </w:rPr>
       </w:pPr>
-      <w:r>
-        <w:rPr>
-          <w:rFonts w:ascii="Times New Roman" w:eastAsia="Times New Roman" w:hAnsi="Times New Roman" w:cs="Times New Roman"/>
-          <w:kern w:val="0"/>
-          <w:sz w:val="24"/>
-          <w:szCs w:val="24"/>
-          <w:lang w:val="en-GB" w:eastAsia="en-GB"/>
-          <w14:ligatures w14:val="none"/>
-        </w:rPr>
-        <w:pict w14:anchorId="61779292">
-          <v:rect id="_x0000_i1032" style="width:0;height:1.5pt" o:hralign="center" o:hrstd="t" o:hr="t" fillcolor="#a0a0a0" stroked="f"/>
-        </w:pict>
-      </w:r>
     </w:p>
     <w:p>
       <w:pPr>
@@ -3041,9 +2863,9 @@
           <w14:ligatures w14:val="none"/>
         </w:rPr>
         <w:br/>
-        <w:t xml:space="preserve">      </w:t>
-      </w:r>
-      <w:proofErr w:type="gramStart"/>
+        <w:t xml:space="preserve">      *.</w:t>
+      </w:r>
+      <w:proofErr w:type="spellStart"/>
       <w:r>
         <w:rPr>
           <w:rFonts w:ascii="Courier New" w:eastAsia="Times New Roman" w:hAnsi="Courier New" w:cs="Courier New"/>
@@ -3053,22 +2875,9 @@
           <w:lang w:val="en-GB" w:eastAsia="en-GB"/>
           <w14:ligatures w14:val="none"/>
         </w:rPr>
-        <w:t>*.</w:t>
-      </w:r>
-      <w:proofErr w:type="spellStart"/>
-      <w:r>
-        <w:rPr>
-          <w:rFonts w:ascii="Courier New" w:eastAsia="Times New Roman" w:hAnsi="Courier New" w:cs="Courier New"/>
-          <w:kern w:val="0"/>
-          <w:sz w:val="20"/>
-          <w:szCs w:val="20"/>
-          <w:lang w:val="en-GB" w:eastAsia="en-GB"/>
-          <w14:ligatures w14:val="none"/>
-        </w:rPr>
         <w:t>json</w:t>
       </w:r>
       <w:proofErr w:type="spellEnd"/>
-      <w:proofErr w:type="gramEnd"/>
       <w:r>
         <w:rPr>
           <w:rFonts w:ascii="Courier New" w:eastAsia="Times New Roman" w:hAnsi="Courier New" w:cs="Courier New"/>
@@ -3343,19 +3152,6 @@
           <w14:ligatures w14:val="none"/>
         </w:rPr>
       </w:pPr>
-      <w:r>
-        <w:rPr>
-          <w:rFonts w:ascii="Times New Roman" w:eastAsia="Times New Roman" w:hAnsi="Times New Roman" w:cs="Times New Roman"/>
-          <w:kern w:val="0"/>
-          <w:sz w:val="24"/>
-          <w:szCs w:val="24"/>
-          <w:lang w:val="en-GB" w:eastAsia="en-GB"/>
-          <w14:ligatures w14:val="none"/>
-        </w:rPr>
-        <w:pict w14:anchorId="5CBFDEA1">
-          <v:rect id="_x0000_i1034" style="width:0;height:1.5pt" o:hralign="center" o:hrstd="t" o:hr="t" fillcolor="#a0a0a0" stroked="f"/>
-        </w:pict>
-      </w:r>
     </w:p>
     <w:p>
       <w:pPr>
@@ -3688,19 +3484,6 @@
           <w14:ligatures w14:val="none"/>
         </w:rPr>
       </w:pPr>
-      <w:r>
-        <w:rPr>
-          <w:rFonts w:ascii="Times New Roman" w:eastAsia="Times New Roman" w:hAnsi="Times New Roman" w:cs="Times New Roman"/>
-          <w:kern w:val="0"/>
-          <w:sz w:val="24"/>
-          <w:szCs w:val="24"/>
-          <w:lang w:val="en-GB" w:eastAsia="en-GB"/>
-          <w14:ligatures w14:val="none"/>
-        </w:rPr>
-        <w:pict w14:anchorId="47CCB083">
-          <v:rect id="_x0000_i1035" style="width:0;height:1.5pt" o:hralign="center" o:hrstd="t" o:hr="t" fillcolor="#a0a0a0" stroked="f"/>
-        </w:pict>
-      </w:r>
     </w:p>
     <w:p>
       <w:pPr>
@@ -3924,19 +3707,6 @@
           <w14:ligatures w14:val="none"/>
         </w:rPr>
       </w:pPr>
-      <w:r>
-        <w:rPr>
-          <w:rFonts w:ascii="Times New Roman" w:eastAsia="Times New Roman" w:hAnsi="Times New Roman" w:cs="Times New Roman"/>
-          <w:kern w:val="0"/>
-          <w:sz w:val="24"/>
-          <w:szCs w:val="24"/>
-          <w:lang w:val="en-GB" w:eastAsia="en-GB"/>
-          <w14:ligatures w14:val="none"/>
-        </w:rPr>
-        <w:pict w14:anchorId="129C6C42">
-          <v:rect id="_x0000_i1036" style="width:0;height:1.5pt" o:hralign="center" o:hrstd="t" o:hr="t" fillcolor="#a0a0a0" stroked="f"/>
-        </w:pict>
-      </w:r>
     </w:p>
     <w:p>
       <w:pPr>
@@ -4395,19 +4165,6 @@
           <w14:ligatures w14:val="none"/>
         </w:rPr>
       </w:pPr>
-      <w:r>
-        <w:rPr>
-          <w:rFonts w:ascii="Times New Roman" w:eastAsia="Times New Roman" w:hAnsi="Times New Roman" w:cs="Times New Roman"/>
-          <w:kern w:val="0"/>
-          <w:sz w:val="24"/>
-          <w:szCs w:val="24"/>
-          <w:lang w:val="en-GB" w:eastAsia="en-GB"/>
-          <w14:ligatures w14:val="none"/>
-        </w:rPr>
-        <w:pict w14:anchorId="15F1CB37">
-          <v:rect id="_x0000_i1037" style="width:0;height:1.5pt" o:hralign="center" o:hrstd="t" o:hr="t" fillcolor="#a0a0a0" stroked="f"/>
-        </w:pict>
-      </w:r>
     </w:p>
     <w:p>
       <w:pPr>
@@ -4564,6 +4321,19 @@
           <w14:ligatures w14:val="none"/>
         </w:rPr>
       </w:pPr>
+      <w:r>
+        <w:rPr>
+          <w:rFonts w:ascii="Times New Roman" w:eastAsia="Times New Roman" w:hAnsi="Times New Roman" w:cs="Times New Roman"/>
+          <w:kern w:val="0"/>
+          <w:sz w:val="24"/>
+          <w:szCs w:val="24"/>
+          <w:lang w:val="en-GB" w:eastAsia="en-GB"/>
+          <w14:ligatures w14:val="none"/>
+        </w:rPr>
+        <w:pict w14:anchorId="68C65A6D">
+          <v:rect id="_x0000_i1066" style="width:0;height:1.5pt" o:hralign="center" o:hrstd="t" o:hr="t" fillcolor="#a0a0a0" stroked="f"/>
+        </w:pict>
+      </w:r>
     </w:p>
     <w:p>
       <w:pPr>
@@ -4750,19 +4520,6 @@
           <w14:ligatures w14:val="none"/>
         </w:rPr>
       </w:pPr>
-      <w:r>
-        <w:rPr>
-          <w:rFonts w:ascii="Times New Roman" w:eastAsia="Times New Roman" w:hAnsi="Times New Roman" w:cs="Times New Roman"/>
-          <w:kern w:val="0"/>
-          <w:sz w:val="24"/>
-          <w:szCs w:val="24"/>
-          <w:lang w:val="en-GB" w:eastAsia="en-GB"/>
-          <w14:ligatures w14:val="none"/>
-        </w:rPr>
-        <w:pict w14:anchorId="3D314066">
-          <v:rect id="_x0000_i1038" style="width:0;height:1.5pt" o:hralign="center" o:hrstd="t" o:hr="t" fillcolor="#a0a0a0" stroked="f"/>
-        </w:pict>
-      </w:r>
     </w:p>
     <w:p>
       <w:pPr>
@@ -4949,19 +4706,6 @@
           <w14:ligatures w14:val="none"/>
         </w:rPr>
       </w:pPr>
-      <w:r>
-        <w:rPr>
-          <w:rFonts w:ascii="Times New Roman" w:eastAsia="Times New Roman" w:hAnsi="Times New Roman" w:cs="Times New Roman"/>
-          <w:kern w:val="0"/>
-          <w:sz w:val="24"/>
-          <w:szCs w:val="24"/>
-          <w:lang w:val="en-GB" w:eastAsia="en-GB"/>
-          <w14:ligatures w14:val="none"/>
-        </w:rPr>
-        <w:pict w14:anchorId="25805316">
-          <v:rect id="_x0000_i1039" style="width:0;height:1.5pt" o:hralign="center" o:hrstd="t" o:hr="t" fillcolor="#a0a0a0" stroked="f"/>
-        </w:pict>
-      </w:r>
     </w:p>
     <w:p>
       <w:pPr>
@@ -5148,19 +4892,6 @@
           <w14:ligatures w14:val="none"/>
         </w:rPr>
       </w:pPr>
-      <w:r>
-        <w:rPr>
-          <w:rFonts w:ascii="Times New Roman" w:eastAsia="Times New Roman" w:hAnsi="Times New Roman" w:cs="Times New Roman"/>
-          <w:kern w:val="0"/>
-          <w:sz w:val="24"/>
-          <w:szCs w:val="24"/>
-          <w:lang w:val="en-GB" w:eastAsia="en-GB"/>
-          <w14:ligatures w14:val="none"/>
-        </w:rPr>
-        <w:pict w14:anchorId="47003827">
-          <v:rect id="_x0000_i1040" style="width:0;height:1.5pt" o:hralign="center" o:hrstd="t" o:hr="t" fillcolor="#a0a0a0" stroked="f"/>
-        </w:pict>
-      </w:r>
     </w:p>
     <w:p>
       <w:pPr>
@@ -5392,7 +5123,6 @@
         <w:t>question-level answer options (</w:t>
       </w:r>
       <w:proofErr w:type="spellStart"/>
-      <w:proofErr w:type="gramStart"/>
       <w:r>
         <w:rPr>
           <w:rFonts w:ascii="Times New Roman" w:eastAsia="Times New Roman" w:hAnsi="Times New Roman" w:cs="Times New Roman"/>
@@ -5407,7 +5137,6 @@
         <w:t>question.options</w:t>
       </w:r>
       <w:proofErr w:type="spellEnd"/>
-      <w:proofErr w:type="gramEnd"/>
       <w:r>
         <w:rPr>
           <w:rFonts w:ascii="Times New Roman" w:eastAsia="Times New Roman" w:hAnsi="Times New Roman" w:cs="Times New Roman"/>
@@ -5566,19 +5295,6 @@
           <w14:ligatures w14:val="none"/>
         </w:rPr>
       </w:pPr>
-      <w:r>
-        <w:rPr>
-          <w:rFonts w:ascii="Times New Roman" w:eastAsia="Times New Roman" w:hAnsi="Times New Roman" w:cs="Times New Roman"/>
-          <w:kern w:val="0"/>
-          <w:sz w:val="24"/>
-          <w:szCs w:val="24"/>
-          <w:lang w:val="en-GB" w:eastAsia="en-GB"/>
-          <w14:ligatures w14:val="none"/>
-        </w:rPr>
-        <w:pict w14:anchorId="4BE48D4D">
-          <v:rect id="_x0000_i1042" style="width:0;height:1.5pt" o:hralign="center" o:hrstd="t" o:hr="t" fillcolor="#a0a0a0" stroked="f"/>
-        </w:pict>
-      </w:r>
     </w:p>
     <w:p>
       <w:pPr>
@@ -5881,19 +5597,6 @@
           <w14:ligatures w14:val="none"/>
         </w:rPr>
       </w:pPr>
-      <w:r>
-        <w:rPr>
-          <w:rFonts w:ascii="Times New Roman" w:eastAsia="Times New Roman" w:hAnsi="Times New Roman" w:cs="Times New Roman"/>
-          <w:kern w:val="0"/>
-          <w:sz w:val="24"/>
-          <w:szCs w:val="24"/>
-          <w:lang w:val="en-GB" w:eastAsia="en-GB"/>
-          <w14:ligatures w14:val="none"/>
-        </w:rPr>
-        <w:pict w14:anchorId="1A0D8E5A">
-          <v:rect id="_x0000_i1043" style="width:0;height:1.5pt" o:hralign="center" o:hrstd="t" o:hr="t" fillcolor="#a0a0a0" stroked="f"/>
-        </w:pict>
-      </w:r>
     </w:p>
     <w:p>
       <w:pPr>
@@ -6112,19 +5815,6 @@
           <w14:ligatures w14:val="none"/>
         </w:rPr>
       </w:pPr>
-      <w:r>
-        <w:rPr>
-          <w:rFonts w:ascii="Times New Roman" w:eastAsia="Times New Roman" w:hAnsi="Times New Roman" w:cs="Times New Roman"/>
-          <w:kern w:val="0"/>
-          <w:sz w:val="24"/>
-          <w:szCs w:val="24"/>
-          <w:lang w:val="en-GB" w:eastAsia="en-GB"/>
-          <w14:ligatures w14:val="none"/>
-        </w:rPr>
-        <w:pict w14:anchorId="151AE232">
-          <v:rect id="_x0000_i1044" style="width:0;height:1.5pt" o:hralign="center" o:hrstd="t" o:hr="t" fillcolor="#a0a0a0" stroked="f"/>
-        </w:pict>
-      </w:r>
     </w:p>
     <w:p>
       <w:pPr>
@@ -6278,7 +5968,7 @@
           <w:kern w:val="0"/>
           <w:sz w:val="24"/>
           <w:szCs w:val="24"/>
-          <w:lang w:val="ru-RU" w:eastAsia="en-GB"/>
+          <w:lang w:val="en-GB" w:eastAsia="en-GB"/>
           <w14:ligatures w14:val="none"/>
         </w:rPr>
       </w:pPr>
@@ -6295,7 +5985,7 @@
           <w:lang w:val="en-GB"/>
         </w:rPr>
         <w:pict w14:anchorId="04DD64FB">
-          <v:rect id="_x0000_i1075" style="width:0;height:1.5pt" o:hralign="center" o:hrstd="t" o:hr="t" fillcolor="#a0a0a0" stroked="f"/>
+          <v:rect id="_x0000_i1045" style="width:0;height:1.5pt" o:hralign="center" o:hrstd="t" o:hr="t" fillcolor="#a0a0a0" stroked="f"/>
         </w:pict>
       </w:r>
     </w:p>
@@ -6419,14 +6109,6 @@
           <w:lang w:val="en-GB"/>
         </w:rPr>
       </w:pPr>
-      <w:r>
-        <w:rPr>
-          <w:lang w:val="en-GB"/>
-        </w:rPr>
-        <w:pict w14:anchorId="3C77AF86">
-          <v:rect id="_x0000_i1076" style="width:0;height:1.5pt" o:hralign="center" o:hrstd="t" o:hr="t" fillcolor="#a0a0a0" stroked="f"/>
-        </w:pict>
-      </w:r>
     </w:p>
     <w:p>
       <w:pPr>
@@ -6544,14 +6226,6 @@
           <w:lang w:val="en-GB"/>
         </w:rPr>
       </w:pPr>
-      <w:r>
-        <w:rPr>
-          <w:lang w:val="en-GB"/>
-        </w:rPr>
-        <w:pict w14:anchorId="56958650">
-          <v:rect id="_x0000_i1077" style="width:0;height:1.5pt" o:hralign="center" o:hrstd="t" o:hr="t" fillcolor="#a0a0a0" stroked="f"/>
-        </w:pict>
-      </w:r>
     </w:p>
     <w:p>
       <w:pPr>
@@ -6719,14 +6393,6 @@
           <w:lang w:val="en-GB"/>
         </w:rPr>
       </w:pPr>
-      <w:r>
-        <w:rPr>
-          <w:lang w:val="en-GB"/>
-        </w:rPr>
-        <w:pict w14:anchorId="414E94B6">
-          <v:rect id="_x0000_i1078" style="width:0;height:1.5pt" o:hralign="center" o:hrstd="t" o:hr="t" fillcolor="#a0a0a0" stroked="f"/>
-        </w:pict>
-      </w:r>
     </w:p>
     <w:p>
       <w:pPr>
@@ -6816,14 +6482,6 @@
           <w:lang w:val="en-GB"/>
         </w:rPr>
       </w:pPr>
-      <w:r>
-        <w:rPr>
-          <w:lang w:val="en-GB"/>
-        </w:rPr>
-        <w:pict w14:anchorId="7EABE84C">
-          <v:rect id="_x0000_i1079" style="width:0;height:1.5pt" o:hralign="center" o:hrstd="t" o:hr="t" fillcolor="#a0a0a0" stroked="f"/>
-        </w:pict>
-      </w:r>
     </w:p>
     <w:p>
       <w:pPr>
@@ -6925,6 +6583,467 @@
         <w:spacing w:before="100" w:beforeAutospacing="1" w:after="100" w:afterAutospacing="1" w:line="240" w:lineRule="auto"/>
         <w:rPr>
           <w:lang w:val="ru-RU"/>
+        </w:rPr>
+      </w:pPr>
+      <w:r>
+        <w:rPr>
+          <w:lang w:val="en-GB"/>
+        </w:rPr>
+        <w:pict w14:anchorId="3F5FB17A">
+          <v:rect id="_x0000_i1050" style="width:0;height:1.5pt" o:hralign="center" o:hrstd="t" o:hr="t" fillcolor="#a0a0a0" stroked="f"/>
+        </w:pict>
+      </w:r>
+    </w:p>
+    <w:p>
+      <w:pPr>
+        <w:spacing w:before="100" w:beforeAutospacing="1" w:after="100" w:afterAutospacing="1" w:line="240" w:lineRule="auto"/>
+        <w:rPr>
+          <w:lang w:val="en-GB"/>
+        </w:rPr>
+      </w:pPr>
+      <w:r>
+        <w:rPr>
+          <w:rFonts w:ascii="Segoe UI Emoji" w:hAnsi="Segoe UI Emoji" w:cs="Segoe UI Emoji"/>
+          <w:b/>
+          <w:bCs/>
+          <w:lang w:val="en-GB"/>
+        </w:rPr>
+        <w:lastRenderedPageBreak/>
+        <w:t>🧠</w:t>
+      </w:r>
+      <w:r>
+        <w:rPr>
+          <w:b/>
+          <w:bCs/>
+          <w:lang w:val="en-GB"/>
+        </w:rPr>
+        <w:t xml:space="preserve"> feat: add language &amp; category grouping + fix duplicate answer handling</w:t>
+      </w:r>
+    </w:p>
+    <w:p>
+      <w:pPr>
+        <w:spacing w:before="100" w:beforeAutospacing="1" w:after="100" w:afterAutospacing="1" w:line="240" w:lineRule="auto"/>
+        <w:rPr>
+          <w:b/>
+          <w:bCs/>
+          <w:lang w:val="en-GB"/>
+        </w:rPr>
+      </w:pPr>
+      <w:r>
+        <w:rPr>
+          <w:rFonts w:ascii="Segoe UI Emoji" w:hAnsi="Segoe UI Emoji" w:cs="Segoe UI Emoji"/>
+          <w:b/>
+          <w:bCs/>
+          <w:lang w:val="en-GB"/>
+        </w:rPr>
+        <w:t>🐛</w:t>
+      </w:r>
+      <w:r>
+        <w:rPr>
+          <w:b/>
+          <w:bCs/>
+          <w:lang w:val="en-GB"/>
+        </w:rPr>
+        <w:t xml:space="preserve"> fixes</w:t>
+      </w:r>
+    </w:p>
+    <w:p>
+      <w:pPr>
+        <w:numPr>
+          <w:ilvl w:val="0"/>
+          <w:numId w:val="49"/>
+        </w:numPr>
+        <w:spacing w:before="100" w:beforeAutospacing="1" w:after="100" w:afterAutospacing="1" w:line="240" w:lineRule="auto"/>
+        <w:rPr>
+          <w:lang w:val="en-GB"/>
+        </w:rPr>
+      </w:pPr>
+      <w:r>
+        <w:rPr>
+          <w:lang w:val="en-GB"/>
+        </w:rPr>
+        <w:t xml:space="preserve">fix incorrect handling of answer options with duplicate value </w:t>
+      </w:r>
+    </w:p>
+    <w:p>
+      <w:pPr>
+        <w:numPr>
+          <w:ilvl w:val="0"/>
+          <w:numId w:val="49"/>
+        </w:numPr>
+        <w:spacing w:before="100" w:beforeAutospacing="1" w:after="100" w:afterAutospacing="1" w:line="240" w:lineRule="auto"/>
+        <w:rPr>
+          <w:lang w:val="en-GB"/>
+        </w:rPr>
+      </w:pPr>
+      <w:r>
+        <w:rPr>
+          <w:lang w:val="en-GB"/>
+        </w:rPr>
+        <w:t xml:space="preserve">ensure unique selection in button mode when values are </w:t>
+      </w:r>
+      <w:proofErr w:type="spellStart"/>
+      <w:r>
+        <w:rPr>
+          <w:lang w:val="en-GB"/>
+        </w:rPr>
+        <w:t>одинаковые</w:t>
+      </w:r>
+      <w:proofErr w:type="spellEnd"/>
+      <w:r>
+        <w:rPr>
+          <w:lang w:val="en-GB"/>
+        </w:rPr>
+        <w:t xml:space="preserve"> </w:t>
+      </w:r>
+    </w:p>
+    <w:p>
+      <w:pPr>
+        <w:numPr>
+          <w:ilvl w:val="0"/>
+          <w:numId w:val="49"/>
+        </w:numPr>
+        <w:spacing w:before="100" w:beforeAutospacing="1" w:after="100" w:afterAutospacing="1" w:line="240" w:lineRule="auto"/>
+        <w:rPr>
+          <w:lang w:val="en-GB"/>
+        </w:rPr>
+      </w:pPr>
+      <w:r>
+        <w:rPr>
+          <w:lang w:val="en-GB"/>
+        </w:rPr>
+        <w:t xml:space="preserve">resolve React key collisions for answer options </w:t>
+      </w:r>
+    </w:p>
+    <w:p>
+      <w:pPr>
+        <w:numPr>
+          <w:ilvl w:val="0"/>
+          <w:numId w:val="49"/>
+        </w:numPr>
+        <w:spacing w:before="100" w:beforeAutospacing="1" w:after="100" w:afterAutospacing="1" w:line="240" w:lineRule="auto"/>
+        <w:rPr>
+          <w:lang w:val="en-GB"/>
+        </w:rPr>
+      </w:pPr>
+      <w:r>
+        <w:rPr>
+          <w:lang w:val="en-GB"/>
+        </w:rPr>
+        <w:t xml:space="preserve">disable slider automatically when duplicate values are present </w:t>
+      </w:r>
+    </w:p>
+    <w:p>
+      <w:pPr>
+        <w:spacing w:before="100" w:beforeAutospacing="1" w:after="100" w:afterAutospacing="1" w:line="240" w:lineRule="auto"/>
+        <w:rPr>
+          <w:b/>
+          <w:bCs/>
+          <w:lang w:val="en-GB"/>
+        </w:rPr>
+      </w:pPr>
+      <w:r>
+        <w:rPr>
+          <w:rFonts w:ascii="Segoe UI Emoji" w:hAnsi="Segoe UI Emoji" w:cs="Segoe UI Emoji"/>
+          <w:b/>
+          <w:bCs/>
+          <w:lang w:val="en-GB"/>
+        </w:rPr>
+        <w:t>🚀</w:t>
+      </w:r>
+      <w:r>
+        <w:rPr>
+          <w:b/>
+          <w:bCs/>
+          <w:lang w:val="en-GB"/>
+        </w:rPr>
+        <w:t xml:space="preserve"> features</w:t>
+      </w:r>
+    </w:p>
+    <w:p>
+      <w:pPr>
+        <w:numPr>
+          <w:ilvl w:val="0"/>
+          <w:numId w:val="50"/>
+        </w:numPr>
+        <w:spacing w:before="100" w:beforeAutospacing="1" w:after="100" w:afterAutospacing="1" w:line="240" w:lineRule="auto"/>
+        <w:rPr>
+          <w:lang w:val="en-GB"/>
+        </w:rPr>
+      </w:pPr>
+      <w:r>
+        <w:rPr>
+          <w:lang w:val="en-GB"/>
+        </w:rPr>
+        <w:t xml:space="preserve">add language field to questionnaire schema (required) </w:t>
+      </w:r>
+    </w:p>
+    <w:p>
+      <w:pPr>
+        <w:numPr>
+          <w:ilvl w:val="0"/>
+          <w:numId w:val="50"/>
+        </w:numPr>
+        <w:spacing w:before="100" w:beforeAutospacing="1" w:after="100" w:afterAutospacing="1" w:line="240" w:lineRule="auto"/>
+        <w:rPr>
+          <w:lang w:val="en-GB"/>
+        </w:rPr>
+      </w:pPr>
+      <w:r>
+        <w:rPr>
+          <w:lang w:val="en-GB"/>
+        </w:rPr>
+        <w:t xml:space="preserve">implement grouping of questionnaires by language </w:t>
+      </w:r>
+    </w:p>
+    <w:p>
+      <w:pPr>
+        <w:numPr>
+          <w:ilvl w:val="0"/>
+          <w:numId w:val="50"/>
+        </w:numPr>
+        <w:spacing w:before="100" w:beforeAutospacing="1" w:after="100" w:afterAutospacing="1" w:line="240" w:lineRule="auto"/>
+        <w:rPr>
+          <w:lang w:val="en-GB"/>
+        </w:rPr>
+      </w:pPr>
+      <w:r>
+        <w:rPr>
+          <w:lang w:val="en-GB"/>
+        </w:rPr>
+        <w:t xml:space="preserve">add second-level grouping by category (data-driven) </w:t>
+      </w:r>
+    </w:p>
+    <w:p>
+      <w:pPr>
+        <w:spacing w:before="100" w:beforeAutospacing="1" w:after="100" w:afterAutospacing="1" w:line="240" w:lineRule="auto"/>
+        <w:rPr>
+          <w:b/>
+          <w:bCs/>
+          <w:lang w:val="en-GB"/>
+        </w:rPr>
+      </w:pPr>
+      <w:r>
+        <w:rPr>
+          <w:rFonts w:ascii="Segoe UI Emoji" w:hAnsi="Segoe UI Emoji" w:cs="Segoe UI Emoji"/>
+          <w:b/>
+          <w:bCs/>
+          <w:lang w:val="en-GB"/>
+        </w:rPr>
+        <w:t>🎨</w:t>
+      </w:r>
+      <w:r>
+        <w:rPr>
+          <w:b/>
+          <w:bCs/>
+          <w:lang w:val="en-GB"/>
+        </w:rPr>
+        <w:t xml:space="preserve"> UI / UX</w:t>
+      </w:r>
+    </w:p>
+    <w:p>
+      <w:pPr>
+        <w:numPr>
+          <w:ilvl w:val="0"/>
+          <w:numId w:val="51"/>
+        </w:numPr>
+        <w:spacing w:before="100" w:beforeAutospacing="1" w:after="100" w:afterAutospacing="1" w:line="240" w:lineRule="auto"/>
+        <w:rPr>
+          <w:lang w:val="en-GB"/>
+        </w:rPr>
+      </w:pPr>
+      <w:r>
+        <w:rPr>
+          <w:lang w:val="en-GB"/>
+        </w:rPr>
+        <w:t xml:space="preserve">display questionnaires grouped as: language → category → tests </w:t>
+      </w:r>
+    </w:p>
+    <w:p>
+      <w:pPr>
+        <w:numPr>
+          <w:ilvl w:val="0"/>
+          <w:numId w:val="51"/>
+        </w:numPr>
+        <w:spacing w:before="100" w:beforeAutospacing="1" w:after="100" w:afterAutospacing="1" w:line="240" w:lineRule="auto"/>
+        <w:rPr>
+          <w:lang w:val="en-GB"/>
+        </w:rPr>
+      </w:pPr>
+      <w:r>
+        <w:rPr>
+          <w:lang w:val="en-GB"/>
+        </w:rPr>
+        <w:t xml:space="preserve">show counts per category </w:t>
+      </w:r>
+    </w:p>
+    <w:p>
+      <w:pPr>
+        <w:numPr>
+          <w:ilvl w:val="0"/>
+          <w:numId w:val="51"/>
+        </w:numPr>
+        <w:spacing w:before="100" w:beforeAutospacing="1" w:after="100" w:afterAutospacing="1" w:line="240" w:lineRule="auto"/>
+        <w:rPr>
+          <w:lang w:val="en-GB"/>
+        </w:rPr>
+      </w:pPr>
+      <w:r>
+        <w:rPr>
+          <w:lang w:val="en-GB"/>
+        </w:rPr>
+        <w:t xml:space="preserve">improve navigation in large test lists </w:t>
+      </w:r>
+    </w:p>
+    <w:p>
+      <w:pPr>
+        <w:spacing w:before="100" w:beforeAutospacing="1" w:after="100" w:afterAutospacing="1" w:line="240" w:lineRule="auto"/>
+        <w:rPr>
+          <w:b/>
+          <w:bCs/>
+          <w:lang w:val="en-GB"/>
+        </w:rPr>
+      </w:pPr>
+      <w:r>
+        <w:rPr>
+          <w:rFonts w:ascii="Segoe UI Emoji" w:hAnsi="Segoe UI Emoji" w:cs="Segoe UI Emoji"/>
+          <w:b/>
+          <w:bCs/>
+          <w:lang w:val="en-GB"/>
+        </w:rPr>
+        <w:t>⚙️</w:t>
+      </w:r>
+      <w:r>
+        <w:rPr>
+          <w:b/>
+          <w:bCs/>
+          <w:lang w:val="en-GB"/>
+        </w:rPr>
+        <w:t xml:space="preserve"> data model</w:t>
+      </w:r>
+    </w:p>
+    <w:p>
+      <w:pPr>
+        <w:numPr>
+          <w:ilvl w:val="0"/>
+          <w:numId w:val="52"/>
+        </w:numPr>
+        <w:spacing w:before="100" w:beforeAutospacing="1" w:after="100" w:afterAutospacing="1" w:line="240" w:lineRule="auto"/>
+        <w:rPr>
+          <w:lang w:val="en-GB"/>
+        </w:rPr>
+      </w:pPr>
+      <w:r>
+        <w:rPr>
+          <w:lang w:val="en-GB"/>
+        </w:rPr>
+        <w:t xml:space="preserve">extend Questionnaire type with language </w:t>
+      </w:r>
+    </w:p>
+    <w:p>
+      <w:pPr>
+        <w:numPr>
+          <w:ilvl w:val="0"/>
+          <w:numId w:val="52"/>
+        </w:numPr>
+        <w:spacing w:before="100" w:beforeAutospacing="1" w:after="100" w:afterAutospacing="1" w:line="240" w:lineRule="auto"/>
+        <w:rPr>
+          <w:lang w:val="en-GB"/>
+        </w:rPr>
+      </w:pPr>
+      <w:r>
+        <w:rPr>
+          <w:lang w:val="en-GB"/>
+        </w:rPr>
+        <w:t xml:space="preserve">update all questionnaire JSON files accordingly </w:t>
+      </w:r>
+    </w:p>
+    <w:p>
+      <w:pPr>
+        <w:spacing w:before="100" w:beforeAutospacing="1" w:after="100" w:afterAutospacing="1" w:line="240" w:lineRule="auto"/>
+        <w:rPr>
+          <w:b/>
+          <w:bCs/>
+          <w:lang w:val="en-GB"/>
+        </w:rPr>
+      </w:pPr>
+      <w:r>
+        <w:rPr>
+          <w:rFonts w:ascii="Segoe UI Emoji" w:hAnsi="Segoe UI Emoji" w:cs="Segoe UI Emoji"/>
+          <w:b/>
+          <w:bCs/>
+          <w:lang w:val="en-GB"/>
+        </w:rPr>
+        <w:t>🧠</w:t>
+      </w:r>
+      <w:r>
+        <w:rPr>
+          <w:b/>
+          <w:bCs/>
+          <w:lang w:val="en-GB"/>
+        </w:rPr>
+        <w:t xml:space="preserve"> logic improvements</w:t>
+      </w:r>
+    </w:p>
+    <w:p>
+      <w:pPr>
+        <w:numPr>
+          <w:ilvl w:val="0"/>
+          <w:numId w:val="53"/>
+        </w:numPr>
+        <w:spacing w:before="100" w:beforeAutospacing="1" w:after="100" w:afterAutospacing="1" w:line="240" w:lineRule="auto"/>
+        <w:rPr>
+          <w:lang w:val="en-GB"/>
+        </w:rPr>
+      </w:pPr>
+      <w:r>
+        <w:rPr>
+          <w:lang w:val="en-GB"/>
+        </w:rPr>
+        <w:t xml:space="preserve">separate selected option identity from numeric value </w:t>
+      </w:r>
+    </w:p>
+    <w:p>
+      <w:pPr>
+        <w:numPr>
+          <w:ilvl w:val="0"/>
+          <w:numId w:val="53"/>
+        </w:numPr>
+        <w:spacing w:before="100" w:beforeAutospacing="1" w:after="100" w:afterAutospacing="1" w:line="240" w:lineRule="auto"/>
+        <w:rPr>
+          <w:lang w:val="en-GB"/>
+        </w:rPr>
+      </w:pPr>
+      <w:r>
+        <w:rPr>
+          <w:lang w:val="en-GB"/>
+        </w:rPr>
+        <w:t xml:space="preserve">introduce option-level unique keys for answer handling </w:t>
+      </w:r>
+    </w:p>
+    <w:p>
+      <w:pPr>
+        <w:numPr>
+          <w:ilvl w:val="0"/>
+          <w:numId w:val="53"/>
+        </w:numPr>
+        <w:spacing w:before="100" w:beforeAutospacing="1" w:after="100" w:afterAutospacing="1" w:line="240" w:lineRule="auto"/>
+        <w:rPr>
+          <w:lang w:val="en-GB"/>
+        </w:rPr>
+      </w:pPr>
+      <w:r>
+        <w:rPr>
+          <w:lang w:val="en-GB"/>
+        </w:rPr>
+        <w:t>make grouping fully data-driven (no hardcoded groups)</w:t>
+      </w:r>
+    </w:p>
+    <w:p>
+      <w:pPr>
+        <w:spacing w:before="100" w:beforeAutospacing="1" w:after="100" w:afterAutospacing="1" w:line="240" w:lineRule="auto"/>
+        <w:rPr>
+          <w:lang w:val="en-GB"/>
         </w:rPr>
       </w:pPr>
     </w:p>
@@ -7835,6 +7954,155 @@
     </w:lvl>
   </w:abstractNum>
   <w:abstractNum w:abstractNumId="6" w15:restartNumberingAfterBreak="0">
+    <w:nsid w:val="11952E55"/>
+    <w:multiLevelType w:val="multilevel"/>
+    <w:tmpl w:val="5B44CB0C"/>
+    <w:lvl w:ilvl="0">
+      <w:start w:val="1"/>
+      <w:numFmt w:val="bullet"/>
+      <w:lvlText w:val=""/>
+      <w:lvlJc w:val="left"/>
+      <w:pPr>
+        <w:tabs>
+          <w:tab w:val="num" w:pos="720"/>
+        </w:tabs>
+        <w:ind w:left="720" w:hanging="360"/>
+      </w:pPr>
+      <w:rPr>
+        <w:rFonts w:ascii="Symbol" w:hAnsi="Symbol" w:hint="default"/>
+        <w:sz w:val="20"/>
+      </w:rPr>
+    </w:lvl>
+    <w:lvl w:ilvl="1" w:tentative="1">
+      <w:start w:val="1"/>
+      <w:numFmt w:val="bullet"/>
+      <w:lvlText w:val="o"/>
+      <w:lvlJc w:val="left"/>
+      <w:pPr>
+        <w:tabs>
+          <w:tab w:val="num" w:pos="1440"/>
+        </w:tabs>
+        <w:ind w:left="1440" w:hanging="360"/>
+      </w:pPr>
+      <w:rPr>
+        <w:rFonts w:ascii="Courier New" w:hAnsi="Courier New" w:hint="default"/>
+        <w:sz w:val="20"/>
+      </w:rPr>
+    </w:lvl>
+    <w:lvl w:ilvl="2" w:tentative="1">
+      <w:start w:val="1"/>
+      <w:numFmt w:val="bullet"/>
+      <w:lvlText w:val=""/>
+      <w:lvlJc w:val="left"/>
+      <w:pPr>
+        <w:tabs>
+          <w:tab w:val="num" w:pos="2160"/>
+        </w:tabs>
+        <w:ind w:left="2160" w:hanging="360"/>
+      </w:pPr>
+      <w:rPr>
+        <w:rFonts w:ascii="Wingdings" w:hAnsi="Wingdings" w:hint="default"/>
+        <w:sz w:val="20"/>
+      </w:rPr>
+    </w:lvl>
+    <w:lvl w:ilvl="3" w:tentative="1">
+      <w:start w:val="1"/>
+      <w:numFmt w:val="bullet"/>
+      <w:lvlText w:val=""/>
+      <w:lvlJc w:val="left"/>
+      <w:pPr>
+        <w:tabs>
+          <w:tab w:val="num" w:pos="2880"/>
+        </w:tabs>
+        <w:ind w:left="2880" w:hanging="360"/>
+      </w:pPr>
+      <w:rPr>
+        <w:rFonts w:ascii="Wingdings" w:hAnsi="Wingdings" w:hint="default"/>
+        <w:sz w:val="20"/>
+      </w:rPr>
+    </w:lvl>
+    <w:lvl w:ilvl="4" w:tentative="1">
+      <w:start w:val="1"/>
+      <w:numFmt w:val="bullet"/>
+      <w:lvlText w:val=""/>
+      <w:lvlJc w:val="left"/>
+      <w:pPr>
+        <w:tabs>
+          <w:tab w:val="num" w:pos="3600"/>
+        </w:tabs>
+        <w:ind w:left="3600" w:hanging="360"/>
+      </w:pPr>
+      <w:rPr>
+        <w:rFonts w:ascii="Wingdings" w:hAnsi="Wingdings" w:hint="default"/>
+        <w:sz w:val="20"/>
+      </w:rPr>
+    </w:lvl>
+    <w:lvl w:ilvl="5" w:tentative="1">
+      <w:start w:val="1"/>
+      <w:numFmt w:val="bullet"/>
+      <w:lvlText w:val=""/>
+      <w:lvlJc w:val="left"/>
+      <w:pPr>
+        <w:tabs>
+          <w:tab w:val="num" w:pos="4320"/>
+        </w:tabs>
+        <w:ind w:left="4320" w:hanging="360"/>
+      </w:pPr>
+      <w:rPr>
+        <w:rFonts w:ascii="Wingdings" w:hAnsi="Wingdings" w:hint="default"/>
+        <w:sz w:val="20"/>
+      </w:rPr>
+    </w:lvl>
+    <w:lvl w:ilvl="6" w:tentative="1">
+      <w:start w:val="1"/>
+      <w:numFmt w:val="bullet"/>
+      <w:lvlText w:val=""/>
+      <w:lvlJc w:val="left"/>
+      <w:pPr>
+        <w:tabs>
+          <w:tab w:val="num" w:pos="5040"/>
+        </w:tabs>
+        <w:ind w:left="5040" w:hanging="360"/>
+      </w:pPr>
+      <w:rPr>
+        <w:rFonts w:ascii="Wingdings" w:hAnsi="Wingdings" w:hint="default"/>
+        <w:sz w:val="20"/>
+      </w:rPr>
+    </w:lvl>
+    <w:lvl w:ilvl="7" w:tentative="1">
+      <w:start w:val="1"/>
+      <w:numFmt w:val="bullet"/>
+      <w:lvlText w:val=""/>
+      <w:lvlJc w:val="left"/>
+      <w:pPr>
+        <w:tabs>
+          <w:tab w:val="num" w:pos="5760"/>
+        </w:tabs>
+        <w:ind w:left="5760" w:hanging="360"/>
+      </w:pPr>
+      <w:rPr>
+        <w:rFonts w:ascii="Wingdings" w:hAnsi="Wingdings" w:hint="default"/>
+        <w:sz w:val="20"/>
+      </w:rPr>
+    </w:lvl>
+    <w:lvl w:ilvl="8" w:tentative="1">
+      <w:start w:val="1"/>
+      <w:numFmt w:val="bullet"/>
+      <w:lvlText w:val=""/>
+      <w:lvlJc w:val="left"/>
+      <w:pPr>
+        <w:tabs>
+          <w:tab w:val="num" w:pos="6480"/>
+        </w:tabs>
+        <w:ind w:left="6480" w:hanging="360"/>
+      </w:pPr>
+      <w:rPr>
+        <w:rFonts w:ascii="Wingdings" w:hAnsi="Wingdings" w:hint="default"/>
+        <w:sz w:val="20"/>
+      </w:rPr>
+    </w:lvl>
+  </w:abstractNum>
+  <w:abstractNum w:abstractNumId="7" w15:restartNumberingAfterBreak="0">
     <w:nsid w:val="14802EF4"/>
     <w:multiLevelType w:val="multilevel"/>
     <w:tmpl w:val="25BE497E"/>
@@ -7983,7 +8251,7 @@
       </w:rPr>
     </w:lvl>
   </w:abstractNum>
-  <w:abstractNum w:abstractNumId="7" w15:restartNumberingAfterBreak="0">
+  <w:abstractNum w:abstractNumId="8" w15:restartNumberingAfterBreak="0">
     <w:nsid w:val="14B774A9"/>
     <w:multiLevelType w:val="multilevel"/>
     <w:tmpl w:val="A468B562"/>
@@ -8132,7 +8400,7 @@
       </w:rPr>
     </w:lvl>
   </w:abstractNum>
-  <w:abstractNum w:abstractNumId="8" w15:restartNumberingAfterBreak="0">
+  <w:abstractNum w:abstractNumId="9" w15:restartNumberingAfterBreak="0">
     <w:nsid w:val="14E0040C"/>
     <w:multiLevelType w:val="multilevel"/>
     <w:tmpl w:val="FE06C8D0"/>
@@ -8281,7 +8549,7 @@
       </w:rPr>
     </w:lvl>
   </w:abstractNum>
-  <w:abstractNum w:abstractNumId="9" w15:restartNumberingAfterBreak="0">
+  <w:abstractNum w:abstractNumId="10" w15:restartNumberingAfterBreak="0">
     <w:nsid w:val="179A1941"/>
     <w:multiLevelType w:val="multilevel"/>
     <w:tmpl w:val="17D00A7E"/>
@@ -8430,7 +8698,7 @@
       </w:rPr>
     </w:lvl>
   </w:abstractNum>
-  <w:abstractNum w:abstractNumId="10" w15:restartNumberingAfterBreak="0">
+  <w:abstractNum w:abstractNumId="11" w15:restartNumberingAfterBreak="0">
     <w:nsid w:val="1A0207E2"/>
     <w:multiLevelType w:val="multilevel"/>
     <w:tmpl w:val="56D8362C"/>
@@ -8543,7 +8811,7 @@
       </w:pPr>
     </w:lvl>
   </w:abstractNum>
-  <w:abstractNum w:abstractNumId="11" w15:restartNumberingAfterBreak="0">
+  <w:abstractNum w:abstractNumId="12" w15:restartNumberingAfterBreak="0">
     <w:nsid w:val="1DBF5F20"/>
     <w:multiLevelType w:val="multilevel"/>
     <w:tmpl w:val="1A12A100"/>
@@ -8692,7 +8960,7 @@
       </w:rPr>
     </w:lvl>
   </w:abstractNum>
-  <w:abstractNum w:abstractNumId="12" w15:restartNumberingAfterBreak="0">
+  <w:abstractNum w:abstractNumId="13" w15:restartNumberingAfterBreak="0">
     <w:nsid w:val="1E3E57E3"/>
     <w:multiLevelType w:val="multilevel"/>
     <w:tmpl w:val="F2B24F14"/>
@@ -8841,7 +9109,7 @@
       </w:rPr>
     </w:lvl>
   </w:abstractNum>
-  <w:abstractNum w:abstractNumId="13" w15:restartNumberingAfterBreak="0">
+  <w:abstractNum w:abstractNumId="14" w15:restartNumberingAfterBreak="0">
     <w:nsid w:val="1FCD3590"/>
     <w:multiLevelType w:val="multilevel"/>
     <w:tmpl w:val="33D25A94"/>
@@ -8990,7 +9258,7 @@
       </w:rPr>
     </w:lvl>
   </w:abstractNum>
-  <w:abstractNum w:abstractNumId="14" w15:restartNumberingAfterBreak="0">
+  <w:abstractNum w:abstractNumId="15" w15:restartNumberingAfterBreak="0">
     <w:nsid w:val="1FD852BF"/>
     <w:multiLevelType w:val="multilevel"/>
     <w:tmpl w:val="78EC6982"/>
@@ -9139,7 +9407,7 @@
       </w:rPr>
     </w:lvl>
   </w:abstractNum>
-  <w:abstractNum w:abstractNumId="15" w15:restartNumberingAfterBreak="0">
+  <w:abstractNum w:abstractNumId="16" w15:restartNumberingAfterBreak="0">
     <w:nsid w:val="214F1896"/>
     <w:multiLevelType w:val="multilevel"/>
     <w:tmpl w:val="D3F60152"/>
@@ -9288,7 +9556,7 @@
       </w:rPr>
     </w:lvl>
   </w:abstractNum>
-  <w:abstractNum w:abstractNumId="16" w15:restartNumberingAfterBreak="0">
+  <w:abstractNum w:abstractNumId="17" w15:restartNumberingAfterBreak="0">
     <w:nsid w:val="240E63BB"/>
     <w:multiLevelType w:val="multilevel"/>
     <w:tmpl w:val="9EC8E662"/>
@@ -9433,7 +9701,7 @@
       </w:rPr>
     </w:lvl>
   </w:abstractNum>
-  <w:abstractNum w:abstractNumId="17" w15:restartNumberingAfterBreak="0">
+  <w:abstractNum w:abstractNumId="18" w15:restartNumberingAfterBreak="0">
     <w:nsid w:val="24B86808"/>
     <w:multiLevelType w:val="multilevel"/>
     <w:tmpl w:val="9B4A0796"/>
@@ -9582,7 +9850,7 @@
       </w:rPr>
     </w:lvl>
   </w:abstractNum>
-  <w:abstractNum w:abstractNumId="18" w15:restartNumberingAfterBreak="0">
+  <w:abstractNum w:abstractNumId="19" w15:restartNumberingAfterBreak="0">
     <w:nsid w:val="251F49EA"/>
     <w:multiLevelType w:val="multilevel"/>
     <w:tmpl w:val="CAE8C108"/>
@@ -9731,7 +9999,7 @@
       </w:rPr>
     </w:lvl>
   </w:abstractNum>
-  <w:abstractNum w:abstractNumId="19" w15:restartNumberingAfterBreak="0">
+  <w:abstractNum w:abstractNumId="20" w15:restartNumberingAfterBreak="0">
     <w:nsid w:val="258F118F"/>
     <w:multiLevelType w:val="multilevel"/>
     <w:tmpl w:val="96862330"/>
@@ -9880,7 +10148,7 @@
       </w:rPr>
     </w:lvl>
   </w:abstractNum>
-  <w:abstractNum w:abstractNumId="20" w15:restartNumberingAfterBreak="0">
+  <w:abstractNum w:abstractNumId="21" w15:restartNumberingAfterBreak="0">
     <w:nsid w:val="26C20CD3"/>
     <w:multiLevelType w:val="multilevel"/>
     <w:tmpl w:val="62A6099E"/>
@@ -10029,7 +10297,7 @@
       </w:rPr>
     </w:lvl>
   </w:abstractNum>
-  <w:abstractNum w:abstractNumId="21" w15:restartNumberingAfterBreak="0">
+  <w:abstractNum w:abstractNumId="22" w15:restartNumberingAfterBreak="0">
     <w:nsid w:val="27495347"/>
     <w:multiLevelType w:val="multilevel"/>
     <w:tmpl w:val="37DA0990"/>
@@ -10178,7 +10446,7 @@
       </w:rPr>
     </w:lvl>
   </w:abstractNum>
-  <w:abstractNum w:abstractNumId="22" w15:restartNumberingAfterBreak="0">
+  <w:abstractNum w:abstractNumId="23" w15:restartNumberingAfterBreak="0">
     <w:nsid w:val="2B3B3F96"/>
     <w:multiLevelType w:val="multilevel"/>
     <w:tmpl w:val="2F00979A"/>
@@ -10327,7 +10595,7 @@
       </w:rPr>
     </w:lvl>
   </w:abstractNum>
-  <w:abstractNum w:abstractNumId="23" w15:restartNumberingAfterBreak="0">
+  <w:abstractNum w:abstractNumId="24" w15:restartNumberingAfterBreak="0">
     <w:nsid w:val="2BE64FA3"/>
     <w:multiLevelType w:val="multilevel"/>
     <w:tmpl w:val="B2CCF318"/>
@@ -10476,7 +10744,7 @@
       </w:rPr>
     </w:lvl>
   </w:abstractNum>
-  <w:abstractNum w:abstractNumId="24" w15:restartNumberingAfterBreak="0">
+  <w:abstractNum w:abstractNumId="25" w15:restartNumberingAfterBreak="0">
     <w:nsid w:val="2C766FCF"/>
     <w:multiLevelType w:val="multilevel"/>
     <w:tmpl w:val="66E4BDA0"/>
@@ -10625,7 +10893,7 @@
       </w:rPr>
     </w:lvl>
   </w:abstractNum>
-  <w:abstractNum w:abstractNumId="25" w15:restartNumberingAfterBreak="0">
+  <w:abstractNum w:abstractNumId="26" w15:restartNumberingAfterBreak="0">
     <w:nsid w:val="2D571952"/>
     <w:multiLevelType w:val="multilevel"/>
     <w:tmpl w:val="3DA66B84"/>
@@ -10774,7 +11042,7 @@
       </w:rPr>
     </w:lvl>
   </w:abstractNum>
-  <w:abstractNum w:abstractNumId="26" w15:restartNumberingAfterBreak="0">
+  <w:abstractNum w:abstractNumId="27" w15:restartNumberingAfterBreak="0">
     <w:nsid w:val="2F5E532E"/>
     <w:multiLevelType w:val="multilevel"/>
     <w:tmpl w:val="96B63F36"/>
@@ -10923,7 +11191,7 @@
       </w:rPr>
     </w:lvl>
   </w:abstractNum>
-  <w:abstractNum w:abstractNumId="27" w15:restartNumberingAfterBreak="0">
+  <w:abstractNum w:abstractNumId="28" w15:restartNumberingAfterBreak="0">
     <w:nsid w:val="31A003AF"/>
     <w:multiLevelType w:val="multilevel"/>
     <w:tmpl w:val="04F200F8"/>
@@ -11072,7 +11340,7 @@
       </w:rPr>
     </w:lvl>
   </w:abstractNum>
-  <w:abstractNum w:abstractNumId="28" w15:restartNumberingAfterBreak="0">
+  <w:abstractNum w:abstractNumId="29" w15:restartNumberingAfterBreak="0">
     <w:nsid w:val="31F36C73"/>
     <w:multiLevelType w:val="multilevel"/>
     <w:tmpl w:val="73EA5A92"/>
@@ -11221,7 +11489,7 @@
       </w:rPr>
     </w:lvl>
   </w:abstractNum>
-  <w:abstractNum w:abstractNumId="29" w15:restartNumberingAfterBreak="0">
+  <w:abstractNum w:abstractNumId="30" w15:restartNumberingAfterBreak="0">
     <w:nsid w:val="3A417D5F"/>
     <w:multiLevelType w:val="multilevel"/>
     <w:tmpl w:val="090C5218"/>
@@ -11370,7 +11638,7 @@
       </w:rPr>
     </w:lvl>
   </w:abstractNum>
-  <w:abstractNum w:abstractNumId="30" w15:restartNumberingAfterBreak="0">
+  <w:abstractNum w:abstractNumId="31" w15:restartNumberingAfterBreak="0">
     <w:nsid w:val="441758D8"/>
     <w:multiLevelType w:val="multilevel"/>
     <w:tmpl w:val="38EC223A"/>
@@ -11519,7 +11787,7 @@
       </w:rPr>
     </w:lvl>
   </w:abstractNum>
-  <w:abstractNum w:abstractNumId="31" w15:restartNumberingAfterBreak="0">
+  <w:abstractNum w:abstractNumId="32" w15:restartNumberingAfterBreak="0">
     <w:nsid w:val="49A50C0A"/>
     <w:multiLevelType w:val="multilevel"/>
     <w:tmpl w:val="38BAAE28"/>
@@ -11668,7 +11936,156 @@
       </w:rPr>
     </w:lvl>
   </w:abstractNum>
-  <w:abstractNum w:abstractNumId="32" w15:restartNumberingAfterBreak="0">
+  <w:abstractNum w:abstractNumId="33" w15:restartNumberingAfterBreak="0">
+    <w:nsid w:val="4DD06F81"/>
+    <w:multiLevelType w:val="multilevel"/>
+    <w:tmpl w:val="E6E226B0"/>
+    <w:lvl w:ilvl="0">
+      <w:start w:val="1"/>
+      <w:numFmt w:val="bullet"/>
+      <w:lvlText w:val=""/>
+      <w:lvlJc w:val="left"/>
+      <w:pPr>
+        <w:tabs>
+          <w:tab w:val="num" w:pos="720"/>
+        </w:tabs>
+        <w:ind w:left="720" w:hanging="360"/>
+      </w:pPr>
+      <w:rPr>
+        <w:rFonts w:ascii="Symbol" w:hAnsi="Symbol" w:hint="default"/>
+        <w:sz w:val="20"/>
+      </w:rPr>
+    </w:lvl>
+    <w:lvl w:ilvl="1" w:tentative="1">
+      <w:start w:val="1"/>
+      <w:numFmt w:val="bullet"/>
+      <w:lvlText w:val="o"/>
+      <w:lvlJc w:val="left"/>
+      <w:pPr>
+        <w:tabs>
+          <w:tab w:val="num" w:pos="1440"/>
+        </w:tabs>
+        <w:ind w:left="1440" w:hanging="360"/>
+      </w:pPr>
+      <w:rPr>
+        <w:rFonts w:ascii="Courier New" w:hAnsi="Courier New" w:hint="default"/>
+        <w:sz w:val="20"/>
+      </w:rPr>
+    </w:lvl>
+    <w:lvl w:ilvl="2" w:tentative="1">
+      <w:start w:val="1"/>
+      <w:numFmt w:val="bullet"/>
+      <w:lvlText w:val=""/>
+      <w:lvlJc w:val="left"/>
+      <w:pPr>
+        <w:tabs>
+          <w:tab w:val="num" w:pos="2160"/>
+        </w:tabs>
+        <w:ind w:left="2160" w:hanging="360"/>
+      </w:pPr>
+      <w:rPr>
+        <w:rFonts w:ascii="Wingdings" w:hAnsi="Wingdings" w:hint="default"/>
+        <w:sz w:val="20"/>
+      </w:rPr>
+    </w:lvl>
+    <w:lvl w:ilvl="3" w:tentative="1">
+      <w:start w:val="1"/>
+      <w:numFmt w:val="bullet"/>
+      <w:lvlText w:val=""/>
+      <w:lvlJc w:val="left"/>
+      <w:pPr>
+        <w:tabs>
+          <w:tab w:val="num" w:pos="2880"/>
+        </w:tabs>
+        <w:ind w:left="2880" w:hanging="360"/>
+      </w:pPr>
+      <w:rPr>
+        <w:rFonts w:ascii="Wingdings" w:hAnsi="Wingdings" w:hint="default"/>
+        <w:sz w:val="20"/>
+      </w:rPr>
+    </w:lvl>
+    <w:lvl w:ilvl="4" w:tentative="1">
+      <w:start w:val="1"/>
+      <w:numFmt w:val="bullet"/>
+      <w:lvlText w:val=""/>
+      <w:lvlJc w:val="left"/>
+      <w:pPr>
+        <w:tabs>
+          <w:tab w:val="num" w:pos="3600"/>
+        </w:tabs>
+        <w:ind w:left="3600" w:hanging="360"/>
+      </w:pPr>
+      <w:rPr>
+        <w:rFonts w:ascii="Wingdings" w:hAnsi="Wingdings" w:hint="default"/>
+        <w:sz w:val="20"/>
+      </w:rPr>
+    </w:lvl>
+    <w:lvl w:ilvl="5" w:tentative="1">
+      <w:start w:val="1"/>
+      <w:numFmt w:val="bullet"/>
+      <w:lvlText w:val=""/>
+      <w:lvlJc w:val="left"/>
+      <w:pPr>
+        <w:tabs>
+          <w:tab w:val="num" w:pos="4320"/>
+        </w:tabs>
+        <w:ind w:left="4320" w:hanging="360"/>
+      </w:pPr>
+      <w:rPr>
+        <w:rFonts w:ascii="Wingdings" w:hAnsi="Wingdings" w:hint="default"/>
+        <w:sz w:val="20"/>
+      </w:rPr>
+    </w:lvl>
+    <w:lvl w:ilvl="6" w:tentative="1">
+      <w:start w:val="1"/>
+      <w:numFmt w:val="bullet"/>
+      <w:lvlText w:val=""/>
+      <w:lvlJc w:val="left"/>
+      <w:pPr>
+        <w:tabs>
+          <w:tab w:val="num" w:pos="5040"/>
+        </w:tabs>
+        <w:ind w:left="5040" w:hanging="360"/>
+      </w:pPr>
+      <w:rPr>
+        <w:rFonts w:ascii="Wingdings" w:hAnsi="Wingdings" w:hint="default"/>
+        <w:sz w:val="20"/>
+      </w:rPr>
+    </w:lvl>
+    <w:lvl w:ilvl="7" w:tentative="1">
+      <w:start w:val="1"/>
+      <w:numFmt w:val="bullet"/>
+      <w:lvlText w:val=""/>
+      <w:lvlJc w:val="left"/>
+      <w:pPr>
+        <w:tabs>
+          <w:tab w:val="num" w:pos="5760"/>
+        </w:tabs>
+        <w:ind w:left="5760" w:hanging="360"/>
+      </w:pPr>
+      <w:rPr>
+        <w:rFonts w:ascii="Wingdings" w:hAnsi="Wingdings" w:hint="default"/>
+        <w:sz w:val="20"/>
+      </w:rPr>
+    </w:lvl>
+    <w:lvl w:ilvl="8" w:tentative="1">
+      <w:start w:val="1"/>
+      <w:numFmt w:val="bullet"/>
+      <w:lvlText w:val=""/>
+      <w:lvlJc w:val="left"/>
+      <w:pPr>
+        <w:tabs>
+          <w:tab w:val="num" w:pos="6480"/>
+        </w:tabs>
+        <w:ind w:left="6480" w:hanging="360"/>
+      </w:pPr>
+      <w:rPr>
+        <w:rFonts w:ascii="Wingdings" w:hAnsi="Wingdings" w:hint="default"/>
+        <w:sz w:val="20"/>
+      </w:rPr>
+    </w:lvl>
+  </w:abstractNum>
+  <w:abstractNum w:abstractNumId="34" w15:restartNumberingAfterBreak="0">
     <w:nsid w:val="4E7A589A"/>
     <w:multiLevelType w:val="multilevel"/>
     <w:tmpl w:val="A0D82AD2"/>
@@ -11817,7 +12234,156 @@
       </w:rPr>
     </w:lvl>
   </w:abstractNum>
-  <w:abstractNum w:abstractNumId="33" w15:restartNumberingAfterBreak="0">
+  <w:abstractNum w:abstractNumId="35" w15:restartNumberingAfterBreak="0">
+    <w:nsid w:val="50505AE7"/>
+    <w:multiLevelType w:val="multilevel"/>
+    <w:tmpl w:val="137CF25E"/>
+    <w:lvl w:ilvl="0">
+      <w:start w:val="1"/>
+      <w:numFmt w:val="bullet"/>
+      <w:lvlText w:val=""/>
+      <w:lvlJc w:val="left"/>
+      <w:pPr>
+        <w:tabs>
+          <w:tab w:val="num" w:pos="720"/>
+        </w:tabs>
+        <w:ind w:left="720" w:hanging="360"/>
+      </w:pPr>
+      <w:rPr>
+        <w:rFonts w:ascii="Symbol" w:hAnsi="Symbol" w:hint="default"/>
+        <w:sz w:val="20"/>
+      </w:rPr>
+    </w:lvl>
+    <w:lvl w:ilvl="1" w:tentative="1">
+      <w:start w:val="1"/>
+      <w:numFmt w:val="bullet"/>
+      <w:lvlText w:val="o"/>
+      <w:lvlJc w:val="left"/>
+      <w:pPr>
+        <w:tabs>
+          <w:tab w:val="num" w:pos="1440"/>
+        </w:tabs>
+        <w:ind w:left="1440" w:hanging="360"/>
+      </w:pPr>
+      <w:rPr>
+        <w:rFonts w:ascii="Courier New" w:hAnsi="Courier New" w:hint="default"/>
+        <w:sz w:val="20"/>
+      </w:rPr>
+    </w:lvl>
+    <w:lvl w:ilvl="2" w:tentative="1">
+      <w:start w:val="1"/>
+      <w:numFmt w:val="bullet"/>
+      <w:lvlText w:val=""/>
+      <w:lvlJc w:val="left"/>
+      <w:pPr>
+        <w:tabs>
+          <w:tab w:val="num" w:pos="2160"/>
+        </w:tabs>
+        <w:ind w:left="2160" w:hanging="360"/>
+      </w:pPr>
+      <w:rPr>
+        <w:rFonts w:ascii="Wingdings" w:hAnsi="Wingdings" w:hint="default"/>
+        <w:sz w:val="20"/>
+      </w:rPr>
+    </w:lvl>
+    <w:lvl w:ilvl="3" w:tentative="1">
+      <w:start w:val="1"/>
+      <w:numFmt w:val="bullet"/>
+      <w:lvlText w:val=""/>
+      <w:lvlJc w:val="left"/>
+      <w:pPr>
+        <w:tabs>
+          <w:tab w:val="num" w:pos="2880"/>
+        </w:tabs>
+        <w:ind w:left="2880" w:hanging="360"/>
+      </w:pPr>
+      <w:rPr>
+        <w:rFonts w:ascii="Wingdings" w:hAnsi="Wingdings" w:hint="default"/>
+        <w:sz w:val="20"/>
+      </w:rPr>
+    </w:lvl>
+    <w:lvl w:ilvl="4" w:tentative="1">
+      <w:start w:val="1"/>
+      <w:numFmt w:val="bullet"/>
+      <w:lvlText w:val=""/>
+      <w:lvlJc w:val="left"/>
+      <w:pPr>
+        <w:tabs>
+          <w:tab w:val="num" w:pos="3600"/>
+        </w:tabs>
+        <w:ind w:left="3600" w:hanging="360"/>
+      </w:pPr>
+      <w:rPr>
+        <w:rFonts w:ascii="Wingdings" w:hAnsi="Wingdings" w:hint="default"/>
+        <w:sz w:val="20"/>
+      </w:rPr>
+    </w:lvl>
+    <w:lvl w:ilvl="5" w:tentative="1">
+      <w:start w:val="1"/>
+      <w:numFmt w:val="bullet"/>
+      <w:lvlText w:val=""/>
+      <w:lvlJc w:val="left"/>
+      <w:pPr>
+        <w:tabs>
+          <w:tab w:val="num" w:pos="4320"/>
+        </w:tabs>
+        <w:ind w:left="4320" w:hanging="360"/>
+      </w:pPr>
+      <w:rPr>
+        <w:rFonts w:ascii="Wingdings" w:hAnsi="Wingdings" w:hint="default"/>
+        <w:sz w:val="20"/>
+      </w:rPr>
+    </w:lvl>
+    <w:lvl w:ilvl="6" w:tentative="1">
+      <w:start w:val="1"/>
+      <w:numFmt w:val="bullet"/>
+      <w:lvlText w:val=""/>
+      <w:lvlJc w:val="left"/>
+      <w:pPr>
+        <w:tabs>
+          <w:tab w:val="num" w:pos="5040"/>
+        </w:tabs>
+        <w:ind w:left="5040" w:hanging="360"/>
+      </w:pPr>
+      <w:rPr>
+        <w:rFonts w:ascii="Wingdings" w:hAnsi="Wingdings" w:hint="default"/>
+        <w:sz w:val="20"/>
+      </w:rPr>
+    </w:lvl>
+    <w:lvl w:ilvl="7" w:tentative="1">
+      <w:start w:val="1"/>
+      <w:numFmt w:val="bullet"/>
+      <w:lvlText w:val=""/>
+      <w:lvlJc w:val="left"/>
+      <w:pPr>
+        <w:tabs>
+          <w:tab w:val="num" w:pos="5760"/>
+        </w:tabs>
+        <w:ind w:left="5760" w:hanging="360"/>
+      </w:pPr>
+      <w:rPr>
+        <w:rFonts w:ascii="Wingdings" w:hAnsi="Wingdings" w:hint="default"/>
+        <w:sz w:val="20"/>
+      </w:rPr>
+    </w:lvl>
+    <w:lvl w:ilvl="8" w:tentative="1">
+      <w:start w:val="1"/>
+      <w:numFmt w:val="bullet"/>
+      <w:lvlText w:val=""/>
+      <w:lvlJc w:val="left"/>
+      <w:pPr>
+        <w:tabs>
+          <w:tab w:val="num" w:pos="6480"/>
+        </w:tabs>
+        <w:ind w:left="6480" w:hanging="360"/>
+      </w:pPr>
+      <w:rPr>
+        <w:rFonts w:ascii="Wingdings" w:hAnsi="Wingdings" w:hint="default"/>
+        <w:sz w:val="20"/>
+      </w:rPr>
+    </w:lvl>
+  </w:abstractNum>
+  <w:abstractNum w:abstractNumId="36" w15:restartNumberingAfterBreak="0">
     <w:nsid w:val="52530106"/>
     <w:multiLevelType w:val="multilevel"/>
     <w:tmpl w:val="DF9E4E90"/>
@@ -11966,7 +12532,7 @@
       </w:rPr>
     </w:lvl>
   </w:abstractNum>
-  <w:abstractNum w:abstractNumId="34" w15:restartNumberingAfterBreak="0">
+  <w:abstractNum w:abstractNumId="37" w15:restartNumberingAfterBreak="0">
     <w:nsid w:val="579B22F6"/>
     <w:multiLevelType w:val="multilevel"/>
     <w:tmpl w:val="E654B84C"/>
@@ -12115,7 +12681,7 @@
       </w:rPr>
     </w:lvl>
   </w:abstractNum>
-  <w:abstractNum w:abstractNumId="35" w15:restartNumberingAfterBreak="0">
+  <w:abstractNum w:abstractNumId="38" w15:restartNumberingAfterBreak="0">
     <w:nsid w:val="58021DC2"/>
     <w:multiLevelType w:val="multilevel"/>
     <w:tmpl w:val="82104120"/>
@@ -12264,7 +12830,7 @@
       </w:rPr>
     </w:lvl>
   </w:abstractNum>
-  <w:abstractNum w:abstractNumId="36" w15:restartNumberingAfterBreak="0">
+  <w:abstractNum w:abstractNumId="39" w15:restartNumberingAfterBreak="0">
     <w:nsid w:val="5A87367F"/>
     <w:multiLevelType w:val="multilevel"/>
     <w:tmpl w:val="C2CCA71C"/>
@@ -12413,7 +12979,7 @@
       </w:rPr>
     </w:lvl>
   </w:abstractNum>
-  <w:abstractNum w:abstractNumId="37" w15:restartNumberingAfterBreak="0">
+  <w:abstractNum w:abstractNumId="40" w15:restartNumberingAfterBreak="0">
     <w:nsid w:val="5B4E151B"/>
     <w:multiLevelType w:val="multilevel"/>
     <w:tmpl w:val="DC9CCD4C"/>
@@ -12562,7 +13128,7 @@
       </w:rPr>
     </w:lvl>
   </w:abstractNum>
-  <w:abstractNum w:abstractNumId="38" w15:restartNumberingAfterBreak="0">
+  <w:abstractNum w:abstractNumId="41" w15:restartNumberingAfterBreak="0">
     <w:nsid w:val="5ECE3F49"/>
     <w:multiLevelType w:val="multilevel"/>
     <w:tmpl w:val="1958B164"/>
@@ -12711,7 +13277,7 @@
       </w:rPr>
     </w:lvl>
   </w:abstractNum>
-  <w:abstractNum w:abstractNumId="39" w15:restartNumberingAfterBreak="0">
+  <w:abstractNum w:abstractNumId="42" w15:restartNumberingAfterBreak="0">
     <w:nsid w:val="60991102"/>
     <w:multiLevelType w:val="multilevel"/>
     <w:tmpl w:val="713EC634"/>
@@ -12860,7 +13426,7 @@
       </w:rPr>
     </w:lvl>
   </w:abstractNum>
-  <w:abstractNum w:abstractNumId="40" w15:restartNumberingAfterBreak="0">
+  <w:abstractNum w:abstractNumId="43" w15:restartNumberingAfterBreak="0">
     <w:nsid w:val="62302534"/>
     <w:multiLevelType w:val="multilevel"/>
     <w:tmpl w:val="F75AE8F0"/>
@@ -13009,7 +13575,7 @@
       </w:rPr>
     </w:lvl>
   </w:abstractNum>
-  <w:abstractNum w:abstractNumId="41" w15:restartNumberingAfterBreak="0">
+  <w:abstractNum w:abstractNumId="44" w15:restartNumberingAfterBreak="0">
     <w:nsid w:val="6CC173AC"/>
     <w:multiLevelType w:val="multilevel"/>
     <w:tmpl w:val="D67265CC"/>
@@ -13158,7 +13724,7 @@
       </w:rPr>
     </w:lvl>
   </w:abstractNum>
-  <w:abstractNum w:abstractNumId="42" w15:restartNumberingAfterBreak="0">
+  <w:abstractNum w:abstractNumId="45" w15:restartNumberingAfterBreak="0">
     <w:nsid w:val="6D814052"/>
     <w:multiLevelType w:val="multilevel"/>
     <w:tmpl w:val="8E04B6BC"/>
@@ -13307,7 +13873,7 @@
       </w:rPr>
     </w:lvl>
   </w:abstractNum>
-  <w:abstractNum w:abstractNumId="43" w15:restartNumberingAfterBreak="0">
+  <w:abstractNum w:abstractNumId="46" w15:restartNumberingAfterBreak="0">
     <w:nsid w:val="6D8C54B0"/>
     <w:multiLevelType w:val="multilevel"/>
     <w:tmpl w:val="37C4E3B2"/>
@@ -13456,7 +14022,7 @@
       </w:rPr>
     </w:lvl>
   </w:abstractNum>
-  <w:abstractNum w:abstractNumId="44" w15:restartNumberingAfterBreak="0">
+  <w:abstractNum w:abstractNumId="47" w15:restartNumberingAfterBreak="0">
     <w:nsid w:val="6E092798"/>
     <w:multiLevelType w:val="multilevel"/>
     <w:tmpl w:val="695ED14A"/>
@@ -13605,7 +14171,7 @@
       </w:rPr>
     </w:lvl>
   </w:abstractNum>
-  <w:abstractNum w:abstractNumId="45" w15:restartNumberingAfterBreak="0">
+  <w:abstractNum w:abstractNumId="48" w15:restartNumberingAfterBreak="0">
     <w:nsid w:val="703E5A5F"/>
     <w:multiLevelType w:val="multilevel"/>
     <w:tmpl w:val="77322966"/>
@@ -13754,7 +14320,7 @@
       </w:rPr>
     </w:lvl>
   </w:abstractNum>
-  <w:abstractNum w:abstractNumId="46" w15:restartNumberingAfterBreak="0">
+  <w:abstractNum w:abstractNumId="49" w15:restartNumberingAfterBreak="0">
     <w:nsid w:val="71870CE9"/>
     <w:multiLevelType w:val="multilevel"/>
     <w:tmpl w:val="0CFA3350"/>
@@ -13903,7 +14469,305 @@
       </w:rPr>
     </w:lvl>
   </w:abstractNum>
-  <w:abstractNum w:abstractNumId="47" w15:restartNumberingAfterBreak="0">
+  <w:abstractNum w:abstractNumId="50" w15:restartNumberingAfterBreak="0">
+    <w:nsid w:val="74553726"/>
+    <w:multiLevelType w:val="multilevel"/>
+    <w:tmpl w:val="BBDC88DC"/>
+    <w:lvl w:ilvl="0">
+      <w:start w:val="1"/>
+      <w:numFmt w:val="bullet"/>
+      <w:lvlText w:val=""/>
+      <w:lvlJc w:val="left"/>
+      <w:pPr>
+        <w:tabs>
+          <w:tab w:val="num" w:pos="720"/>
+        </w:tabs>
+        <w:ind w:left="720" w:hanging="360"/>
+      </w:pPr>
+      <w:rPr>
+        <w:rFonts w:ascii="Symbol" w:hAnsi="Symbol" w:hint="default"/>
+        <w:sz w:val="20"/>
+      </w:rPr>
+    </w:lvl>
+    <w:lvl w:ilvl="1" w:tentative="1">
+      <w:start w:val="1"/>
+      <w:numFmt w:val="bullet"/>
+      <w:lvlText w:val="o"/>
+      <w:lvlJc w:val="left"/>
+      <w:pPr>
+        <w:tabs>
+          <w:tab w:val="num" w:pos="1440"/>
+        </w:tabs>
+        <w:ind w:left="1440" w:hanging="360"/>
+      </w:pPr>
+      <w:rPr>
+        <w:rFonts w:ascii="Courier New" w:hAnsi="Courier New" w:hint="default"/>
+        <w:sz w:val="20"/>
+      </w:rPr>
+    </w:lvl>
+    <w:lvl w:ilvl="2" w:tentative="1">
+      <w:start w:val="1"/>
+      <w:numFmt w:val="bullet"/>
+      <w:lvlText w:val=""/>
+      <w:lvlJc w:val="left"/>
+      <w:pPr>
+        <w:tabs>
+          <w:tab w:val="num" w:pos="2160"/>
+        </w:tabs>
+        <w:ind w:left="2160" w:hanging="360"/>
+      </w:pPr>
+      <w:rPr>
+        <w:rFonts w:ascii="Wingdings" w:hAnsi="Wingdings" w:hint="default"/>
+        <w:sz w:val="20"/>
+      </w:rPr>
+    </w:lvl>
+    <w:lvl w:ilvl="3" w:tentative="1">
+      <w:start w:val="1"/>
+      <w:numFmt w:val="bullet"/>
+      <w:lvlText w:val=""/>
+      <w:lvlJc w:val="left"/>
+      <w:pPr>
+        <w:tabs>
+          <w:tab w:val="num" w:pos="2880"/>
+        </w:tabs>
+        <w:ind w:left="2880" w:hanging="360"/>
+      </w:pPr>
+      <w:rPr>
+        <w:rFonts w:ascii="Wingdings" w:hAnsi="Wingdings" w:hint="default"/>
+        <w:sz w:val="20"/>
+      </w:rPr>
+    </w:lvl>
+    <w:lvl w:ilvl="4" w:tentative="1">
+      <w:start w:val="1"/>
+      <w:numFmt w:val="bullet"/>
+      <w:lvlText w:val=""/>
+      <w:lvlJc w:val="left"/>
+      <w:pPr>
+        <w:tabs>
+          <w:tab w:val="num" w:pos="3600"/>
+        </w:tabs>
+        <w:ind w:left="3600" w:hanging="360"/>
+      </w:pPr>
+      <w:rPr>
+        <w:rFonts w:ascii="Wingdings" w:hAnsi="Wingdings" w:hint="default"/>
+        <w:sz w:val="20"/>
+      </w:rPr>
+    </w:lvl>
+    <w:lvl w:ilvl="5" w:tentative="1">
+      <w:start w:val="1"/>
+      <w:numFmt w:val="bullet"/>
+      <w:lvlText w:val=""/>
+      <w:lvlJc w:val="left"/>
+      <w:pPr>
+        <w:tabs>
+          <w:tab w:val="num" w:pos="4320"/>
+        </w:tabs>
+        <w:ind w:left="4320" w:hanging="360"/>
+      </w:pPr>
+      <w:rPr>
+        <w:rFonts w:ascii="Wingdings" w:hAnsi="Wingdings" w:hint="default"/>
+        <w:sz w:val="20"/>
+      </w:rPr>
+    </w:lvl>
+    <w:lvl w:ilvl="6" w:tentative="1">
+      <w:start w:val="1"/>
+      <w:numFmt w:val="bullet"/>
+      <w:lvlText w:val=""/>
+      <w:lvlJc w:val="left"/>
+      <w:pPr>
+        <w:tabs>
+          <w:tab w:val="num" w:pos="5040"/>
+        </w:tabs>
+        <w:ind w:left="5040" w:hanging="360"/>
+      </w:pPr>
+      <w:rPr>
+        <w:rFonts w:ascii="Wingdings" w:hAnsi="Wingdings" w:hint="default"/>
+        <w:sz w:val="20"/>
+      </w:rPr>
+    </w:lvl>
+    <w:lvl w:ilvl="7" w:tentative="1">
+      <w:start w:val="1"/>
+      <w:numFmt w:val="bullet"/>
+      <w:lvlText w:val=""/>
+      <w:lvlJc w:val="left"/>
+      <w:pPr>
+        <w:tabs>
+          <w:tab w:val="num" w:pos="5760"/>
+        </w:tabs>
+        <w:ind w:left="5760" w:hanging="360"/>
+      </w:pPr>
+      <w:rPr>
+        <w:rFonts w:ascii="Wingdings" w:hAnsi="Wingdings" w:hint="default"/>
+        <w:sz w:val="20"/>
+      </w:rPr>
+    </w:lvl>
+    <w:lvl w:ilvl="8" w:tentative="1">
+      <w:start w:val="1"/>
+      <w:numFmt w:val="bullet"/>
+      <w:lvlText w:val=""/>
+      <w:lvlJc w:val="left"/>
+      <w:pPr>
+        <w:tabs>
+          <w:tab w:val="num" w:pos="6480"/>
+        </w:tabs>
+        <w:ind w:left="6480" w:hanging="360"/>
+      </w:pPr>
+      <w:rPr>
+        <w:rFonts w:ascii="Wingdings" w:hAnsi="Wingdings" w:hint="default"/>
+        <w:sz w:val="20"/>
+      </w:rPr>
+    </w:lvl>
+  </w:abstractNum>
+  <w:abstractNum w:abstractNumId="51" w15:restartNumberingAfterBreak="0">
+    <w:nsid w:val="752C76A1"/>
+    <w:multiLevelType w:val="multilevel"/>
+    <w:tmpl w:val="835AA320"/>
+    <w:lvl w:ilvl="0">
+      <w:start w:val="1"/>
+      <w:numFmt w:val="bullet"/>
+      <w:lvlText w:val=""/>
+      <w:lvlJc w:val="left"/>
+      <w:pPr>
+        <w:tabs>
+          <w:tab w:val="num" w:pos="720"/>
+        </w:tabs>
+        <w:ind w:left="720" w:hanging="360"/>
+      </w:pPr>
+      <w:rPr>
+        <w:rFonts w:ascii="Symbol" w:hAnsi="Symbol" w:hint="default"/>
+        <w:sz w:val="20"/>
+      </w:rPr>
+    </w:lvl>
+    <w:lvl w:ilvl="1" w:tentative="1">
+      <w:start w:val="1"/>
+      <w:numFmt w:val="bullet"/>
+      <w:lvlText w:val="o"/>
+      <w:lvlJc w:val="left"/>
+      <w:pPr>
+        <w:tabs>
+          <w:tab w:val="num" w:pos="1440"/>
+        </w:tabs>
+        <w:ind w:left="1440" w:hanging="360"/>
+      </w:pPr>
+      <w:rPr>
+        <w:rFonts w:ascii="Courier New" w:hAnsi="Courier New" w:hint="default"/>
+        <w:sz w:val="20"/>
+      </w:rPr>
+    </w:lvl>
+    <w:lvl w:ilvl="2" w:tentative="1">
+      <w:start w:val="1"/>
+      <w:numFmt w:val="bullet"/>
+      <w:lvlText w:val=""/>
+      <w:lvlJc w:val="left"/>
+      <w:pPr>
+        <w:tabs>
+          <w:tab w:val="num" w:pos="2160"/>
+        </w:tabs>
+        <w:ind w:left="2160" w:hanging="360"/>
+      </w:pPr>
+      <w:rPr>
+        <w:rFonts w:ascii="Wingdings" w:hAnsi="Wingdings" w:hint="default"/>
+        <w:sz w:val="20"/>
+      </w:rPr>
+    </w:lvl>
+    <w:lvl w:ilvl="3" w:tentative="1">
+      <w:start w:val="1"/>
+      <w:numFmt w:val="bullet"/>
+      <w:lvlText w:val=""/>
+      <w:lvlJc w:val="left"/>
+      <w:pPr>
+        <w:tabs>
+          <w:tab w:val="num" w:pos="2880"/>
+        </w:tabs>
+        <w:ind w:left="2880" w:hanging="360"/>
+      </w:pPr>
+      <w:rPr>
+        <w:rFonts w:ascii="Wingdings" w:hAnsi="Wingdings" w:hint="default"/>
+        <w:sz w:val="20"/>
+      </w:rPr>
+    </w:lvl>
+    <w:lvl w:ilvl="4" w:tentative="1">
+      <w:start w:val="1"/>
+      <w:numFmt w:val="bullet"/>
+      <w:lvlText w:val=""/>
+      <w:lvlJc w:val="left"/>
+      <w:pPr>
+        <w:tabs>
+          <w:tab w:val="num" w:pos="3600"/>
+        </w:tabs>
+        <w:ind w:left="3600" w:hanging="360"/>
+      </w:pPr>
+      <w:rPr>
+        <w:rFonts w:ascii="Wingdings" w:hAnsi="Wingdings" w:hint="default"/>
+        <w:sz w:val="20"/>
+      </w:rPr>
+    </w:lvl>
+    <w:lvl w:ilvl="5" w:tentative="1">
+      <w:start w:val="1"/>
+      <w:numFmt w:val="bullet"/>
+      <w:lvlText w:val=""/>
+      <w:lvlJc w:val="left"/>
+      <w:pPr>
+        <w:tabs>
+          <w:tab w:val="num" w:pos="4320"/>
+        </w:tabs>
+        <w:ind w:left="4320" w:hanging="360"/>
+      </w:pPr>
+      <w:rPr>
+        <w:rFonts w:ascii="Wingdings" w:hAnsi="Wingdings" w:hint="default"/>
+        <w:sz w:val="20"/>
+      </w:rPr>
+    </w:lvl>
+    <w:lvl w:ilvl="6" w:tentative="1">
+      <w:start w:val="1"/>
+      <w:numFmt w:val="bullet"/>
+      <w:lvlText w:val=""/>
+      <w:lvlJc w:val="left"/>
+      <w:pPr>
+        <w:tabs>
+          <w:tab w:val="num" w:pos="5040"/>
+        </w:tabs>
+        <w:ind w:left="5040" w:hanging="360"/>
+      </w:pPr>
+      <w:rPr>
+        <w:rFonts w:ascii="Wingdings" w:hAnsi="Wingdings" w:hint="default"/>
+        <w:sz w:val="20"/>
+      </w:rPr>
+    </w:lvl>
+    <w:lvl w:ilvl="7" w:tentative="1">
+      <w:start w:val="1"/>
+      <w:numFmt w:val="bullet"/>
+      <w:lvlText w:val=""/>
+      <w:lvlJc w:val="left"/>
+      <w:pPr>
+        <w:tabs>
+          <w:tab w:val="num" w:pos="5760"/>
+        </w:tabs>
+        <w:ind w:left="5760" w:hanging="360"/>
+      </w:pPr>
+      <w:rPr>
+        <w:rFonts w:ascii="Wingdings" w:hAnsi="Wingdings" w:hint="default"/>
+        <w:sz w:val="20"/>
+      </w:rPr>
+    </w:lvl>
+    <w:lvl w:ilvl="8" w:tentative="1">
+      <w:start w:val="1"/>
+      <w:numFmt w:val="bullet"/>
+      <w:lvlText w:val=""/>
+      <w:lvlJc w:val="left"/>
+      <w:pPr>
+        <w:tabs>
+          <w:tab w:val="num" w:pos="6480"/>
+        </w:tabs>
+        <w:ind w:left="6480" w:hanging="360"/>
+      </w:pPr>
+      <w:rPr>
+        <w:rFonts w:ascii="Wingdings" w:hAnsi="Wingdings" w:hint="default"/>
+        <w:sz w:val="20"/>
+      </w:rPr>
+    </w:lvl>
+  </w:abstractNum>
+  <w:abstractNum w:abstractNumId="52" w15:restartNumberingAfterBreak="0">
     <w:nsid w:val="7638144D"/>
     <w:multiLevelType w:val="multilevel"/>
     <w:tmpl w:val="21BE00E2"/>
@@ -14053,130 +14917,130 @@
     </w:lvl>
   </w:abstractNum>
   <w:num w:numId="1" w16cid:durableId="133527383">
-    <w:abstractNumId w:val="14"/>
+    <w:abstractNumId w:val="15"/>
   </w:num>
   <w:num w:numId="2" w16cid:durableId="1949894423">
-    <w:abstractNumId w:val="11"/>
+    <w:abstractNumId w:val="12"/>
   </w:num>
   <w:num w:numId="3" w16cid:durableId="1930195777">
-    <w:abstractNumId w:val="29"/>
+    <w:abstractNumId w:val="30"/>
   </w:num>
   <w:num w:numId="4" w16cid:durableId="701784512">
-    <w:abstractNumId w:val="33"/>
+    <w:abstractNumId w:val="36"/>
   </w:num>
   <w:num w:numId="5" w16cid:durableId="526992074">
-    <w:abstractNumId w:val="32"/>
+    <w:abstractNumId w:val="34"/>
   </w:num>
   <w:num w:numId="6" w16cid:durableId="212471105">
-    <w:abstractNumId w:val="7"/>
+    <w:abstractNumId w:val="8"/>
   </w:num>
   <w:num w:numId="7" w16cid:durableId="1772428672">
-    <w:abstractNumId w:val="9"/>
+    <w:abstractNumId w:val="10"/>
   </w:num>
   <w:num w:numId="8" w16cid:durableId="1805078313">
     <w:abstractNumId w:val="1"/>
   </w:num>
   <w:num w:numId="9" w16cid:durableId="444928011">
-    <w:abstractNumId w:val="25"/>
+    <w:abstractNumId w:val="26"/>
   </w:num>
   <w:num w:numId="10" w16cid:durableId="1814977998">
-    <w:abstractNumId w:val="18"/>
+    <w:abstractNumId w:val="19"/>
   </w:num>
   <w:num w:numId="11" w16cid:durableId="519202613">
     <w:abstractNumId w:val="0"/>
   </w:num>
   <w:num w:numId="12" w16cid:durableId="1172335234">
-    <w:abstractNumId w:val="26"/>
+    <w:abstractNumId w:val="27"/>
   </w:num>
   <w:num w:numId="13" w16cid:durableId="1352297192">
-    <w:abstractNumId w:val="31"/>
+    <w:abstractNumId w:val="32"/>
   </w:num>
   <w:num w:numId="14" w16cid:durableId="480117175">
-    <w:abstractNumId w:val="20"/>
+    <w:abstractNumId w:val="21"/>
   </w:num>
   <w:num w:numId="15" w16cid:durableId="1089472372">
     <w:abstractNumId w:val="2"/>
   </w:num>
   <w:num w:numId="16" w16cid:durableId="1190683533">
-    <w:abstractNumId w:val="10"/>
+    <w:abstractNumId w:val="11"/>
   </w:num>
   <w:num w:numId="17" w16cid:durableId="1749692753">
-    <w:abstractNumId w:val="34"/>
+    <w:abstractNumId w:val="37"/>
   </w:num>
   <w:num w:numId="18" w16cid:durableId="212621603">
-    <w:abstractNumId w:val="24"/>
+    <w:abstractNumId w:val="25"/>
   </w:num>
   <w:num w:numId="19" w16cid:durableId="2031570090">
+    <w:abstractNumId w:val="41"/>
+  </w:num>
+  <w:num w:numId="20" w16cid:durableId="1560634624">
+    <w:abstractNumId w:val="44"/>
+  </w:num>
+  <w:num w:numId="21" w16cid:durableId="1750153203">
+    <w:abstractNumId w:val="46"/>
+  </w:num>
+  <w:num w:numId="22" w16cid:durableId="927928201">
+    <w:abstractNumId w:val="23"/>
+  </w:num>
+  <w:num w:numId="23" w16cid:durableId="1266961602">
+    <w:abstractNumId w:val="28"/>
+  </w:num>
+  <w:num w:numId="24" w16cid:durableId="2082830000">
+    <w:abstractNumId w:val="43"/>
+  </w:num>
+  <w:num w:numId="25" w16cid:durableId="394933328">
+    <w:abstractNumId w:val="13"/>
+  </w:num>
+  <w:num w:numId="26" w16cid:durableId="2072076955">
+    <w:abstractNumId w:val="29"/>
+  </w:num>
+  <w:num w:numId="27" w16cid:durableId="2102527872">
+    <w:abstractNumId w:val="17"/>
+  </w:num>
+  <w:num w:numId="28" w16cid:durableId="702286492">
+    <w:abstractNumId w:val="52"/>
+  </w:num>
+  <w:num w:numId="29" w16cid:durableId="799610513">
+    <w:abstractNumId w:val="18"/>
+  </w:num>
+  <w:num w:numId="30" w16cid:durableId="1554388454">
+    <w:abstractNumId w:val="47"/>
+  </w:num>
+  <w:num w:numId="31" w16cid:durableId="1813935859">
     <w:abstractNumId w:val="38"/>
   </w:num>
-  <w:num w:numId="20" w16cid:durableId="1560634624">
-    <w:abstractNumId w:val="41"/>
+  <w:num w:numId="32" w16cid:durableId="965354912">
+    <w:abstractNumId w:val="14"/>
   </w:num>
-  <w:num w:numId="21" w16cid:durableId="1750153203">
-    <w:abstractNumId w:val="43"/>
-  </w:num>
-  <w:num w:numId="22" w16cid:durableId="927928201">
+  <w:num w:numId="33" w16cid:durableId="492528333">
     <w:abstractNumId w:val="22"/>
   </w:num>
-  <w:num w:numId="23" w16cid:durableId="1266961602">
-    <w:abstractNumId w:val="27"/>
+  <w:num w:numId="34" w16cid:durableId="859709163">
+    <w:abstractNumId w:val="9"/>
   </w:num>
-  <w:num w:numId="24" w16cid:durableId="2082830000">
-    <w:abstractNumId w:val="40"/>
+  <w:num w:numId="35" w16cid:durableId="730618573">
+    <w:abstractNumId w:val="42"/>
   </w:num>
-  <w:num w:numId="25" w16cid:durableId="394933328">
-    <w:abstractNumId w:val="12"/>
+  <w:num w:numId="36" w16cid:durableId="649753194">
+    <w:abstractNumId w:val="20"/>
   </w:num>
-  <w:num w:numId="26" w16cid:durableId="2072076955">
-    <w:abstractNumId w:val="28"/>
-  </w:num>
-  <w:num w:numId="27" w16cid:durableId="2102527872">
+  <w:num w:numId="37" w16cid:durableId="2109081722">
     <w:abstractNumId w:val="16"/>
   </w:num>
-  <w:num w:numId="28" w16cid:durableId="702286492">
-    <w:abstractNumId w:val="47"/>
+  <w:num w:numId="38" w16cid:durableId="63725760">
+    <w:abstractNumId w:val="49"/>
   </w:num>
-  <w:num w:numId="29" w16cid:durableId="799610513">
-    <w:abstractNumId w:val="17"/>
+  <w:num w:numId="39" w16cid:durableId="1181966156">
+    <w:abstractNumId w:val="48"/>
   </w:num>
-  <w:num w:numId="30" w16cid:durableId="1554388454">
-    <w:abstractNumId w:val="44"/>
-  </w:num>
-  <w:num w:numId="31" w16cid:durableId="1813935859">
-    <w:abstractNumId w:val="35"/>
-  </w:num>
-  <w:num w:numId="32" w16cid:durableId="965354912">
-    <w:abstractNumId w:val="13"/>
-  </w:num>
-  <w:num w:numId="33" w16cid:durableId="492528333">
-    <w:abstractNumId w:val="21"/>
-  </w:num>
-  <w:num w:numId="34" w16cid:durableId="859709163">
-    <w:abstractNumId w:val="8"/>
-  </w:num>
-  <w:num w:numId="35" w16cid:durableId="730618573">
+  <w:num w:numId="40" w16cid:durableId="586816399">
     <w:abstractNumId w:val="39"/>
   </w:num>
-  <w:num w:numId="36" w16cid:durableId="649753194">
-    <w:abstractNumId w:val="19"/>
-  </w:num>
-  <w:num w:numId="37" w16cid:durableId="2109081722">
-    <w:abstractNumId w:val="15"/>
-  </w:num>
-  <w:num w:numId="38" w16cid:durableId="63725760">
-    <w:abstractNumId w:val="46"/>
-  </w:num>
-  <w:num w:numId="39" w16cid:durableId="1181966156">
+  <w:num w:numId="41" w16cid:durableId="2045909470">
     <w:abstractNumId w:val="45"/>
   </w:num>
-  <w:num w:numId="40" w16cid:durableId="586816399">
-    <w:abstractNumId w:val="36"/>
-  </w:num>
-  <w:num w:numId="41" w16cid:durableId="2045909470">
-    <w:abstractNumId w:val="42"/>
-  </w:num>
   <w:num w:numId="42" w16cid:durableId="1735006032">
-    <w:abstractNumId w:val="6"/>
+    <w:abstractNumId w:val="7"/>
   </w:num>
   <w:num w:numId="43" w16cid:durableId="1083381784">
     <w:abstractNumId w:val="3"/>
@@ -14185,16 +15049,31 @@
     <w:abstractNumId w:val="5"/>
   </w:num>
   <w:num w:numId="45" w16cid:durableId="1074742468">
-    <w:abstractNumId w:val="23"/>
+    <w:abstractNumId w:val="24"/>
   </w:num>
   <w:num w:numId="46" w16cid:durableId="641811098">
-    <w:abstractNumId w:val="30"/>
+    <w:abstractNumId w:val="31"/>
   </w:num>
   <w:num w:numId="47" w16cid:durableId="1164391450">
-    <w:abstractNumId w:val="37"/>
+    <w:abstractNumId w:val="40"/>
   </w:num>
   <w:num w:numId="48" w16cid:durableId="1894346074">
     <w:abstractNumId w:val="4"/>
+  </w:num>
+  <w:num w:numId="49" w16cid:durableId="290939783">
+    <w:abstractNumId w:val="6"/>
+  </w:num>
+  <w:num w:numId="50" w16cid:durableId="1636523730">
+    <w:abstractNumId w:val="50"/>
+  </w:num>
+  <w:num w:numId="51" w16cid:durableId="1120495614">
+    <w:abstractNumId w:val="51"/>
+  </w:num>
+  <w:num w:numId="52" w16cid:durableId="1357347166">
+    <w:abstractNumId w:val="35"/>
+  </w:num>
+  <w:num w:numId="53" w16cid:durableId="979655563">
+    <w:abstractNumId w:val="33"/>
   </w:num>
 </w:numbering>
 </file>

</xml_diff>

<commit_message>
feat: add mean-based interpretation (MAAS support) and fix result UI
</commit_message>
<xml_diff>
--- a/SESSION.md.docx
+++ b/SESSION.md.docx
@@ -766,7 +766,6 @@
           <w14:ligatures w14:val="none"/>
         </w:rPr>
       </w:pPr>
-      <w:proofErr w:type="spellStart"/>
       <w:r>
         <w:rPr>
           <w:rFonts w:ascii="Courier New" w:eastAsia="Times New Roman" w:hAnsi="Courier New" w:cs="Courier New"/>
@@ -778,7 +777,6 @@
         </w:rPr>
         <w:t>subscales_sum</w:t>
       </w:r>
-      <w:proofErr w:type="spellEnd"/>
       <w:r>
         <w:rPr>
           <w:rFonts w:ascii="Times New Roman" w:eastAsia="Times New Roman" w:hAnsi="Times New Roman" w:cs="Times New Roman"/>
@@ -807,7 +805,6 @@
           <w14:ligatures w14:val="none"/>
         </w:rPr>
       </w:pPr>
-      <w:proofErr w:type="spellStart"/>
       <w:r>
         <w:rPr>
           <w:rFonts w:ascii="Courier New" w:eastAsia="Times New Roman" w:hAnsi="Courier New" w:cs="Courier New"/>
@@ -819,7 +816,6 @@
         </w:rPr>
         <w:t>sum_with_subscales</w:t>
       </w:r>
-      <w:proofErr w:type="spellEnd"/>
       <w:r>
         <w:rPr>
           <w:rFonts w:ascii="Times New Roman" w:eastAsia="Times New Roman" w:hAnsi="Times New Roman" w:cs="Times New Roman"/>
@@ -999,7 +995,6 @@
         </w:rPr>
         <w:t>result band interpretation (</w:t>
       </w:r>
-      <w:proofErr w:type="spellStart"/>
       <w:r>
         <w:rPr>
           <w:rFonts w:ascii="Courier New" w:eastAsia="Times New Roman" w:hAnsi="Courier New" w:cs="Courier New"/>
@@ -1011,7 +1006,6 @@
         </w:rPr>
         <w:t>resultBands</w:t>
       </w:r>
-      <w:proofErr w:type="spellEnd"/>
       <w:r>
         <w:rPr>
           <w:rFonts w:ascii="Times New Roman" w:eastAsia="Times New Roman" w:hAnsi="Times New Roman" w:cs="Times New Roman"/>
@@ -1208,31 +1202,7 @@
           <w14:ligatures w14:val="none"/>
         </w:rPr>
         <w:br/>
-        <w:t xml:space="preserve">  </w:t>
-      </w:r>
-      <w:proofErr w:type="spellStart"/>
-      <w:r>
-        <w:rPr>
-          <w:rFonts w:ascii="Courier New" w:eastAsia="Times New Roman" w:hAnsi="Courier New" w:cs="Courier New"/>
-          <w:kern w:val="0"/>
-          <w:sz w:val="20"/>
-          <w:szCs w:val="20"/>
-          <w:lang w:val="en-GB" w:eastAsia="en-GB"/>
-          <w14:ligatures w14:val="none"/>
-        </w:rPr>
-        <w:t>percentileText</w:t>
-      </w:r>
-      <w:proofErr w:type="spellEnd"/>
-      <w:r>
-        <w:rPr>
-          <w:rFonts w:ascii="Courier New" w:eastAsia="Times New Roman" w:hAnsi="Courier New" w:cs="Courier New"/>
-          <w:kern w:val="0"/>
-          <w:sz w:val="20"/>
-          <w:szCs w:val="20"/>
-          <w:lang w:val="en-GB" w:eastAsia="en-GB"/>
-          <w14:ligatures w14:val="none"/>
-        </w:rPr>
-        <w:t>: string | null</w:t>
+        <w:t xml:space="preserve">  percentileText: string | null</w:t>
       </w:r>
       <w:r>
         <w:rPr>
@@ -2730,7 +2700,6 @@
           <w14:ligatures w14:val="none"/>
         </w:rPr>
       </w:pPr>
-      <w:proofErr w:type="spellStart"/>
       <w:r>
         <w:rPr>
           <w:rFonts w:ascii="Courier New" w:eastAsia="Times New Roman" w:hAnsi="Courier New" w:cs="Courier New"/>
@@ -2740,9 +2709,8 @@
           <w:lang w:val="en-GB" w:eastAsia="en-GB"/>
           <w14:ligatures w14:val="none"/>
         </w:rPr>
-        <w:t>src</w:t>
-      </w:r>
-      <w:proofErr w:type="spellEnd"/>
+        <w:t>src/</w:t>
+      </w:r>
       <w:r>
         <w:rPr>
           <w:rFonts w:ascii="Courier New" w:eastAsia="Times New Roman" w:hAnsi="Courier New" w:cs="Courier New"/>
@@ -2752,7 +2720,8 @@
           <w:lang w:val="en-GB" w:eastAsia="en-GB"/>
           <w14:ligatures w14:val="none"/>
         </w:rPr>
-        <w:t>/</w:t>
+        <w:br/>
+        <w:t xml:space="preserve">  App.tsx</w:t>
       </w:r>
       <w:r>
         <w:rPr>
@@ -2764,9 +2733,8 @@
           <w14:ligatures w14:val="none"/>
         </w:rPr>
         <w:br/>
-        <w:t xml:space="preserve">  </w:t>
-      </w:r>
-      <w:proofErr w:type="spellStart"/>
+        <w:t xml:space="preserve">  scoring.ts</w:t>
+      </w:r>
       <w:r>
         <w:rPr>
           <w:rFonts w:ascii="Courier New" w:eastAsia="Times New Roman" w:hAnsi="Courier New" w:cs="Courier New"/>
@@ -2776,9 +2744,9 @@
           <w:lang w:val="en-GB" w:eastAsia="en-GB"/>
           <w14:ligatures w14:val="none"/>
         </w:rPr>
-        <w:t>App.tsx</w:t>
-      </w:r>
-      <w:proofErr w:type="spellEnd"/>
+        <w:br/>
+        <w:t xml:space="preserve">  validateQuestionnaire.ts</w:t>
+      </w:r>
       <w:r>
         <w:rPr>
           <w:rFonts w:ascii="Courier New" w:eastAsia="Times New Roman" w:hAnsi="Courier New" w:cs="Courier New"/>
@@ -2789,9 +2757,8 @@
           <w14:ligatures w14:val="none"/>
         </w:rPr>
         <w:br/>
-        <w:t xml:space="preserve">  </w:t>
-      </w:r>
-      <w:proofErr w:type="spellStart"/>
+        <w:t xml:space="preserve">  data/</w:t>
+      </w:r>
       <w:r>
         <w:rPr>
           <w:rFonts w:ascii="Courier New" w:eastAsia="Times New Roman" w:hAnsi="Courier New" w:cs="Courier New"/>
@@ -2801,9 +2768,9 @@
           <w:lang w:val="en-GB" w:eastAsia="en-GB"/>
           <w14:ligatures w14:val="none"/>
         </w:rPr>
-        <w:t>scoring.ts</w:t>
-      </w:r>
-      <w:proofErr w:type="spellEnd"/>
+        <w:br/>
+        <w:t xml:space="preserve">    questionnaires/</w:t>
+      </w:r>
       <w:r>
         <w:rPr>
           <w:rFonts w:ascii="Courier New" w:eastAsia="Times New Roman" w:hAnsi="Courier New" w:cs="Courier New"/>
@@ -2814,9 +2781,8 @@
           <w14:ligatures w14:val="none"/>
         </w:rPr>
         <w:br/>
-        <w:t xml:space="preserve">  </w:t>
-      </w:r>
-      <w:proofErr w:type="spellStart"/>
+        <w:t xml:space="preserve">      *.json</w:t>
+      </w:r>
       <w:r>
         <w:rPr>
           <w:rFonts w:ascii="Courier New" w:eastAsia="Times New Roman" w:hAnsi="Courier New" w:cs="Courier New"/>
@@ -2826,9 +2792,9 @@
           <w:lang w:val="en-GB" w:eastAsia="en-GB"/>
           <w14:ligatures w14:val="none"/>
         </w:rPr>
-        <w:t>validateQuestionnaire.ts</w:t>
-      </w:r>
-      <w:proofErr w:type="spellEnd"/>
+        <w:br/>
+        <w:t>styles/</w:t>
+      </w:r>
       <w:r>
         <w:rPr>
           <w:rFonts w:ascii="Courier New" w:eastAsia="Times New Roman" w:hAnsi="Courier New" w:cs="Courier New"/>
@@ -2839,67 +2805,6 @@
           <w14:ligatures w14:val="none"/>
         </w:rPr>
         <w:br/>
-        <w:t xml:space="preserve">  data/</w:t>
-      </w:r>
-      <w:r>
-        <w:rPr>
-          <w:rFonts w:ascii="Courier New" w:eastAsia="Times New Roman" w:hAnsi="Courier New" w:cs="Courier New"/>
-          <w:kern w:val="0"/>
-          <w:sz w:val="20"/>
-          <w:szCs w:val="20"/>
-          <w:lang w:val="en-GB" w:eastAsia="en-GB"/>
-          <w14:ligatures w14:val="none"/>
-        </w:rPr>
-        <w:br/>
-        <w:t xml:space="preserve">    questionnaires/</w:t>
-      </w:r>
-      <w:r>
-        <w:rPr>
-          <w:rFonts w:ascii="Courier New" w:eastAsia="Times New Roman" w:hAnsi="Courier New" w:cs="Courier New"/>
-          <w:kern w:val="0"/>
-          <w:sz w:val="20"/>
-          <w:szCs w:val="20"/>
-          <w:lang w:val="en-GB" w:eastAsia="en-GB"/>
-          <w14:ligatures w14:val="none"/>
-        </w:rPr>
-        <w:br/>
-        <w:t xml:space="preserve">      *.</w:t>
-      </w:r>
-      <w:proofErr w:type="spellStart"/>
-      <w:r>
-        <w:rPr>
-          <w:rFonts w:ascii="Courier New" w:eastAsia="Times New Roman" w:hAnsi="Courier New" w:cs="Courier New"/>
-          <w:kern w:val="0"/>
-          <w:sz w:val="20"/>
-          <w:szCs w:val="20"/>
-          <w:lang w:val="en-GB" w:eastAsia="en-GB"/>
-          <w14:ligatures w14:val="none"/>
-        </w:rPr>
-        <w:t>json</w:t>
-      </w:r>
-      <w:proofErr w:type="spellEnd"/>
-      <w:r>
-        <w:rPr>
-          <w:rFonts w:ascii="Courier New" w:eastAsia="Times New Roman" w:hAnsi="Courier New" w:cs="Courier New"/>
-          <w:kern w:val="0"/>
-          <w:sz w:val="20"/>
-          <w:szCs w:val="20"/>
-          <w:lang w:val="en-GB" w:eastAsia="en-GB"/>
-          <w14:ligatures w14:val="none"/>
-        </w:rPr>
-        <w:br/>
-        <w:t>styles/</w:t>
-      </w:r>
-      <w:r>
-        <w:rPr>
-          <w:rFonts w:ascii="Courier New" w:eastAsia="Times New Roman" w:hAnsi="Courier New" w:cs="Courier New"/>
-          <w:kern w:val="0"/>
-          <w:sz w:val="20"/>
-          <w:szCs w:val="20"/>
-          <w:lang w:val="en-GB" w:eastAsia="en-GB"/>
-          <w14:ligatures w14:val="none"/>
-        </w:rPr>
-        <w:br/>
         <w:t xml:space="preserve">  App.css</w:t>
       </w:r>
     </w:p>
@@ -2925,7 +2830,7 @@
           <w14:ligatures w14:val="none"/>
         </w:rPr>
         <w:pict w14:anchorId="433ED6B6">
-          <v:rect id="_x0000_i1033" style="width:0;height:1.5pt" o:hralign="center" o:hrstd="t" o:hr="t" fillcolor="#a0a0a0" stroked="f"/>
+          <v:rect id="_x0000_i1026" style="width:0;height:1.5pt" o:hralign="center" o:hrstd="t" o:hr="t" fillcolor="#a0a0a0" stroked="f"/>
         </w:pict>
       </w:r>
     </w:p>
@@ -3315,29 +3220,16 @@
           <w14:ligatures w14:val="none"/>
         </w:rPr>
       </w:pPr>
-      <w:proofErr w:type="spellStart"/>
-      <w:r>
-        <w:rPr>
-          <w:rFonts w:ascii="Times New Roman" w:eastAsia="Times New Roman" w:hAnsi="Times New Roman" w:cs="Times New Roman"/>
-          <w:kern w:val="0"/>
-          <w:sz w:val="24"/>
-          <w:szCs w:val="24"/>
-          <w:lang w:val="en-GB" w:eastAsia="en-GB"/>
-          <w14:ligatures w14:val="none"/>
-        </w:rPr>
-        <w:t>Colors</w:t>
-      </w:r>
-      <w:proofErr w:type="spellEnd"/>
-      <w:r>
-        <w:rPr>
-          <w:rFonts w:ascii="Times New Roman" w:eastAsia="Times New Roman" w:hAnsi="Times New Roman" w:cs="Times New Roman"/>
-          <w:kern w:val="0"/>
-          <w:sz w:val="24"/>
-          <w:szCs w:val="24"/>
-          <w:lang w:val="en-GB" w:eastAsia="en-GB"/>
-          <w14:ligatures w14:val="none"/>
-        </w:rPr>
-        <w:t xml:space="preserve">: </w:t>
+      <w:r>
+        <w:rPr>
+          <w:rFonts w:ascii="Times New Roman" w:eastAsia="Times New Roman" w:hAnsi="Times New Roman" w:cs="Times New Roman"/>
+          <w:kern w:val="0"/>
+          <w:sz w:val="24"/>
+          <w:szCs w:val="24"/>
+          <w:lang w:val="en-GB" w:eastAsia="en-GB"/>
+          <w14:ligatures w14:val="none"/>
+        </w:rPr>
+        <w:t xml:space="preserve">Colors: </w:t>
       </w:r>
     </w:p>
     <w:p>
@@ -3393,31 +3285,7 @@
           <w:lang w:val="en-GB" w:eastAsia="en-GB"/>
           <w14:ligatures w14:val="none"/>
         </w:rPr>
-        <w:t xml:space="preserve">optional semantic </w:t>
-      </w:r>
-      <w:proofErr w:type="spellStart"/>
-      <w:r>
-        <w:rPr>
-          <w:rFonts w:ascii="Times New Roman" w:eastAsia="Times New Roman" w:hAnsi="Times New Roman" w:cs="Times New Roman"/>
-          <w:kern w:val="0"/>
-          <w:sz w:val="24"/>
-          <w:szCs w:val="24"/>
-          <w:lang w:val="en-GB" w:eastAsia="en-GB"/>
-          <w14:ligatures w14:val="none"/>
-        </w:rPr>
-        <w:t>coloring</w:t>
-      </w:r>
-      <w:proofErr w:type="spellEnd"/>
-      <w:r>
-        <w:rPr>
-          <w:rFonts w:ascii="Times New Roman" w:eastAsia="Times New Roman" w:hAnsi="Times New Roman" w:cs="Times New Roman"/>
-          <w:kern w:val="0"/>
-          <w:sz w:val="24"/>
-          <w:szCs w:val="24"/>
-          <w:lang w:val="en-GB" w:eastAsia="en-GB"/>
-          <w14:ligatures w14:val="none"/>
-        </w:rPr>
-        <w:t xml:space="preserve"> via level keys </w:t>
+        <w:t xml:space="preserve">optional semantic coloring via level keys </w:t>
       </w:r>
     </w:p>
     <w:p>
@@ -3936,7 +3804,6 @@
           <w14:ligatures w14:val="none"/>
         </w:rPr>
       </w:pPr>
-      <w:proofErr w:type="spellStart"/>
       <w:r>
         <w:rPr>
           <w:rFonts w:ascii="Times New Roman" w:eastAsia="Times New Roman" w:hAnsi="Times New Roman" w:cs="Times New Roman"/>
@@ -3947,19 +3814,7 @@
           <w14:ligatures w14:val="none"/>
         </w:rPr>
         <w:lastRenderedPageBreak/>
-        <w:t>color</w:t>
-      </w:r>
-      <w:proofErr w:type="spellEnd"/>
-      <w:r>
-        <w:rPr>
-          <w:rFonts w:ascii="Times New Roman" w:eastAsia="Times New Roman" w:hAnsi="Times New Roman" w:cs="Times New Roman"/>
-          <w:kern w:val="0"/>
-          <w:sz w:val="24"/>
-          <w:szCs w:val="24"/>
-          <w:lang w:val="en-GB" w:eastAsia="en-GB"/>
-          <w14:ligatures w14:val="none"/>
-        </w:rPr>
-        <w:t xml:space="preserve"> mapping via JSON (</w:t>
+        <w:t>color mapping via JSON (</w:t>
       </w:r>
       <w:r>
         <w:rPr>
@@ -4331,7 +4186,7 @@
           <w14:ligatures w14:val="none"/>
         </w:rPr>
         <w:pict w14:anchorId="68C65A6D">
-          <v:rect id="_x0000_i1066" style="width:0;height:1.5pt" o:hralign="center" o:hrstd="t" o:hr="t" fillcolor="#a0a0a0" stroked="f"/>
+          <v:rect id="_x0000_i1027" style="width:0;height:1.5pt" o:hralign="center" o:hrstd="t" o:hr="t" fillcolor="#a0a0a0" stroked="f"/>
         </w:pict>
       </w:r>
     </w:p>
@@ -4587,31 +4442,7 @@
           <w:lang w:val="en-GB" w:eastAsia="en-GB"/>
           <w14:ligatures w14:val="none"/>
         </w:rPr>
-        <w:t xml:space="preserve">introduce </w:t>
-      </w:r>
-      <w:proofErr w:type="spellStart"/>
-      <w:r>
-        <w:rPr>
-          <w:rFonts w:ascii="Times New Roman" w:eastAsia="Times New Roman" w:hAnsi="Times New Roman" w:cs="Times New Roman"/>
-          <w:kern w:val="0"/>
-          <w:sz w:val="24"/>
-          <w:szCs w:val="24"/>
-          <w:lang w:val="en-GB" w:eastAsia="en-GB"/>
-          <w14:ligatures w14:val="none"/>
-        </w:rPr>
-        <w:t>resultDescription</w:t>
-      </w:r>
-      <w:proofErr w:type="spellEnd"/>
-      <w:r>
-        <w:rPr>
-          <w:rFonts w:ascii="Times New Roman" w:eastAsia="Times New Roman" w:hAnsi="Times New Roman" w:cs="Times New Roman"/>
-          <w:kern w:val="0"/>
-          <w:sz w:val="24"/>
-          <w:szCs w:val="24"/>
-          <w:lang w:val="en-GB" w:eastAsia="en-GB"/>
-          <w14:ligatures w14:val="none"/>
-        </w:rPr>
-        <w:t xml:space="preserve"> field in questionnaire schema </w:t>
+        <w:t xml:space="preserve">introduce resultDescription field in questionnaire schema </w:t>
       </w:r>
     </w:p>
     <w:p>
@@ -4773,31 +4604,7 @@
           <w:lang w:val="en-GB" w:eastAsia="en-GB"/>
           <w14:ligatures w14:val="none"/>
         </w:rPr>
-        <w:t xml:space="preserve">extend Questionnaire type with optional </w:t>
-      </w:r>
-      <w:proofErr w:type="spellStart"/>
-      <w:r>
-        <w:rPr>
-          <w:rFonts w:ascii="Times New Roman" w:eastAsia="Times New Roman" w:hAnsi="Times New Roman" w:cs="Times New Roman"/>
-          <w:kern w:val="0"/>
-          <w:sz w:val="24"/>
-          <w:szCs w:val="24"/>
-          <w:lang w:val="en-GB" w:eastAsia="en-GB"/>
-          <w14:ligatures w14:val="none"/>
-        </w:rPr>
-        <w:t>resultDescription</w:t>
-      </w:r>
-      <w:proofErr w:type="spellEnd"/>
-      <w:r>
-        <w:rPr>
-          <w:rFonts w:ascii="Times New Roman" w:eastAsia="Times New Roman" w:hAnsi="Times New Roman" w:cs="Times New Roman"/>
-          <w:kern w:val="0"/>
-          <w:sz w:val="24"/>
-          <w:szCs w:val="24"/>
-          <w:lang w:val="en-GB" w:eastAsia="en-GB"/>
-          <w14:ligatures w14:val="none"/>
-        </w:rPr>
-        <w:t xml:space="preserve"> </w:t>
+        <w:t xml:space="preserve">extend Questionnaire type with optional resultDescription </w:t>
       </w:r>
     </w:p>
     <w:p>
@@ -4825,31 +4632,7 @@
           <w:lang w:val="en-GB" w:eastAsia="en-GB"/>
           <w14:ligatures w14:val="none"/>
         </w:rPr>
-        <w:t xml:space="preserve">add validation for </w:t>
-      </w:r>
-      <w:proofErr w:type="spellStart"/>
-      <w:r>
-        <w:rPr>
-          <w:rFonts w:ascii="Times New Roman" w:eastAsia="Times New Roman" w:hAnsi="Times New Roman" w:cs="Times New Roman"/>
-          <w:kern w:val="0"/>
-          <w:sz w:val="24"/>
-          <w:szCs w:val="24"/>
-          <w:lang w:val="en-GB" w:eastAsia="en-GB"/>
-          <w14:ligatures w14:val="none"/>
-        </w:rPr>
-        <w:t>resultDescription</w:t>
-      </w:r>
-      <w:proofErr w:type="spellEnd"/>
-      <w:r>
-        <w:rPr>
-          <w:rFonts w:ascii="Times New Roman" w:eastAsia="Times New Roman" w:hAnsi="Times New Roman" w:cs="Times New Roman"/>
-          <w:kern w:val="0"/>
-          <w:sz w:val="24"/>
-          <w:szCs w:val="24"/>
-          <w:lang w:val="en-GB" w:eastAsia="en-GB"/>
-          <w14:ligatures w14:val="none"/>
-        </w:rPr>
-        <w:t xml:space="preserve"> field </w:t>
+        <w:t xml:space="preserve">add validation for resultDescription field </w:t>
       </w:r>
     </w:p>
     <w:p>
@@ -4960,31 +4743,7 @@
           <w:lang w:val="en-GB" w:eastAsia="en-GB"/>
           <w14:ligatures w14:val="none"/>
         </w:rPr>
-        <w:t xml:space="preserve">improve display of mean values (value / max instead of value </w:t>
-      </w:r>
-      <w:proofErr w:type="spellStart"/>
-      <w:r>
-        <w:rPr>
-          <w:rFonts w:ascii="Times New Roman" w:eastAsia="Times New Roman" w:hAnsi="Times New Roman" w:cs="Times New Roman"/>
-          <w:kern w:val="0"/>
-          <w:sz w:val="24"/>
-          <w:szCs w:val="24"/>
-          <w:lang w:val="en-GB" w:eastAsia="en-GB"/>
-          <w14:ligatures w14:val="none"/>
-        </w:rPr>
-        <w:t>из</w:t>
-      </w:r>
-      <w:proofErr w:type="spellEnd"/>
-      <w:r>
-        <w:rPr>
-          <w:rFonts w:ascii="Times New Roman" w:eastAsia="Times New Roman" w:hAnsi="Times New Roman" w:cs="Times New Roman"/>
-          <w:kern w:val="0"/>
-          <w:sz w:val="24"/>
-          <w:szCs w:val="24"/>
-          <w:lang w:val="en-GB" w:eastAsia="en-GB"/>
-          <w14:ligatures w14:val="none"/>
-        </w:rPr>
-        <w:t xml:space="preserve"> max) </w:t>
+        <w:t xml:space="preserve">improve display of mean values (value / max instead of value из max) </w:t>
       </w:r>
     </w:p>
     <w:p>
@@ -5037,7 +4796,7 @@
           <w14:ligatures w14:val="none"/>
         </w:rPr>
         <w:pict w14:anchorId="216674FC">
-          <v:rect id="_x0000_i1041" style="width:0;height:1.5pt" o:hralign="center" o:hrstd="t" o:hr="t" fillcolor="#a0a0a0" stroked="f"/>
+          <v:rect id="_x0000_i1028" style="width:0;height:1.5pt" o:hralign="center" o:hrstd="t" o:hr="t" fillcolor="#a0a0a0" stroked="f"/>
         </w:pict>
       </w:r>
     </w:p>
@@ -5120,35 +4879,7 @@
           <w:lang w:val="en-GB" w:eastAsia="en-GB"/>
           <w14:ligatures w14:val="none"/>
         </w:rPr>
-        <w:t>question-level answer options (</w:t>
-      </w:r>
-      <w:proofErr w:type="spellStart"/>
-      <w:r>
-        <w:rPr>
-          <w:rFonts w:ascii="Times New Roman" w:eastAsia="Times New Roman" w:hAnsi="Times New Roman" w:cs="Times New Roman"/>
-          <w:b/>
-          <w:bCs/>
-          <w:kern w:val="0"/>
-          <w:sz w:val="24"/>
-          <w:szCs w:val="24"/>
-          <w:lang w:val="en-GB" w:eastAsia="en-GB"/>
-          <w14:ligatures w14:val="none"/>
-        </w:rPr>
-        <w:t>question.options</w:t>
-      </w:r>
-      <w:proofErr w:type="spellEnd"/>
-      <w:r>
-        <w:rPr>
-          <w:rFonts w:ascii="Times New Roman" w:eastAsia="Times New Roman" w:hAnsi="Times New Roman" w:cs="Times New Roman"/>
-          <w:b/>
-          <w:bCs/>
-          <w:kern w:val="0"/>
-          <w:sz w:val="24"/>
-          <w:szCs w:val="24"/>
-          <w:lang w:val="en-GB" w:eastAsia="en-GB"/>
-          <w14:ligatures w14:val="none"/>
-        </w:rPr>
-        <w:t>)</w:t>
+        <w:t>question-level answer options (question.options)</w:t>
       </w:r>
       <w:r>
         <w:rPr>
@@ -5206,29 +4937,16 @@
           <w14:ligatures w14:val="none"/>
         </w:rPr>
       </w:pPr>
-      <w:proofErr w:type="spellStart"/>
-      <w:r>
-        <w:rPr>
-          <w:rFonts w:ascii="Times New Roman" w:eastAsia="Times New Roman" w:hAnsi="Times New Roman" w:cs="Times New Roman"/>
-          <w:kern w:val="0"/>
-          <w:sz w:val="24"/>
-          <w:szCs w:val="24"/>
-          <w:lang w:val="en-GB" w:eastAsia="en-GB"/>
-          <w14:ligatures w14:val="none"/>
-        </w:rPr>
-        <w:t>question.options</w:t>
-      </w:r>
-      <w:proofErr w:type="spellEnd"/>
-      <w:r>
-        <w:rPr>
-          <w:rFonts w:ascii="Times New Roman" w:eastAsia="Times New Roman" w:hAnsi="Times New Roman" w:cs="Times New Roman"/>
-          <w:kern w:val="0"/>
-          <w:sz w:val="24"/>
-          <w:szCs w:val="24"/>
-          <w:lang w:val="en-GB" w:eastAsia="en-GB"/>
-          <w14:ligatures w14:val="none"/>
-        </w:rPr>
-        <w:t xml:space="preserve"> when defined </w:t>
+      <w:r>
+        <w:rPr>
+          <w:rFonts w:ascii="Times New Roman" w:eastAsia="Times New Roman" w:hAnsi="Times New Roman" w:cs="Times New Roman"/>
+          <w:kern w:val="0"/>
+          <w:sz w:val="24"/>
+          <w:szCs w:val="24"/>
+          <w:lang w:val="en-GB" w:eastAsia="en-GB"/>
+          <w14:ligatures w14:val="none"/>
+        </w:rPr>
+        <w:t xml:space="preserve">question.options when defined </w:t>
       </w:r>
     </w:p>
     <w:p>
@@ -5256,31 +4974,7 @@
           <w:lang w:val="en-GB" w:eastAsia="en-GB"/>
           <w14:ligatures w14:val="none"/>
         </w:rPr>
-        <w:t xml:space="preserve">fallback to </w:t>
-      </w:r>
-      <w:proofErr w:type="spellStart"/>
-      <w:r>
-        <w:rPr>
-          <w:rFonts w:ascii="Times New Roman" w:eastAsia="Times New Roman" w:hAnsi="Times New Roman" w:cs="Times New Roman"/>
-          <w:kern w:val="0"/>
-          <w:sz w:val="24"/>
-          <w:szCs w:val="24"/>
-          <w:lang w:val="en-GB" w:eastAsia="en-GB"/>
-          <w14:ligatures w14:val="none"/>
-        </w:rPr>
-        <w:t>scale.options</w:t>
-      </w:r>
-      <w:proofErr w:type="spellEnd"/>
-      <w:r>
-        <w:rPr>
-          <w:rFonts w:ascii="Times New Roman" w:eastAsia="Times New Roman" w:hAnsi="Times New Roman" w:cs="Times New Roman"/>
-          <w:kern w:val="0"/>
-          <w:sz w:val="24"/>
-          <w:szCs w:val="24"/>
-          <w:lang w:val="en-GB" w:eastAsia="en-GB"/>
-          <w14:ligatures w14:val="none"/>
-        </w:rPr>
-        <w:t xml:space="preserve"> otherwise </w:t>
+        <w:t xml:space="preserve">fallback to scale.options otherwise </w:t>
       </w:r>
     </w:p>
     <w:p>
@@ -5910,31 +5604,7 @@
           <w:lang w:val="en-GB" w:eastAsia="en-GB"/>
           <w14:ligatures w14:val="none"/>
         </w:rPr>
-        <w:t xml:space="preserve">add validation for </w:t>
-      </w:r>
-      <w:proofErr w:type="spellStart"/>
-      <w:r>
-        <w:rPr>
-          <w:rFonts w:ascii="Times New Roman" w:eastAsia="Times New Roman" w:hAnsi="Times New Roman" w:cs="Times New Roman"/>
-          <w:kern w:val="0"/>
-          <w:sz w:val="24"/>
-          <w:szCs w:val="24"/>
-          <w:lang w:val="en-GB" w:eastAsia="en-GB"/>
-          <w14:ligatures w14:val="none"/>
-        </w:rPr>
-        <w:t>question.options</w:t>
-      </w:r>
-      <w:proofErr w:type="spellEnd"/>
-      <w:r>
-        <w:rPr>
-          <w:rFonts w:ascii="Times New Roman" w:eastAsia="Times New Roman" w:hAnsi="Times New Roman" w:cs="Times New Roman"/>
-          <w:kern w:val="0"/>
-          <w:sz w:val="24"/>
-          <w:szCs w:val="24"/>
-          <w:lang w:val="en-GB" w:eastAsia="en-GB"/>
-          <w14:ligatures w14:val="none"/>
-        </w:rPr>
-        <w:t xml:space="preserve"> </w:t>
+        <w:t xml:space="preserve">add validation for question.options </w:t>
       </w:r>
     </w:p>
     <w:p>
@@ -5985,7 +5655,7 @@
           <w:lang w:val="en-GB"/>
         </w:rPr>
         <w:pict w14:anchorId="04DD64FB">
-          <v:rect id="_x0000_i1045" style="width:0;height:1.5pt" o:hralign="center" o:hrstd="t" o:hr="t" fillcolor="#a0a0a0" stroked="f"/>
+          <v:rect id="_x0000_i1029" style="width:0;height:1.5pt" o:hralign="center" o:hrstd="t" o:hr="t" fillcolor="#a0a0a0" stroked="f"/>
         </w:pict>
       </w:r>
     </w:p>
@@ -6031,21 +5701,7 @@
         <w:rPr>
           <w:lang w:val="en-GB"/>
         </w:rPr>
-        <w:t xml:space="preserve">implement </w:t>
-      </w:r>
-      <w:proofErr w:type="spellStart"/>
-      <w:r>
-        <w:rPr>
-          <w:lang w:val="en-GB"/>
-        </w:rPr>
-        <w:t>ui.inputMode</w:t>
-      </w:r>
-      <w:proofErr w:type="spellEnd"/>
-      <w:r>
-        <w:rPr>
-          <w:lang w:val="en-GB"/>
-        </w:rPr>
-        <w:t xml:space="preserve"> with support for: </w:t>
+        <w:t xml:space="preserve">implement ui.inputMode with support for: </w:t>
       </w:r>
     </w:p>
     <w:p>
@@ -6134,18 +5790,8 @@
           <w:bCs/>
           <w:lang w:val="en-GB"/>
         </w:rPr>
-        <w:t xml:space="preserve"> slider </w:t>
-      </w:r>
-      <w:proofErr w:type="spellStart"/>
-      <w:r>
-        <w:rPr>
-          <w:b/>
-          <w:bCs/>
-          <w:lang w:val="en-GB"/>
-        </w:rPr>
-        <w:t>behavior</w:t>
-      </w:r>
-      <w:proofErr w:type="spellEnd"/>
+        <w:t xml:space="preserve"> slider behavior</w:t>
+      </w:r>
     </w:p>
     <w:p>
       <w:pPr>
@@ -6269,21 +5915,7 @@
         <w:rPr>
           <w:lang w:val="en-GB"/>
         </w:rPr>
-        <w:t xml:space="preserve">introduce </w:t>
-      </w:r>
-      <w:proofErr w:type="spellStart"/>
-      <w:r>
-        <w:rPr>
-          <w:lang w:val="en-GB"/>
-        </w:rPr>
-        <w:t>effectiveAnswer</w:t>
-      </w:r>
-      <w:proofErr w:type="spellEnd"/>
-      <w:r>
-        <w:rPr>
-          <w:lang w:val="en-GB"/>
-        </w:rPr>
-        <w:t xml:space="preserve">: </w:t>
+        <w:t xml:space="preserve">introduce effectiveAnswer: </w:t>
       </w:r>
     </w:p>
     <w:p>
@@ -6337,21 +5969,7 @@
         <w:rPr>
           <w:lang w:val="en-GB"/>
         </w:rPr>
-        <w:t xml:space="preserve">synchronize slider and button selection via </w:t>
-      </w:r>
-      <w:proofErr w:type="spellStart"/>
-      <w:r>
-        <w:rPr>
-          <w:lang w:val="en-GB"/>
-        </w:rPr>
-        <w:t>effectiveAnswer</w:t>
-      </w:r>
-      <w:proofErr w:type="spellEnd"/>
-      <w:r>
-        <w:rPr>
-          <w:lang w:val="en-GB"/>
-        </w:rPr>
-        <w:t xml:space="preserve"> </w:t>
+        <w:t xml:space="preserve">synchronize slider and button selection via effectiveAnswer </w:t>
       </w:r>
     </w:p>
     <w:p>
@@ -6369,21 +5987,7 @@
         <w:rPr>
           <w:lang w:val="en-GB"/>
         </w:rPr>
-        <w:t>ensure answer is persisted on navigation (</w:t>
-      </w:r>
-      <w:proofErr w:type="spellStart"/>
-      <w:r>
-        <w:rPr>
-          <w:lang w:val="en-GB"/>
-        </w:rPr>
-        <w:t>handleNext</w:t>
-      </w:r>
-      <w:proofErr w:type="spellEnd"/>
-      <w:r>
-        <w:rPr>
-          <w:lang w:val="en-GB"/>
-        </w:rPr>
-        <w:t xml:space="preserve">) </w:t>
+        <w:t xml:space="preserve">ensure answer is persisted on navigation (handleNext) </w:t>
       </w:r>
     </w:p>
     <w:p>
@@ -6543,21 +6147,7 @@
         <w:rPr>
           <w:lang w:val="en-GB"/>
         </w:rPr>
-        <w:t>remove redundant variables (</w:t>
-      </w:r>
-      <w:proofErr w:type="spellStart"/>
-      <w:r>
-        <w:rPr>
-          <w:lang w:val="en-GB"/>
-        </w:rPr>
-        <w:t>currentAnswer</w:t>
-      </w:r>
-      <w:proofErr w:type="spellEnd"/>
-      <w:r>
-        <w:rPr>
-          <w:lang w:val="en-GB"/>
-        </w:rPr>
-        <w:t xml:space="preserve">) </w:t>
+        <w:t xml:space="preserve">remove redundant variables (currentAnswer) </w:t>
       </w:r>
     </w:p>
     <w:p>
@@ -6590,7 +6180,7 @@
           <w:lang w:val="en-GB"/>
         </w:rPr>
         <w:pict w14:anchorId="3F5FB17A">
-          <v:rect id="_x0000_i1050" style="width:0;height:1.5pt" o:hralign="center" o:hrstd="t" o:hr="t" fillcolor="#a0a0a0" stroked="f"/>
+          <v:rect id="_x0000_i1030" style="width:0;height:1.5pt" o:hralign="center" o:hrstd="t" o:hr="t" fillcolor="#a0a0a0" stroked="f"/>
         </w:pict>
       </w:r>
     </w:p>
@@ -6680,21 +6270,7 @@
         <w:rPr>
           <w:lang w:val="en-GB"/>
         </w:rPr>
-        <w:t xml:space="preserve">ensure unique selection in button mode when values are </w:t>
-      </w:r>
-      <w:proofErr w:type="spellStart"/>
-      <w:r>
-        <w:rPr>
-          <w:lang w:val="en-GB"/>
-        </w:rPr>
-        <w:t>одинаковые</w:t>
-      </w:r>
-      <w:proofErr w:type="spellEnd"/>
-      <w:r>
-        <w:rPr>
-          <w:lang w:val="en-GB"/>
-        </w:rPr>
-        <w:t xml:space="preserve"> </w:t>
+        <w:t xml:space="preserve">ensure unique selection in button mode when values are одинаковые </w:t>
       </w:r>
     </w:p>
     <w:p>
@@ -7043,9 +6619,55 @@
       <w:pPr>
         <w:spacing w:before="100" w:beforeAutospacing="1" w:after="100" w:afterAutospacing="1" w:line="240" w:lineRule="auto"/>
         <w:rPr>
+          <w:lang w:val="ru-RU"/>
+        </w:rPr>
+      </w:pPr>
+      <w:r>
+        <w:rPr>
           <w:lang w:val="en-GB"/>
         </w:rPr>
-      </w:pPr>
+        <w:pict w14:anchorId="3D6FA08B">
+          <v:rect id="_x0000_i1031" style="width:0;height:1.5pt" o:hralign="center" o:hrstd="t" o:hr="t" fillcolor="#a0a0a0" stroked="f"/>
+        </w:pict>
+      </w:r>
+    </w:p>
+    <w:p>
+      <w:pPr>
+        <w:spacing w:before="100" w:beforeAutospacing="1" w:after="100" w:afterAutospacing="1" w:line="240" w:lineRule="auto"/>
+        <w:rPr>
+          <w:lang w:val="en-GB"/>
+        </w:rPr>
+      </w:pPr>
+      <w:r>
+        <w:t>feat(results): support interpretation by average (mean-based bands) + MAAS integration</w:t>
+      </w:r>
+      <w:r>
+        <w:br/>
+      </w:r>
+      <w:r>
+        <w:br/>
+        <w:t>- added interpretationBasis (total | average) to scoring config</w:t>
+      </w:r>
+      <w:r>
+        <w:br/>
+        <w:t>- updated calculateResult to support bands based on average</w:t>
+      </w:r>
+      <w:r>
+        <w:br/>
+        <w:t>- fixed UI to correctly display mean as primary score</w:t>
+      </w:r>
+      <w:r>
+        <w:br/>
+        <w:t>- removed duplicate average display</w:t>
+      </w:r>
+      <w:r>
+        <w:br/>
+        <w:t>- added MAAS with mean-based interpretation (canonical scoring)</w:t>
+      </w:r>
+      <w:r>
+        <w:br/>
+        <w:t>- improved result layout and labels for clarity</w:t>
+      </w:r>
     </w:p>
     <w:sectPr>
       <w:pgSz w:w="12240" w:h="15840"/>

</xml_diff>